<commit_message>
feat: sync Devbox sales workspace updates
</commit_message>
<xml_diff>
--- a/contract-assets/FastGPT合同模版-v1.2.docx
+++ b/contract-assets/FastGPT合同模版-v1.2.docx
@@ -1,8 +1,8 @@
 
 <file path=word/document.xml><?xml version="1.0" encoding="utf-8"?>
-<w:document xmlns:wpc="http://schemas.microsoft.com/office/word/2010/wordprocessingCanvas" xmlns:cx="http://schemas.microsoft.com/office/drawing/2014/chartex" xmlns:cx1="http://schemas.microsoft.com/office/drawing/2015/9/8/chartex" xmlns:cx2="http://schemas.microsoft.com/office/drawing/2015/10/21/chartex" xmlns:cx3="http://schemas.microsoft.com/office/drawing/2016/5/9/chartex" xmlns:cx4="http://schemas.microsoft.com/office/drawing/2016/5/10/chartex" xmlns:cx5="http://schemas.microsoft.com/office/drawing/2016/5/11/chartex" xmlns:cx6="http://schemas.microsoft.com/office/drawing/2016/5/12/chartex" xmlns:cx7="http://schemas.microsoft.com/office/drawing/2016/5/13/chartex" xmlns:cx8="http://schemas.microsoft.com/office/drawing/2016/5/14/chartex" xmlns:mc="http://schemas.openxmlformats.org/markup-compatibility/2006" xmlns:o="urn:schemas-microsoft-com:office:office" xmlns:r="http://schemas.openxmlformats.org/officeDocument/2006/relationships" xmlns:m="http://schemas.openxmlformats.org/officeDocument/2006/math" xmlns:v="urn:schemas-microsoft-com:vml" xmlns:wp14="http://schemas.microsoft.com/office/word/2010/wordprocessingDrawing" xmlns:wp="http://schemas.openxmlformats.org/drawingml/2006/wordprocessingDrawing" xmlns:w="http://schemas.openxmlformats.org/wordprocessingml/2006/main" xmlns:w14="http://schemas.microsoft.com/office/word/2010/wordml" xmlns:w10="urn:schemas-microsoft-com:office:word" xmlns:w15="http://schemas.microsoft.com/office/word/2012/wordml" xmlns:wpg="http://schemas.microsoft.com/office/word/2010/wordprocessingGroup" xmlns:wpi="http://schemas.microsoft.com/office/word/2010/wordprocessingInk" xmlns:wne="http://schemas.microsoft.com/office/word/2006/wordml" xmlns:wps="http://schemas.microsoft.com/office/word/2010/wordprocessingShape" xmlns:wpsCustomData="http://www.wps.cn/officeDocument/2013/wpsCustomData" mc:Ignorable="w14 w15 wp14">
+<w:document xmlns:ns1="http://schemas.openxmlformats.org/markup-compatibility/2006" xmlns:ns2="http://schemas.microsoft.com/office/word/2010/wordml" xmlns:ns3="http://schemas.openxmlformats.org/officeDocument/2006/relationships" xmlns:w="http://schemas.openxmlformats.org/wordprocessingml/2006/main" ns1:Ignorable="w14 w15 wp14">
   <w:body>
-    <w:p>
+    <w:p ns2:paraId="66F88E03">
       <w:pPr>
         <w:keepNext w:val="0"/>
         <w:keepLines w:val="0"/>
@@ -54,7 +54,7 @@
         <w:t xml:space="preserve">                   </w:t>
       </w:r>
     </w:p>
-    <w:p>
+    <w:p ns2:paraId="20FB51D8">
       <w:pPr>
         <w:spacing w:line="480" w:lineRule="auto"/>
         <w:ind w:left="0" w:leftChars="0" w:right="-153" w:firstLine="0" w:firstLineChars="0"/>
@@ -67,7 +67,7 @@
         </w:rPr>
       </w:pPr>
     </w:p>
-    <w:p>
+    <w:p ns2:paraId="502E793B">
       <w:pPr>
         <w:keepNext w:val="0"/>
         <w:keepLines w:val="0"/>
@@ -137,7 +137,7 @@
         <w:t>合同</w:t>
       </w:r>
     </w:p>
-    <w:p>
+    <w:p ns2:paraId="23EA43BC">
       <w:pPr>
         <w:keepNext w:val="0"/>
         <w:keepLines w:val="0"/>
@@ -171,7 +171,7 @@
         <w:t>（通用模板）</w:t>
       </w:r>
     </w:p>
-    <w:p>
+    <w:p ns2:paraId="00D50BCE">
       <w:pPr>
         <w:keepNext w:val="0"/>
         <w:keepLines w:val="0"/>
@@ -222,7 +222,7 @@
         <w:t>服务</w:t>
       </w:r>
     </w:p>
-    <w:p>
+    <w:p ns2:paraId="50FFF7F1">
       <w:pPr>
         <w:shd w:val="clear" w:color="auto" w:fill="FFFFFF"/>
         <w:adjustRightInd w:val="0"/>
@@ -240,7 +240,7 @@
         </w:rPr>
       </w:pPr>
     </w:p>
-    <w:p>
+    <w:p ns2:paraId="20F9AE29">
       <w:pPr>
         <w:shd w:val="clear" w:color="auto" w:fill="FFFFFF"/>
         <w:adjustRightInd w:val="0"/>
@@ -258,7 +258,7 @@
         </w:rPr>
       </w:pPr>
     </w:p>
-    <w:p>
+    <w:p ns2:paraId="43F9A5F8">
       <w:pPr>
         <w:shd w:val="clear" w:color="auto" w:fill="FFFFFF"/>
         <w:adjustRightInd w:val="0"/>
@@ -276,7 +276,7 @@
         </w:rPr>
       </w:pPr>
     </w:p>
-    <w:p>
+    <w:p ns2:paraId="0B29D1E4">
       <w:pPr>
         <w:shd w:val="clear" w:color="auto" w:fill="FFFFFF"/>
         <w:adjustRightInd w:val="0"/>
@@ -294,7 +294,7 @@
         </w:rPr>
       </w:pPr>
     </w:p>
-    <w:p>
+    <w:p ns2:paraId="2CE12696">
       <w:pPr>
         <w:shd w:val="clear" w:color="auto" w:fill="FFFFFF"/>
         <w:adjustRightInd w:val="0"/>
@@ -311,7 +311,7 @@
         </w:rPr>
       </w:pPr>
     </w:p>
-    <w:p>
+    <w:p ns2:paraId="33282187">
       <w:pPr>
         <w:keepNext w:val="0"/>
         <w:keepLines w:val="0"/>
@@ -340,7 +340,7 @@
       </w:pPr>
       <w:bookmarkStart w:id="0" w:name="_Toc9052"/>
     </w:p>
-    <w:p>
+    <w:p ns2:paraId="2A8861F6">
       <w:pPr>
         <w:keepNext w:val="0"/>
         <w:keepLines w:val="0"/>
@@ -368,7 +368,7 @@
         </w:rPr>
       </w:pPr>
     </w:p>
-    <w:p>
+    <w:p ns2:paraId="633C53F6">
       <w:pPr>
         <w:keepNext w:val="0"/>
         <w:keepLines w:val="0"/>
@@ -396,7 +396,7 @@
         </w:rPr>
       </w:pPr>
     </w:p>
-    <w:p>
+    <w:p ns2:paraId="54147F4D">
       <w:pPr>
         <w:keepNext w:val="0"/>
         <w:keepLines w:val="0"/>
@@ -425,7 +425,7 @@
       </w:pPr>
     </w:p>
     <w:bookmarkEnd w:id="0"/>
-    <w:p>
+    <w:p ns2:paraId="0FE6BA64">
       <w:pPr>
         <w:keepNext w:val="0"/>
         <w:keepLines w:val="0"/>
@@ -490,7 +490,7 @@
       </w:r>
       <w:bookmarkEnd w:id="1"/>
     </w:p>
-    <w:p>
+    <w:p ns2:paraId="1815A809">
       <w:pPr>
         <w:keepNext w:val="0"/>
         <w:keepLines w:val="0"/>
@@ -557,7 +557,7 @@
       <w:bookmarkEnd w:id="2"/>
       <w:bookmarkStart w:id="3" w:name="_Toc28121"/>
     </w:p>
-    <w:p>
+    <w:p ns2:paraId="0E8CCAC0">
       <w:pPr>
         <w:keepNext w:val="0"/>
         <w:keepLines w:val="0"/>
@@ -587,7 +587,7 @@
         </w:rPr>
       </w:pPr>
     </w:p>
-    <w:p>
+    <w:p ns2:paraId="5E679DDB">
       <w:pPr>
         <w:adjustRightInd w:val="0"/>
         <w:ind w:left="0" w:leftChars="0" w:firstLine="0" w:firstLineChars="0"/>
@@ -614,7 +614,7 @@
         <w:t>签约地点：</w:t>
       </w:r>
     </w:p>
-    <w:p>
+    <w:p ns2:paraId="03E92BF5">
       <w:pPr>
         <w:adjustRightInd w:val="0"/>
         <w:jc w:val="center"/>
@@ -686,7 +686,7 @@
         <w:t xml:space="preserve"> 日</w:t>
       </w:r>
     </w:p>
-    <w:p>
+    <w:p ns2:paraId="5452DA38">
       <w:pPr>
         <w:adjustRightInd w:val="0"/>
         <w:ind w:left="0" w:leftChars="0" w:firstLine="0" w:firstLineChars="0"/>
@@ -700,7 +700,7 @@
           <w:szCs w:val="28"/>
         </w:rPr>
         <w:sectPr>
-          <w:footerReference r:id="rId7" w:type="first"/>
+          <w:footerReference ns3:id="rId7" w:type="first"/>
           <w:pgSz w:w="11906" w:h="16838"/>
           <w:pgMar w:top="1418" w:right="1418" w:bottom="1418" w:left="1418" w:header="851" w:footer="964" w:gutter="0"/>
           <w:pgBorders>
@@ -715,7 +715,7 @@
       </w:pPr>
     </w:p>
     <w:bookmarkEnd w:id="3"/>
-    <w:p>
+    <w:p ns2:paraId="5C9B7954">
       <w:pPr>
         <w:keepNext w:val="0"/>
         <w:keepLines w:val="0"/>
@@ -823,7 +823,7 @@
         <w:t xml:space="preserve">                        </w:t>
       </w:r>
     </w:p>
-    <w:p>
+    <w:p ns2:paraId="4AF11ABE">
       <w:pPr>
         <w:keepNext w:val="0"/>
         <w:keepLines w:val="0"/>
@@ -931,7 +931,7 @@
         <w:t xml:space="preserve">    </w:t>
       </w:r>
     </w:p>
-    <w:p>
+    <w:p ns2:paraId="23899C41">
       <w:pPr>
         <w:keepNext w:val="0"/>
         <w:keepLines w:val="0"/>
@@ -1015,7 +1015,7 @@
         <w:t xml:space="preserve">                    </w:t>
       </w:r>
     </w:p>
-    <w:p>
+    <w:p ns2:paraId="75233384">
       <w:pPr>
         <w:keepNext w:val="0"/>
         <w:keepLines w:val="0"/>
@@ -1120,7 +1120,7 @@
         <w:t xml:space="preserve"> </w:t>
       </w:r>
     </w:p>
-    <w:p>
+    <w:p ns2:paraId="78695259">
       <w:pPr>
         <w:keepNext w:val="0"/>
         <w:keepLines w:val="0"/>
@@ -1243,7 +1243,7 @@
         <w:t xml:space="preserve">           </w:t>
       </w:r>
     </w:p>
-    <w:p>
+    <w:p ns2:paraId="3E95F902">
       <w:pPr>
         <w:keepNext w:val="0"/>
         <w:keepLines w:val="0"/>
@@ -1269,7 +1269,7 @@
         </w:rPr>
       </w:pPr>
     </w:p>
-    <w:p>
+    <w:p ns2:paraId="7F119716">
       <w:pPr>
         <w:keepNext w:val="0"/>
         <w:keepLines w:val="0"/>
@@ -1368,7 +1368,7 @@
         <w:t xml:space="preserve">  </w:t>
       </w:r>
     </w:p>
-    <w:p>
+    <w:p ns2:paraId="5421A159">
       <w:pPr>
         <w:keepNext w:val="0"/>
         <w:keepLines w:val="0"/>
@@ -1450,7 +1450,7 @@
         <w:t xml:space="preserve">        </w:t>
       </w:r>
     </w:p>
-    <w:p>
+    <w:p ns2:paraId="0B923B36">
       <w:pPr>
         <w:keepNext w:val="0"/>
         <w:keepLines w:val="0"/>
@@ -1523,7 +1523,7 @@
         <w:t xml:space="preserve">  </w:t>
       </w:r>
     </w:p>
-    <w:p>
+    <w:p ns2:paraId="2EBA9940">
       <w:pPr>
         <w:keepNext w:val="0"/>
         <w:keepLines w:val="0"/>
@@ -1619,7 +1619,7 @@
         <w:t xml:space="preserve"> </w:t>
       </w:r>
     </w:p>
-    <w:p>
+    <w:p ns2:paraId="49BF999B">
       <w:pPr>
         <w:keepNext w:val="0"/>
         <w:keepLines w:val="0"/>
@@ -1739,7 +1739,7 @@
         <w:t xml:space="preserve">  </w:t>
       </w:r>
     </w:p>
-    <w:p>
+    <w:p ns2:paraId="3CCA9363">
       <w:pPr>
         <w:keepNext w:val="0"/>
         <w:keepLines w:val="0"/>
@@ -1779,7 +1779,7 @@
         <w:t xml:space="preserve"> </w:t>
       </w:r>
     </w:p>
-    <w:p>
+    <w:p ns2:paraId="2C4E6FDB">
       <w:pPr>
         <w:pStyle w:val="5"/>
         <w:bidi w:val="0"/>
@@ -1797,7 +1797,6 @@
       <w:r>
         <w:rPr>
           <w:rFonts w:hint="eastAsia"/>
-          <w:highlight w:val="none"/>
           <w:u w:val="single"/>
           <w:lang w:val="en-US" w:eastAsia="zh-CN"/>
         </w:rPr>
@@ -1837,7 +1836,7 @@
         <w:t>：</w:t>
       </w:r>
     </w:p>
-    <w:p>
+    <w:p ns2:paraId="0AD4D80C">
       <w:pPr>
         <w:pStyle w:val="2"/>
         <w:numPr>
@@ -1858,7 +1857,7 @@
         <w:t>定义与合同文件</w:t>
       </w:r>
     </w:p>
-    <w:p>
+    <w:p ns2:paraId="602768A7">
       <w:pPr>
         <w:pStyle w:val="5"/>
         <w:bidi w:val="0"/>
@@ -1875,7 +1874,7 @@
         <w:t>除⾮另有特别解释或说明，在本合同及与本合同相关的，双⽅另⾏签署的其他⽂件（包括但不限于本合同的附件）中，下述词语均依如下定义进⾏解释：</w:t>
       </w:r>
     </w:p>
-    <w:p>
+    <w:p ns2:paraId="133F74B2">
       <w:pPr>
         <w:pStyle w:val="28"/>
         <w:keepNext w:val="0"/>
@@ -1920,7 +1919,7 @@
         <w:t>双方授权代表签署的补充协议及变更单组成。前述文件约定不一致的，以签署时间较晚且明确替代原约定的文件为准。</w:t>
       </w:r>
     </w:p>
-    <w:p>
+    <w:p ns2:paraId="0CD54626">
       <w:pPr>
         <w:pStyle w:val="28"/>
         <w:keepNext w:val="0"/>
@@ -1955,7 +1954,7 @@
         <w:t>“附件”是指与本合同的订⽴、履⾏有关的，经甲⼄双⽅认可的，对本合同约定的内容进⾏细化、补充、修改、变更的⽂件等资料。</w:t>
       </w:r>
     </w:p>
-    <w:p>
+    <w:p ns2:paraId="63906179">
       <w:pPr>
         <w:pStyle w:val="28"/>
         <w:keepNext w:val="0"/>
@@ -1990,7 +1989,7 @@
         <w:t>“交付”指⼄⽅在双⽅规定的⽇期内交付合同软件产品的⾏为。</w:t>
       </w:r>
     </w:p>
-    <w:p>
+    <w:p ns2:paraId="3533C1A8">
       <w:pPr>
         <w:pStyle w:val="28"/>
         <w:keepNext w:val="0"/>
@@ -2082,7 +2081,7 @@
         <w:t>。</w:t>
       </w:r>
     </w:p>
-    <w:p>
+    <w:p ns2:paraId="6441356F">
       <w:pPr>
         <w:pStyle w:val="28"/>
         <w:keepNext w:val="0"/>
@@ -2120,7 +2119,7 @@
         <w:t>“法律、法规”是指由中国有关部⻔制定的法律、⾏政法规、地⽅性法规、规章及其他规范性⽂件以及经全国⼈⺠代表⼤会常务委员会批准的中国缔结、参加的国际条（公）约的有关规定</w:t>
       </w:r>
     </w:p>
-    <w:p>
+    <w:p ns2:paraId="0492E945">
       <w:pPr>
         <w:pStyle w:val="28"/>
         <w:keepNext w:val="0"/>
@@ -2144,17 +2143,15 @@
         <w:textAlignment w:val="auto"/>
         <w:rPr>
           <w:rFonts w:hint="eastAsia"/>
-          <w:highlight w:val="lightGray"/>
-          <w:lang w:val="en-US" w:eastAsia="zh-CN"/>
-        </w:rPr>
-      </w:pPr>
-      <w:r>
-        <w:rPr>
-          <w:rFonts w:hint="eastAsia" w:ascii="Times New Roman" w:hAnsi="Times New Roman" w:eastAsia="宋体" w:cs="Times New Roman"/>
-          <w:kern w:val="2"/>
-          <w:sz w:val="21"/>
-          <w:szCs w:val="20"/>
-          <w:highlight w:val="lightGray"/>
+          <w:lang w:val="en-US" w:eastAsia="zh-CN"/>
+        </w:rPr>
+      </w:pPr>
+      <w:r>
+        <w:rPr>
+          <w:rFonts w:hint="eastAsia" w:ascii="Times New Roman" w:hAnsi="Times New Roman" w:eastAsia="宋体" w:cs="Times New Roman"/>
+          <w:kern w:val="2"/>
+          <w:sz w:val="21"/>
+          <w:szCs w:val="20"/>
           <w:lang w:val="en-US" w:eastAsia="zh-CN" w:bidi="ar-SA"/>
         </w:rPr>
         <w:t>“FastGP</w:t>
@@ -2162,7 +2159,6 @@
       <w:r>
         <w:rPr>
           <w:rFonts w:hint="eastAsia"/>
-          <w:highlight w:val="lightGray"/>
           <w:lang w:val="en-US" w:eastAsia="zh-CN"/>
         </w:rPr>
         <w:t>T”是乙方自主研发的具有独立知识产权的产品，</w:t>
@@ -2173,15 +2169,12 @@
           <w:kern w:val="2"/>
           <w:sz w:val="21"/>
           <w:szCs w:val="24"/>
-          <w:highlight w:val="lightGray"/>
           <w:lang w:val="en-US" w:eastAsia="zh-CN" w:bidi="ar-SA"/>
         </w:rPr>
         <w:t>是一个基于大语言模型的 AI Agent 应用开发平台，集知识库问答、可视化工作流、Agent 编排、工具调用和技能扩展于一体，让开发者</w:t>
       </w:r>
       <w:r>
-        <w:rPr>
-          <w:highlight w:val="lightGray"/>
-        </w:rPr>
+        <w:rPr/>
         <w:commentReference w:id="0"/>
       </w:r>
       <w:r>
@@ -2190,13 +2183,12 @@
           <w:kern w:val="2"/>
           <w:sz w:val="21"/>
           <w:szCs w:val="24"/>
-          <w:highlight w:val="lightGray"/>
           <w:lang w:val="en-US" w:eastAsia="zh-CN" w:bidi="ar-SA"/>
         </w:rPr>
         <w:t>和业务人员都能快速构建专属 AI 应用。</w:t>
       </w:r>
     </w:p>
-    <w:p>
+    <w:p ns2:paraId="51A30ED3">
       <w:pPr>
         <w:pStyle w:val="2"/>
         <w:numPr>
@@ -2218,7 +2210,7 @@
         <w:t>软件产品及服务内容</w:t>
       </w:r>
     </w:p>
-    <w:p>
+    <w:p ns2:paraId="15395A57">
       <w:pPr>
         <w:pStyle w:val="28"/>
         <w:keepNext w:val="0"/>
@@ -2253,7 +2245,7 @@
         <w:t>本次乙方提供的交付产品包含下列几种（请勾选）：</w:t>
       </w:r>
     </w:p>
-    <w:p>
+    <w:p ns2:paraId="19790F3E">
       <w:pPr>
         <w:keepNext w:val="0"/>
         <w:keepLines w:val="0"/>
@@ -2295,7 +2287,7 @@
         <w:t>□标准版FastGPT-买断；</w:t>
       </w:r>
     </w:p>
-    <w:p>
+    <w:p ns2:paraId="2C72D1D3">
       <w:pPr>
         <w:keepNext w:val="0"/>
         <w:keepLines w:val="0"/>
@@ -2357,7 +2349,7 @@
         <w:t>；</w:t>
       </w:r>
     </w:p>
-    <w:p>
+    <w:p ns2:paraId="2BBE3D6B">
       <w:pPr>
         <w:keepNext w:val="0"/>
         <w:keepLines w:val="0"/>
@@ -2419,7 +2411,7 @@
         <w:t>版FastGPT-买断；</w:t>
       </w:r>
     </w:p>
-    <w:p>
+    <w:p ns2:paraId="37173567">
       <w:pPr>
         <w:keepNext w:val="0"/>
         <w:keepLines w:val="0"/>
@@ -2501,7 +2493,7 @@
         <w:t>；</w:t>
       </w:r>
     </w:p>
-    <w:p>
+    <w:p ns2:paraId="2C1A675D">
       <w:pPr>
         <w:keepNext w:val="0"/>
         <w:keepLines w:val="0"/>
@@ -2563,7 +2555,7 @@
         <w:t>版FastGPT-买断；</w:t>
       </w:r>
     </w:p>
-    <w:p>
+    <w:p ns2:paraId="4C27946E">
       <w:pPr>
         <w:keepNext w:val="0"/>
         <w:keepLines w:val="0"/>
@@ -2645,7 +2637,7 @@
         <w:t>；</w:t>
       </w:r>
     </w:p>
-    <w:p>
+    <w:p ns2:paraId="3D66A07E">
       <w:pPr>
         <w:keepNext w:val="0"/>
         <w:keepLines w:val="0"/>
@@ -2715,7 +2707,7 @@
         <w:t>；</w:t>
       </w:r>
     </w:p>
-    <w:p>
+    <w:p ns2:paraId="76457E96">
       <w:pPr>
         <w:pStyle w:val="28"/>
         <w:keepNext w:val="0"/>
@@ -2774,7 +2766,7 @@
         <w:t>：</w:t>
       </w:r>
     </w:p>
-    <w:p>
+    <w:p ns2:paraId="30DE35BC">
       <w:pPr>
         <w:keepNext w:val="0"/>
         <w:keepLines w:val="0"/>
@@ -2802,7 +2794,6 @@
           <w:kern w:val="2"/>
           <w:sz w:val="21"/>
           <w:szCs w:val="20"/>
-          <w:highlight w:val="lightGray"/>
           <w:lang w:val="en-US" w:eastAsia="zh-CN" w:bidi="ar-SA"/>
         </w:rPr>
       </w:pPr>
@@ -2822,19 +2813,16 @@
           <w:kern w:val="2"/>
           <w:sz w:val="21"/>
           <w:szCs w:val="20"/>
-          <w:highlight w:val="lightGray"/>
           <w:lang w:val="en-US" w:eastAsia="zh-CN" w:bidi="ar-SA"/>
         </w:rPr>
         <w:t>技术支持服务-基础版本；</w:t>
       </w:r>
       <w:r>
-        <w:rPr>
-          <w:highlight w:val="lightGray"/>
-        </w:rPr>
+        <w:rPr/>
         <w:commentReference w:id="1"/>
       </w:r>
     </w:p>
-    <w:p>
+    <w:p ns2:paraId="11E79AF3">
       <w:pPr>
         <w:keepNext w:val="0"/>
         <w:keepLines w:val="0"/>
@@ -2862,17 +2850,15 @@
           <w:kern w:val="2"/>
           <w:sz w:val="21"/>
           <w:szCs w:val="20"/>
-          <w:highlight w:val="lightGray"/>
-          <w:lang w:val="en-US" w:eastAsia="zh-CN" w:bidi="ar-SA"/>
-        </w:rPr>
-      </w:pPr>
-      <w:r>
-        <w:rPr>
-          <w:rFonts w:hint="eastAsia" w:ascii="Times New Roman" w:hAnsi="Times New Roman" w:eastAsia="宋体" w:cs="Times New Roman"/>
-          <w:kern w:val="2"/>
-          <w:sz w:val="21"/>
-          <w:szCs w:val="20"/>
-          <w:highlight w:val="lightGray"/>
+          <w:lang w:val="en-US" w:eastAsia="zh-CN" w:bidi="ar-SA"/>
+        </w:rPr>
+      </w:pPr>
+      <w:r>
+        <w:rPr>
+          <w:rFonts w:hint="eastAsia" w:ascii="Times New Roman" w:hAnsi="Times New Roman" w:eastAsia="宋体" w:cs="Times New Roman"/>
+          <w:kern w:val="2"/>
+          <w:sz w:val="21"/>
+          <w:szCs w:val="20"/>
           <w:lang w:val="en-US" w:eastAsia="zh-CN" w:bidi="ar-SA"/>
         </w:rPr>
         <w:t>□技术支持服务-</w:t>
@@ -2883,7 +2869,6 @@
           <w:kern w:val="2"/>
           <w:sz w:val="21"/>
           <w:szCs w:val="20"/>
-          <w:highlight w:val="lightGray"/>
           <w:lang w:val="en-US" w:eastAsia="zh-CN" w:bidi="ar-SA"/>
         </w:rPr>
         <w:t>进阶</w:t>
@@ -2894,13 +2879,12 @@
           <w:kern w:val="2"/>
           <w:sz w:val="21"/>
           <w:szCs w:val="20"/>
-          <w:highlight w:val="lightGray"/>
           <w:lang w:val="en-US" w:eastAsia="zh-CN" w:bidi="ar-SA"/>
         </w:rPr>
         <w:t>版本；</w:t>
       </w:r>
     </w:p>
-    <w:p>
+    <w:p ns2:paraId="79D62308">
       <w:pPr>
         <w:keepNext w:val="0"/>
         <w:keepLines w:val="0"/>
@@ -2928,17 +2912,15 @@
           <w:kern w:val="2"/>
           <w:sz w:val="21"/>
           <w:szCs w:val="20"/>
-          <w:highlight w:val="lightGray"/>
-          <w:lang w:val="en-US" w:eastAsia="zh-CN" w:bidi="ar-SA"/>
-        </w:rPr>
-      </w:pPr>
-      <w:r>
-        <w:rPr>
-          <w:rFonts w:hint="eastAsia" w:ascii="Times New Roman" w:hAnsi="Times New Roman" w:eastAsia="宋体" w:cs="Times New Roman"/>
-          <w:kern w:val="2"/>
-          <w:sz w:val="21"/>
-          <w:szCs w:val="20"/>
-          <w:highlight w:val="lightGray"/>
+          <w:lang w:val="en-US" w:eastAsia="zh-CN" w:bidi="ar-SA"/>
+        </w:rPr>
+      </w:pPr>
+      <w:r>
+        <w:rPr>
+          <w:rFonts w:hint="eastAsia" w:ascii="Times New Roman" w:hAnsi="Times New Roman" w:eastAsia="宋体" w:cs="Times New Roman"/>
+          <w:kern w:val="2"/>
+          <w:sz w:val="21"/>
+          <w:szCs w:val="20"/>
           <w:lang w:val="en-US" w:eastAsia="zh-CN" w:bidi="ar-SA"/>
         </w:rPr>
         <w:t>□技术支持服务-</w:t>
@@ -2949,7 +2931,6 @@
           <w:kern w:val="2"/>
           <w:sz w:val="21"/>
           <w:szCs w:val="20"/>
-          <w:highlight w:val="lightGray"/>
           <w:lang w:val="en-US" w:eastAsia="zh-CN" w:bidi="ar-SA"/>
         </w:rPr>
         <w:t>高级</w:t>
@@ -2960,13 +2941,12 @@
           <w:kern w:val="2"/>
           <w:sz w:val="21"/>
           <w:szCs w:val="20"/>
-          <w:highlight w:val="lightGray"/>
           <w:lang w:val="en-US" w:eastAsia="zh-CN" w:bidi="ar-SA"/>
         </w:rPr>
         <w:t>版本；</w:t>
       </w:r>
     </w:p>
-    <w:p>
+    <w:p ns2:paraId="79736B6C">
       <w:pPr>
         <w:keepNext w:val="0"/>
         <w:keepLines w:val="0"/>
@@ -3028,7 +3008,7 @@
         <w:t>定制开发；</w:t>
       </w:r>
     </w:p>
-    <w:p>
+    <w:p ns2:paraId="653B6355">
       <w:pPr>
         <w:keepNext w:val="0"/>
         <w:keepLines w:val="0"/>
@@ -3110,7 +3090,7 @@
         <w:t>；</w:t>
       </w:r>
     </w:p>
-    <w:p>
+    <w:p ns2:paraId="74B770A9">
       <w:pPr>
         <w:keepNext w:val="0"/>
         <w:keepLines w:val="0"/>
@@ -3172,7 +3152,7 @@
         <w:t>；</w:t>
       </w:r>
     </w:p>
-    <w:p>
+    <w:p ns2:paraId="027B9344">
       <w:pPr>
         <w:keepNext w:val="0"/>
         <w:keepLines w:val="0"/>
@@ -3245,7 +3225,7 @@
         <w:t>；</w:t>
       </w:r>
     </w:p>
-    <w:p>
+    <w:p ns2:paraId="3CBCEA3A">
       <w:pPr>
         <w:pStyle w:val="28"/>
         <w:keepNext w:val="0"/>
@@ -3364,7 +3344,7 @@
         <w:t>》</w:t>
       </w:r>
     </w:p>
-    <w:p>
+    <w:p ns2:paraId="6BF3C0A5">
       <w:pPr>
         <w:pStyle w:val="28"/>
         <w:keepNext w:val="0"/>
@@ -3402,7 +3382,7 @@
         <w:t>涉及第三方模型、云服务、网络、硬件、操作系统、浏览器、数据库、开源组件或甲方系统接口的，相关许可、账号、费用、合规责任及可用性风险由相应权利人或甲方承担，双方另有书面约定的除外。</w:t>
       </w:r>
     </w:p>
-    <w:p>
+    <w:p ns2:paraId="6E824E9A">
       <w:pPr>
         <w:pStyle w:val="2"/>
         <w:numPr>
@@ -3424,7 +3404,7 @@
         <w:t>合同服务期限、地点</w:t>
       </w:r>
     </w:p>
-    <w:p>
+    <w:p ns2:paraId="3113E1DB">
       <w:pPr>
         <w:pStyle w:val="28"/>
         <w:keepNext w:val="0"/>
@@ -3459,7 +3439,7 @@
         <w:t>服务期限：</w:t>
       </w:r>
     </w:p>
-    <w:p>
+    <w:p ns2:paraId="6BAA49AC">
       <w:pPr>
         <w:keepNext w:val="0"/>
         <w:keepLines w:val="0"/>
@@ -3703,7 +3683,7 @@
         <w:t>日；</w:t>
       </w:r>
     </w:p>
-    <w:p>
+    <w:p ns2:paraId="72791AF0">
       <w:pPr>
         <w:keepNext w:val="0"/>
         <w:keepLines w:val="0"/>
@@ -3848,7 +3828,7 @@
         <w:t>；</w:t>
       </w:r>
     </w:p>
-    <w:p>
+    <w:p ns2:paraId="2C43E66A">
       <w:pPr>
         <w:keepNext w:val="0"/>
         <w:keepLines w:val="0"/>
@@ -3953,7 +3933,7 @@
         <w:t>日）；</w:t>
       </w:r>
     </w:p>
-    <w:p>
+    <w:p ns2:paraId="21E308B2">
       <w:pPr>
         <w:keepNext w:val="0"/>
         <w:keepLines w:val="0"/>
@@ -4016,7 +3996,7 @@
         <w:t>；</w:t>
       </w:r>
     </w:p>
-    <w:p>
+    <w:p ns2:paraId="13FE3672">
       <w:pPr>
         <w:pStyle w:val="28"/>
         <w:keepNext w:val="0"/>
@@ -4051,7 +4031,7 @@
         <w:t>服务地点：</w:t>
       </w:r>
     </w:p>
-    <w:p>
+    <w:p ns2:paraId="52FDF056">
       <w:pPr>
         <w:keepNext w:val="0"/>
         <w:keepLines w:val="0"/>
@@ -4081,11 +4061,11 @@
           <w:sz w:val="21"/>
           <w:szCs w:val="20"/>
           <w:lang w:val="en-US" w:eastAsia="zh-CN" w:bidi="ar-SA"/>
-          <w14:textFill>
-            <w14:solidFill>
-              <w14:schemeClr w14:val="tx1"/>
-            </w14:solidFill>
-          </w14:textFill>
+          <ns2:textFill>
+            <ns2:solidFill>
+              <ns2:schemeClr ns2:val="tx1"/>
+            </ns2:solidFill>
+          </ns2:textFill>
         </w:rPr>
       </w:pPr>
       <w:r>
@@ -4120,7 +4100,7 @@
         <w:t>；</w:t>
       </w:r>
     </w:p>
-    <w:p>
+    <w:p ns2:paraId="1FE7F915">
       <w:pPr>
         <w:keepNext w:val="0"/>
         <w:keepLines w:val="0"/>
@@ -4162,7 +4142,7 @@
         <w:t>□远程交付服务；</w:t>
       </w:r>
     </w:p>
-    <w:p>
+    <w:p ns2:paraId="357E5D4D">
       <w:pPr>
         <w:keepNext w:val="0"/>
         <w:keepLines w:val="0"/>
@@ -4214,7 +4194,7 @@
         <w:t>；</w:t>
       </w:r>
     </w:p>
-    <w:p>
+    <w:p ns2:paraId="00AC6CA4">
       <w:pPr>
         <w:pStyle w:val="2"/>
         <w:numPr>
@@ -4236,7 +4216,7 @@
         <w:t>验收标准和方法</w:t>
       </w:r>
     </w:p>
-    <w:p>
+    <w:p ns2:paraId="5E8EE857">
       <w:pPr>
         <w:pStyle w:val="28"/>
         <w:keepNext w:val="0"/>
@@ -4293,7 +4273,7 @@
         <w:t>。</w:t>
       </w:r>
     </w:p>
-    <w:p>
+    <w:p ns2:paraId="64018896">
       <w:pPr>
         <w:pStyle w:val="28"/>
         <w:keepNext w:val="0"/>
@@ -4420,7 +4400,7 @@
         <w:t>。</w:t>
       </w:r>
     </w:p>
-    <w:p>
+    <w:p ns2:paraId="091B1BD5">
       <w:pPr>
         <w:pStyle w:val="28"/>
         <w:keepNext w:val="0"/>
@@ -4470,7 +4450,7 @@
         <w:t>。</w:t>
       </w:r>
     </w:p>
-    <w:p>
+    <w:p ns2:paraId="3F1A1474">
       <w:pPr>
         <w:pStyle w:val="28"/>
         <w:keepNext w:val="0"/>
@@ -4501,7 +4481,7 @@
         <w:t>验收时间和方式</w:t>
       </w:r>
     </w:p>
-    <w:p>
+    <w:p ns2:paraId="155B3DF1">
       <w:pPr>
         <w:pStyle w:val="28"/>
         <w:keepNext w:val="0"/>
@@ -4622,7 +4602,7 @@
         <w:t>日内书面提出，否则视为对验收结论无异议。</w:t>
       </w:r>
     </w:p>
-    <w:p>
+    <w:p ns2:paraId="4518AB8B">
       <w:pPr>
         <w:pStyle w:val="28"/>
         <w:keepNext w:val="0"/>
@@ -4674,7 +4654,6 @@
       <w:r>
         <w:rPr>
           <w:rFonts w:hint="eastAsia" w:ascii="Times New Roman" w:hAnsi="Times New Roman" w:eastAsia="宋体" w:cs="Times New Roman"/>
-          <w:highlight w:val="none"/>
           <w:lang w:val="en-US" w:eastAsia="zh-CN"/>
         </w:rPr>
         <w:t>根据第九条第二款的约定承担违约责任</w:t>
@@ -4687,7 +4666,7 @@
         <w:t>。</w:t>
       </w:r>
     </w:p>
-    <w:p>
+    <w:p ns2:paraId="52F8CBA2">
       <w:pPr>
         <w:pStyle w:val="28"/>
         <w:keepNext w:val="0"/>
@@ -4722,7 +4701,7 @@
         <w:t>因验收不合格造成乙方不能按时履行义务的，视为乙方履行迟延。</w:t>
       </w:r>
     </w:p>
-    <w:p>
+    <w:p ns2:paraId="0E4272F2">
       <w:pPr>
         <w:pStyle w:val="2"/>
         <w:numPr>
@@ -4744,7 +4723,7 @@
         <w:t>售后质保服务</w:t>
       </w:r>
     </w:p>
-    <w:p>
+    <w:p ns2:paraId="76C1054B">
       <w:pPr>
         <w:pStyle w:val="28"/>
         <w:keepNext w:val="0"/>
@@ -4832,7 +4811,6 @@
           <w:kern w:val="2"/>
           <w:sz w:val="21"/>
           <w:szCs w:val="20"/>
-          <w:highlight w:val="none"/>
           <w:u w:val="none"/>
           <w:lang w:val="en-US" w:eastAsia="zh-CN" w:bidi="ar-SA"/>
         </w:rPr>
@@ -4844,7 +4822,6 @@
           <w:kern w:val="2"/>
           <w:sz w:val="21"/>
           <w:szCs w:val="20"/>
-          <w:highlight w:val="none"/>
           <w:u w:val="none"/>
           <w:lang w:val="en-US" w:eastAsia="zh-CN" w:bidi="ar-SA"/>
         </w:rPr>
@@ -4856,7 +4833,6 @@
           <w:kern w:val="2"/>
           <w:sz w:val="21"/>
           <w:szCs w:val="20"/>
-          <w:highlight w:val="none"/>
           <w:u w:val="none"/>
           <w:lang w:val="en-US" w:eastAsia="zh-CN" w:bidi="ar-SA"/>
         </w:rPr>
@@ -4868,7 +4844,6 @@
           <w:kern w:val="2"/>
           <w:sz w:val="21"/>
           <w:szCs w:val="20"/>
-          <w:highlight w:val="none"/>
           <w:u w:val="none"/>
           <w:lang w:val="en-US" w:eastAsia="zh-CN" w:bidi="ar-SA"/>
         </w:rPr>
@@ -4880,7 +4855,6 @@
           <w:kern w:val="2"/>
           <w:sz w:val="21"/>
           <w:szCs w:val="20"/>
-          <w:highlight w:val="none"/>
           <w:u w:val="none"/>
           <w:lang w:val="en-US" w:eastAsia="zh-CN" w:bidi="ar-SA"/>
         </w:rPr>
@@ -4892,7 +4866,6 @@
           <w:kern w:val="2"/>
           <w:sz w:val="21"/>
           <w:szCs w:val="20"/>
-          <w:highlight w:val="none"/>
           <w:u w:val="none"/>
           <w:lang w:val="en-US" w:eastAsia="zh-CN" w:bidi="ar-SA"/>
         </w:rPr>
@@ -4904,7 +4877,6 @@
           <w:kern w:val="2"/>
           <w:sz w:val="21"/>
           <w:szCs w:val="20"/>
-          <w:highlight w:val="none"/>
           <w:u w:val="none"/>
           <w:lang w:val="en-US" w:eastAsia="zh-CN" w:bidi="ar-SA"/>
         </w:rPr>
@@ -4916,14 +4888,13 @@
           <w:kern w:val="2"/>
           <w:sz w:val="21"/>
           <w:szCs w:val="20"/>
-          <w:highlight w:val="none"/>
           <w:u w:val="none"/>
           <w:lang w:val="en-US" w:eastAsia="zh-CN" w:bidi="ar-SA"/>
         </w:rPr>
         <w:t>。</w:t>
       </w:r>
     </w:p>
-    <w:p>
+    <w:p ns2:paraId="71D92794">
       <w:pPr>
         <w:pStyle w:val="28"/>
         <w:keepNext w:val="0"/>
@@ -4972,7 +4943,7 @@
         <w:t>，价格由双方届时另行确定，乙方可以给予甲方一定优惠。</w:t>
       </w:r>
     </w:p>
-    <w:p>
+    <w:p ns2:paraId="369852B3">
       <w:pPr>
         <w:pStyle w:val="28"/>
         <w:keepNext w:val="0"/>
@@ -5052,7 +5023,7 @@
         <w:t>，具体费用及服务内容由双方届时协商确定。</w:t>
       </w:r>
     </w:p>
-    <w:p>
+    <w:p ns2:paraId="2BCC3644">
       <w:pPr>
         <w:pStyle w:val="28"/>
         <w:keepNext w:val="0"/>
@@ -5115,7 +5086,7 @@
         <w:t>。</w:t>
       </w:r>
     </w:p>
-    <w:p>
+    <w:p ns2:paraId="562AD578">
       <w:pPr>
         <w:pStyle w:val="28"/>
         <w:keepNext w:val="0"/>
@@ -5139,7 +5110,6 @@
         <w:textAlignment w:val="auto"/>
         <w:rPr>
           <w:rFonts w:hint="eastAsia" w:ascii="Times New Roman" w:hAnsi="Times New Roman" w:eastAsia="宋体" w:cs="Times New Roman"/>
-          <w:highlight w:val="lightGray"/>
           <w:lang w:val="en-US" w:eastAsia="zh-CN"/>
         </w:rPr>
       </w:pPr>
@@ -5159,13 +5129,12 @@
           <w:kern w:val="2"/>
           <w:sz w:val="21"/>
           <w:szCs w:val="24"/>
-          <w:highlight w:val="lightGray"/>
           <w:lang w:val="en-US" w:eastAsia="zh-CN" w:bidi="ar-SA"/>
         </w:rPr>
         <w:t>产生额外费用，需另行约定。</w:t>
       </w:r>
     </w:p>
-    <w:p>
+    <w:p ns2:paraId="43D19573">
       <w:pPr>
         <w:pStyle w:val="28"/>
         <w:keepNext w:val="0"/>
@@ -5235,7 +5204,7 @@
         <w:t>。统筹故障响应、BUG修复、技术支持。</w:t>
       </w:r>
     </w:p>
-    <w:p>
+    <w:p ns2:paraId="412F87E9">
       <w:pPr>
         <w:pStyle w:val="2"/>
         <w:numPr>
@@ -5257,7 +5226,7 @@
         <w:t>合同价格及支付</w:t>
       </w:r>
     </w:p>
-    <w:p>
+    <w:p ns2:paraId="7716D919">
       <w:pPr>
         <w:pStyle w:val="28"/>
         <w:keepNext w:val="0"/>
@@ -5388,7 +5357,7 @@
         <w:t>。</w:t>
       </w:r>
     </w:p>
-    <w:p>
+    <w:p ns2:paraId="61A6CAD8">
       <w:pPr>
         <w:pStyle w:val="28"/>
         <w:keepNext w:val="0"/>
@@ -5431,7 +5400,7 @@
         <w:t xml:space="preserve">支付条件及方式: </w:t>
       </w:r>
     </w:p>
-    <w:p>
+    <w:p ns2:paraId="5CD13274">
       <w:pPr>
         <w:pStyle w:val="28"/>
         <w:keepNext w:val="0"/>
@@ -5456,7 +5425,6 @@
         <w:rPr>
           <w:rFonts w:hint="default" w:ascii="Times New Roman" w:hAnsi="Times New Roman" w:eastAsia="宋体" w:cs="Times New Roman"/>
           <w:color w:val="C00000"/>
-          <w:highlight w:val="none"/>
           <w:u w:val="single"/>
           <w:lang w:val="en-US" w:eastAsia="zh-CN"/>
         </w:rPr>
@@ -5485,7 +5453,7 @@
         <w:t>。</w:t>
       </w:r>
     </w:p>
-    <w:p>
+    <w:p ns2:paraId="3D076DE3">
       <w:pPr>
         <w:pStyle w:val="28"/>
         <w:keepNext w:val="0"/>
@@ -5560,7 +5528,7 @@
         <w:t>。</w:t>
       </w:r>
     </w:p>
-    <w:p>
+    <w:p ns2:paraId="444C9A35">
       <w:pPr>
         <w:pStyle w:val="28"/>
         <w:keepNext w:val="0"/>
@@ -5595,7 +5563,7 @@
         <w:t xml:space="preserve">结算方式:  转账/电汇 </w:t>
       </w:r>
     </w:p>
-    <w:p>
+    <w:p ns2:paraId="29777BFF">
       <w:pPr>
         <w:pStyle w:val="28"/>
         <w:keepNext w:val="0"/>
@@ -5630,7 +5598,7 @@
         <w:t>发票类型:</w:t>
       </w:r>
     </w:p>
-    <w:p>
+    <w:p ns2:paraId="3DAB832F">
       <w:pPr>
         <w:pStyle w:val="28"/>
         <w:keepNext w:val="0"/>
@@ -5665,7 +5633,7 @@
         <w:t xml:space="preserve">□增值税专用发票  </w:t>
       </w:r>
     </w:p>
-    <w:p>
+    <w:p ns2:paraId="22C5EA2D">
       <w:pPr>
         <w:pStyle w:val="28"/>
         <w:keepNext w:val="0"/>
@@ -5700,7 +5668,7 @@
         <w:t xml:space="preserve">□增值税普通发票                         </w:t>
       </w:r>
     </w:p>
-    <w:p>
+    <w:p ns2:paraId="58B2BC88">
       <w:pPr>
         <w:pStyle w:val="28"/>
         <w:keepNext w:val="0"/>
@@ -5735,7 +5703,7 @@
         <w:t>乙方银行账户信息</w:t>
       </w:r>
     </w:p>
-    <w:p>
+    <w:p ns2:paraId="2F79D67D">
       <w:pPr>
         <w:pStyle w:val="28"/>
         <w:keepNext w:val="0"/>
@@ -5779,7 +5747,7 @@
         <w:t xml:space="preserve">                         </w:t>
       </w:r>
     </w:p>
-    <w:p>
+    <w:p ns2:paraId="2BDBAB2D">
       <w:pPr>
         <w:pStyle w:val="28"/>
         <w:keepNext w:val="0"/>
@@ -5829,7 +5797,7 @@
         <w:t xml:space="preserve">                         </w:t>
       </w:r>
     </w:p>
-    <w:p>
+    <w:p ns2:paraId="1A833BD6">
       <w:pPr>
         <w:pStyle w:val="28"/>
         <w:keepNext w:val="0"/>
@@ -5879,7 +5847,7 @@
         <w:t xml:space="preserve">                         </w:t>
       </w:r>
     </w:p>
-    <w:p>
+    <w:p ns2:paraId="3C183731">
       <w:pPr>
         <w:pStyle w:val="28"/>
         <w:keepNext w:val="0"/>
@@ -5929,7 +5897,7 @@
         <w:t xml:space="preserve">                         </w:t>
       </w:r>
     </w:p>
-    <w:p>
+    <w:p ns2:paraId="412374B8">
       <w:pPr>
         <w:pStyle w:val="28"/>
         <w:keepNext w:val="0"/>
@@ -5964,7 +5932,7 @@
         <w:t>甲方开票信息</w:t>
       </w:r>
     </w:p>
-    <w:p>
+    <w:p ns2:paraId="0835FE84">
       <w:pPr>
         <w:pStyle w:val="28"/>
         <w:keepNext w:val="0"/>
@@ -6014,7 +5982,7 @@
         <w:t xml:space="preserve">                         </w:t>
       </w:r>
     </w:p>
-    <w:p>
+    <w:p ns2:paraId="03644B73">
       <w:pPr>
         <w:pStyle w:val="28"/>
         <w:keepNext w:val="0"/>
@@ -6064,7 +6032,7 @@
         <w:t xml:space="preserve">                         </w:t>
       </w:r>
     </w:p>
-    <w:p>
+    <w:p ns2:paraId="5FD3CEC2">
       <w:pPr>
         <w:pStyle w:val="28"/>
         <w:keepNext w:val="0"/>
@@ -6114,7 +6082,7 @@
         <w:t xml:space="preserve">                         </w:t>
       </w:r>
     </w:p>
-    <w:p>
+    <w:p ns2:paraId="6196C9AB">
       <w:pPr>
         <w:pStyle w:val="28"/>
         <w:keepNext w:val="0"/>
@@ -6164,7 +6132,7 @@
         <w:t xml:space="preserve">                         </w:t>
       </w:r>
     </w:p>
-    <w:p>
+    <w:p ns2:paraId="755FB4BA">
       <w:pPr>
         <w:pStyle w:val="28"/>
         <w:keepNext w:val="0"/>
@@ -6214,7 +6182,7 @@
         <w:t xml:space="preserve">                         </w:t>
       </w:r>
     </w:p>
-    <w:p>
+    <w:p ns2:paraId="4048D67D">
       <w:pPr>
         <w:pStyle w:val="28"/>
         <w:keepNext w:val="0"/>
@@ -6265,7 +6233,7 @@
         <w:t xml:space="preserve">         </w:t>
       </w:r>
     </w:p>
-    <w:p>
+    <w:p ns2:paraId="545D548F">
       <w:pPr>
         <w:pStyle w:val="2"/>
         <w:numPr>
@@ -6290,7 +6258,7 @@
         <w:t>双方权利与义务</w:t>
       </w:r>
     </w:p>
-    <w:p>
+    <w:p ns2:paraId="3B02A1C7">
       <w:pPr>
         <w:pStyle w:val="28"/>
         <w:keepNext w:val="0"/>
@@ -6333,7 +6301,7 @@
         <w:t>甲方权利与义务</w:t>
       </w:r>
     </w:p>
-    <w:p>
+    <w:p ns2:paraId="23146F24">
       <w:pPr>
         <w:pStyle w:val="28"/>
         <w:keepNext w:val="0"/>
@@ -6376,7 +6344,7 @@
         <w:t>甲方有义务按合同约定向乙方支付合同款。</w:t>
       </w:r>
     </w:p>
-    <w:p>
+    <w:p ns2:paraId="0A0D6E35">
       <w:pPr>
         <w:pStyle w:val="28"/>
         <w:keepNext w:val="0"/>
@@ -6465,7 +6433,7 @@
         <w:t>因甲方未及时提供资料、账号、网络、服务器、域名、SSL证书、模型API、测试数据、业务确认、第三方系统接口或其他必要配合，导致乙方无法按期交付的，交付期限相应顺延，乙方不承担逾期责任；因此产生的额外工作量或费用，由双方另行确认。</w:t>
       </w:r>
     </w:p>
-    <w:p>
+    <w:p ns2:paraId="1284F08F">
       <w:pPr>
         <w:pStyle w:val="28"/>
         <w:keepNext w:val="0"/>
@@ -6534,7 +6502,7 @@
         <w:t>软件的使用授权。</w:t>
       </w:r>
     </w:p>
-    <w:p>
+    <w:p ns2:paraId="68DD7363">
       <w:pPr>
         <w:pStyle w:val="28"/>
         <w:keepNext w:val="0"/>
@@ -6578,7 +6546,7 @@
         <w:t>甲方应指派一名代表，与乙方进行及时联络，并按双方商定的时间，定期与乙方代表举行会议。</w:t>
       </w:r>
     </w:p>
-    <w:p>
+    <w:p ns2:paraId="3BC10ADB">
       <w:pPr>
         <w:pStyle w:val="28"/>
         <w:keepNext w:val="0"/>
@@ -6692,7 +6660,7 @@
         <w:t>。</w:t>
       </w:r>
     </w:p>
-    <w:p>
+    <w:p ns2:paraId="2D2DCAFA">
       <w:pPr>
         <w:pStyle w:val="28"/>
         <w:keepNext w:val="0"/>
@@ -6778,7 +6746,7 @@
         <w:t>。</w:t>
       </w:r>
     </w:p>
-    <w:p>
+    <w:p ns2:paraId="3BCEED63">
       <w:pPr>
         <w:keepNext/>
         <w:keepLines w:val="0"/>
@@ -6822,7 +6790,7 @@
         <w:t>其他本合同约定的权利和义务。</w:t>
       </w:r>
     </w:p>
-    <w:p>
+    <w:p ns2:paraId="32BE6A20">
       <w:pPr>
         <w:pStyle w:val="28"/>
         <w:keepNext w:val="0"/>
@@ -6865,7 +6833,7 @@
         <w:t>乙方权利与义务</w:t>
       </w:r>
     </w:p>
-    <w:p>
+    <w:p ns2:paraId="772639AF">
       <w:pPr>
         <w:pStyle w:val="28"/>
         <w:keepNext w:val="0"/>
@@ -6908,7 +6876,7 @@
         <w:t>乙方有权依据本合同约定获取相应的报酬。</w:t>
       </w:r>
     </w:p>
-    <w:p>
+    <w:p ns2:paraId="5B18CAAE">
       <w:pPr>
         <w:pStyle w:val="28"/>
         <w:keepNext w:val="0"/>
@@ -6971,7 +6939,7 @@
         <w:t>监督、协调技术服务的执行情况。</w:t>
       </w:r>
     </w:p>
-    <w:p>
+    <w:p ns2:paraId="0833343E">
       <w:pPr>
         <w:pStyle w:val="28"/>
         <w:keepNext w:val="0"/>
@@ -7096,7 +7064,7 @@
         <w:t>。</w:t>
       </w:r>
     </w:p>
-    <w:p>
+    <w:p ns2:paraId="155D18D0">
       <w:pPr>
         <w:pStyle w:val="28"/>
         <w:keepNext w:val="0"/>
@@ -7172,7 +7140,7 @@
         <w:t>。</w:t>
       </w:r>
     </w:p>
-    <w:p>
+    <w:p ns2:paraId="7BC2E78B">
       <w:pPr>
         <w:pStyle w:val="28"/>
         <w:keepNext w:val="0"/>
@@ -7259,7 +7227,7 @@
         <w:t>验收。</w:t>
       </w:r>
     </w:p>
-    <w:p>
+    <w:p ns2:paraId="6557C93D">
       <w:pPr>
         <w:pStyle w:val="28"/>
         <w:keepNext w:val="0"/>
@@ -7302,7 +7270,7 @@
         <w:t>乙方应妥善保管和使用甲方提供或为本项目服务设置的相关账户和密码。本合同履行完毕后，乙方应当销毁所有与甲方或甲方项目有关的账户与密码。非经甲方同意，乙方及乙方人员不得再次登录相关系统、软件、程序等。</w:t>
       </w:r>
     </w:p>
-    <w:p>
+    <w:p ns2:paraId="51BB45AC">
       <w:pPr>
         <w:pStyle w:val="28"/>
         <w:keepNext w:val="0"/>
@@ -7345,7 +7313,7 @@
         <w:t>其他本合同约定的权利和义务。</w:t>
       </w:r>
     </w:p>
-    <w:p>
+    <w:p ns2:paraId="512D2CF8">
       <w:pPr>
         <w:pStyle w:val="2"/>
         <w:numPr>
@@ -7369,7 +7337,7 @@
         <w:t>知识产权及保密</w:t>
       </w:r>
     </w:p>
-    <w:p>
+    <w:p ns2:paraId="3A8CC7D8">
       <w:pPr>
         <w:pStyle w:val="28"/>
         <w:keepNext w:val="0"/>
@@ -7412,7 +7380,7 @@
         <w:t>知识产权</w:t>
       </w:r>
     </w:p>
-    <w:p>
+    <w:p ns2:paraId="425A2FA5">
       <w:pPr>
         <w:pStyle w:val="28"/>
         <w:keepNext w:val="0"/>
@@ -7455,7 +7423,7 @@
         <w:t>平台及相关软件、程序、页面、文档、技术方案、接口、商标、标识、算法、架构及其他知识产权归乙方或相关权利人所有。</w:t>
       </w:r>
     </w:p>
-    <w:p>
+    <w:p ns2:paraId="0A3B4E5A">
       <w:pPr>
         <w:pStyle w:val="28"/>
         <w:keepNext w:val="0"/>
@@ -7498,7 +7466,7 @@
         <w:t>甲方因本合同取得的是在约定范围内使用服务的权利,不取得平台或相关技术成果的所有权、源代码、复制权、转授权权利或其他未明确授予的权利。</w:t>
       </w:r>
     </w:p>
-    <w:p>
+    <w:p ns2:paraId="572A6AEB">
       <w:pPr>
         <w:keepNext/>
         <w:keepLines w:val="0"/>
@@ -7547,7 +7515,7 @@
         <w:t>行为,但法律法规另有强制性规定的除外。</w:t>
       </w:r>
     </w:p>
-    <w:p>
+    <w:p ns2:paraId="3810C919">
       <w:pPr>
         <w:keepNext/>
         <w:keepLines w:val="0"/>
@@ -7577,7 +7545,6 @@
           <w:bCs w:val="0"/>
           <w:sz w:val="21"/>
           <w:szCs w:val="21"/>
-          <w:highlight w:val="lightGray"/>
           <w:lang w:val="en-US" w:eastAsia="zh-CN"/>
         </w:rPr>
       </w:pPr>
@@ -7589,15 +7556,12 @@
           <w:kern w:val="2"/>
           <w:sz w:val="21"/>
           <w:szCs w:val="21"/>
-          <w:highlight w:val="lightGray"/>
           <w:lang w:val="en-US" w:eastAsia="zh-CN" w:bidi="ar-SA"/>
         </w:rPr>
         <w:t>甲方基于 FastGPT 平台自行创建并实际用于其业务场景的具体业务应用及其中由甲方提供或形成的业务数据、知识库内容、提示词配置、业务流程和应用配置方案，其合法权益归甲方所有。但除双方另有书面约定外，甲方不因创建、配置或使用该等业务应用而取得 FastGPT 平台、底层软件、算法模型、通用组件、接口能力、系统架构、技术文档、产品名称、商标及乙方既有技术成果的所有权、知识产权或其他未明确授予的权利</w:t>
       </w:r>
       <w:r>
-        <w:rPr>
-          <w:highlight w:val="lightGray"/>
-        </w:rPr>
+        <w:rPr/>
         <w:commentReference w:id="2"/>
       </w:r>
       <w:r>
@@ -7608,13 +7572,12 @@
           <w:kern w:val="2"/>
           <w:sz w:val="21"/>
           <w:szCs w:val="21"/>
-          <w:highlight w:val="lightGray"/>
           <w:lang w:val="en-US" w:eastAsia="zh-CN" w:bidi="ar-SA"/>
         </w:rPr>
         <w:t>。</w:t>
       </w:r>
     </w:p>
-    <w:p>
+    <w:p ns2:paraId="74501E17">
       <w:pPr>
         <w:pStyle w:val="28"/>
         <w:keepNext w:val="0"/>
@@ -7657,7 +7620,7 @@
         <w:t>保密义务</w:t>
       </w:r>
     </w:p>
-    <w:p>
+    <w:p ns2:paraId="2064D6BF">
       <w:pPr>
         <w:keepLines w:val="0"/>
         <w:pageBreakBefore w:val="0"/>
@@ -7686,7 +7649,7 @@
         <w:t>双方应对在合同履行过程中知悉的对方保密信息予以保密。本协议项下的“保密信息”包括但不限于本合同价款及商务条款、与本项目相关的所有技术、经营、财务信息、商业秘密、技术秘密等信息，包括但不限于：源代码、设计图纸、工艺流程、客户名单、采购价格、合同价款。但不包括：（1）根据乙方的文件和记录所示，甲方披露前，乙方即已掌握的；（2）已为公众所知悉或将会知悉的任何信息或非因乙方不当行为而成为公众所知悉的信息。尽管有前述规定，在以下情况下，乙方可披露相关保密信息：（1）取得甲方事先书面同意；（2）根据法院、政府部门或其他有权机关的合法要求而必须披露的。</w:t>
       </w:r>
     </w:p>
-    <w:p>
+    <w:p ns2:paraId="7360ED17">
       <w:pPr>
         <w:keepNext w:val="0"/>
         <w:keepLines w:val="0"/>
@@ -7722,7 +7685,7 @@
         <w:t>除上述限制规定外，本协议项下的条款本身亦属于双方的保密信息。</w:t>
       </w:r>
     </w:p>
-    <w:p>
+    <w:p ns2:paraId="23E2EAD8">
       <w:pPr>
         <w:keepNext w:val="0"/>
         <w:keepLines w:val="0"/>
@@ -7762,7 +7725,7 @@
         <w:t>对于所涉保密信息，未经对方书面同意，不得向任何第三方泄露、传播或转让，不得擅自复制、修改、传播或进行反向工程、反向编译、反向汇编等。</w:t>
       </w:r>
     </w:p>
-    <w:p>
+    <w:p ns2:paraId="627C4A76">
       <w:pPr>
         <w:keepNext w:val="0"/>
         <w:keepLines w:val="0"/>
@@ -7799,7 +7762,7 @@
         <w:t>本协议项下的保密义务为持续性义务，不因本协议的终止而解除；但如相关保密信息经合法途径成为公开信息，则对该部分信息的保密义务自动终止。</w:t>
       </w:r>
     </w:p>
-    <w:p>
+    <w:p ns2:paraId="60DC6E00">
       <w:pPr>
         <w:pStyle w:val="2"/>
         <w:numPr>
@@ -7821,7 +7784,7 @@
         <w:t>违约责任</w:t>
       </w:r>
     </w:p>
-    <w:p>
+    <w:p ns2:paraId="74DC9936">
       <w:pPr>
         <w:keepNext/>
         <w:keepLines w:val="0"/>
@@ -7870,14 +7833,13 @@
         <w:rPr>
           <w:rFonts w:hint="eastAsia" w:cs="Times New Roman"/>
           <w:color w:val="000000" w:themeColor="text1"/>
-          <w:highlight w:val="none"/>
           <w:u w:val="none"/>
           <w:lang w:val="en-US" w:eastAsia="zh-CN"/>
-          <w14:textFill>
-            <w14:solidFill>
-              <w14:schemeClr w14:val="tx1"/>
-            </w14:solidFill>
-          </w14:textFill>
+          <ns2:textFill>
+            <ns2:solidFill>
+              <ns2:schemeClr ns2:val="tx1"/>
+            </ns2:solidFill>
+          </ns2:textFill>
         </w:rPr>
         <w:t>工作</w:t>
       </w:r>
@@ -7901,7 +7863,6 @@
           <w:kern w:val="2"/>
           <w:sz w:val="21"/>
           <w:szCs w:val="20"/>
-          <w:highlight w:val="yellow"/>
           <w:u w:val="single"/>
           <w:lang w:val="en-US" w:eastAsia="zh-CN" w:bidi="ar-SA"/>
         </w:rPr>
@@ -7915,7 +7876,6 @@
           <w:kern w:val="2"/>
           <w:sz w:val="21"/>
           <w:szCs w:val="20"/>
-          <w:highlight w:val="yellow"/>
           <w:u w:val="single"/>
           <w:lang w:val="en-US" w:eastAsia="zh-CN" w:bidi="ar-SA"/>
         </w:rPr>
@@ -7929,7 +7889,6 @@
           <w:kern w:val="2"/>
           <w:sz w:val="21"/>
           <w:szCs w:val="20"/>
-          <w:highlight w:val="yellow"/>
           <w:u w:val="single"/>
           <w:lang w:val="en-US" w:eastAsia="zh-CN" w:bidi="ar-SA"/>
         </w:rPr>
@@ -7964,14 +7923,13 @@
         <w:rPr>
           <w:rFonts w:hint="eastAsia" w:cs="Times New Roman"/>
           <w:color w:val="000000" w:themeColor="text1"/>
-          <w:highlight w:val="none"/>
           <w:u w:val="none"/>
           <w:lang w:val="en-US" w:eastAsia="zh-CN"/>
-          <w14:textFill>
-            <w14:solidFill>
-              <w14:schemeClr w14:val="tx1"/>
-            </w14:solidFill>
-          </w14:textFill>
+          <ns2:textFill>
+            <ns2:solidFill>
+              <ns2:schemeClr ns2:val="tx1"/>
+            </ns2:solidFill>
+          </ns2:textFill>
         </w:rPr>
         <w:t>工作</w:t>
       </w:r>
@@ -8008,7 +7966,6 @@
           <w:kern w:val="2"/>
           <w:sz w:val="21"/>
           <w:szCs w:val="20"/>
-          <w:highlight w:val="yellow"/>
           <w:u w:val="single"/>
           <w:lang w:val="en-US" w:eastAsia="zh-CN" w:bidi="ar-SA"/>
         </w:rPr>
@@ -8027,7 +7984,7 @@
         <w:t>向乙方支付违约金。</w:t>
       </w:r>
     </w:p>
-    <w:p>
+    <w:p ns2:paraId="67B8D238">
       <w:pPr>
         <w:keepNext/>
         <w:keepLines w:val="0"/>
@@ -8094,14 +8051,13 @@
         <w:rPr>
           <w:rFonts w:hint="eastAsia" w:cs="Times New Roman"/>
           <w:color w:val="000000" w:themeColor="text1"/>
-          <w:highlight w:val="none"/>
           <w:u w:val="none"/>
           <w:lang w:val="en-US" w:eastAsia="zh-CN"/>
-          <w14:textFill>
-            <w14:solidFill>
-              <w14:schemeClr w14:val="tx1"/>
-            </w14:solidFill>
-          </w14:textFill>
+          <ns2:textFill>
+            <ns2:solidFill>
+              <ns2:schemeClr ns2:val="tx1"/>
+            </ns2:solidFill>
+          </ns2:textFill>
         </w:rPr>
         <w:t>工作</w:t>
       </w:r>
@@ -8147,7 +8103,6 @@
           <w:kern w:val="2"/>
           <w:sz w:val="21"/>
           <w:szCs w:val="20"/>
-          <w:highlight w:val="yellow"/>
           <w:u w:val="single"/>
           <w:lang w:val="en-US" w:eastAsia="zh-CN" w:bidi="ar-SA"/>
         </w:rPr>
@@ -8180,7 +8135,6 @@
           <w:kern w:val="2"/>
           <w:sz w:val="21"/>
           <w:szCs w:val="21"/>
-          <w:highlight w:val="yellow"/>
           <w:u w:val="single"/>
           <w:lang w:val="en-US" w:eastAsia="zh-CN" w:bidi="ar"/>
         </w:rPr>
@@ -8198,7 +8152,7 @@
         <w:t>。</w:t>
       </w:r>
     </w:p>
-    <w:p>
+    <w:p ns2:paraId="332436E8">
       <w:pPr>
         <w:keepNext/>
         <w:keepLines w:val="0"/>
@@ -8274,7 +8228,6 @@
           <w:kern w:val="2"/>
           <w:sz w:val="21"/>
           <w:szCs w:val="21"/>
-          <w:highlight w:val="yellow"/>
           <w:lang w:val="en-US" w:eastAsia="zh-CN" w:bidi="ar"/>
         </w:rPr>
         <w:t>%</w:t>
@@ -8295,7 +8248,6 @@
           <w:kern w:val="2"/>
           <w:sz w:val="21"/>
           <w:szCs w:val="21"/>
-          <w:highlight w:val="lightGray"/>
           <w:lang w:val="en-US" w:eastAsia="zh-CN" w:bidi="ar"/>
         </w:rPr>
         <w:commentReference w:id="3"/>
@@ -8306,13 +8258,12 @@
           <w:kern w:val="2"/>
           <w:sz w:val="21"/>
           <w:szCs w:val="21"/>
-          <w:highlight w:val="lightGray"/>
           <w:lang w:val="en-US" w:eastAsia="zh-CN" w:bidi="ar"/>
         </w:rPr>
         <w:t>合同提前终止的，双方应按实际履行情况进行结算，非乙方原因造成合同终止的，乙方有权就已履约部分收取对应的合同款项。</w:t>
       </w:r>
     </w:p>
-    <w:p>
+    <w:p ns2:paraId="66C24DB1">
       <w:pPr>
         <w:keepNext/>
         <w:keepLines w:val="0"/>
@@ -8426,7 +8377,7 @@
         <w:t>。</w:t>
       </w:r>
     </w:p>
-    <w:p>
+    <w:p ns2:paraId="7FDF7D0D">
       <w:pPr>
         <w:keepNext/>
         <w:keepLines w:val="0"/>
@@ -8471,7 +8422,7 @@
         <w:t>因第三方大模型、云服务、网络、硬件、操作系统、浏览器、数据库、开源组件、甲方系统接口或甲方数据质量等非乙方可控原因导致的服务不可用、输出异常、性能下降或安全问题，不视为乙方违约；但乙方应在其合理能力范围内提供排查、说明和替代方案建议。</w:t>
       </w:r>
     </w:p>
-    <w:p>
+    <w:p ns2:paraId="599DCA52">
       <w:pPr>
         <w:pStyle w:val="2"/>
         <w:numPr>
@@ -8493,7 +8444,7 @@
         <w:t>不可抗力</w:t>
       </w:r>
     </w:p>
-    <w:p>
+    <w:p ns2:paraId="602CF34B">
       <w:pPr>
         <w:keepNext/>
         <w:keepLines w:val="0"/>
@@ -8537,7 +8488,7 @@
         <w:t>如果任何一方在全部执行或部分执行过程中，因为“不可抗力”而受阻或延迟，即被视为发生了“不可抗力”事件。“不可抗力”指超出双方控制能力的原因、环境或事件，包括洪水、火灾、台风、地震、战争或其它类似性质的超出该方控制能力的原因，其程度为即使该方经过努力仍然受阻或延迟。只要不可抗力事件阻止或延迟合同的执行，合同规定的原责任方应在事件发生后的五个工作日内，应向另一方解释不能执行或延迟该合同的全部或部分之原因，以及出示合法机构签发的证明材料。</w:t>
       </w:r>
     </w:p>
-    <w:p>
+    <w:p ns2:paraId="467D6C25">
       <w:pPr>
         <w:keepNext/>
         <w:keepLines w:val="0"/>
@@ -8592,7 +8543,7 @@
         <w:t>因不可抗力不能履行合同的，根据不可抗力的影响，部分或者全部免除责任，但法律另有规定的除外。当事人迟延履行后发生不可抗力的，不能免除责任。如以上情况发生，双方应及时协商并尽力争取挽救措施，并就本合同的执行达成谅解备忘录，以避免双方的更大损失。</w:t>
       </w:r>
     </w:p>
-    <w:p>
+    <w:p ns2:paraId="25EA7876">
       <w:pPr>
         <w:pStyle w:val="2"/>
         <w:numPr>
@@ -8614,7 +8565,7 @@
         <w:t>法律适用和争议解决</w:t>
       </w:r>
     </w:p>
-    <w:p>
+    <w:p ns2:paraId="25D1F0C3">
       <w:pPr>
         <w:bidi w:val="0"/>
         <w:rPr>
@@ -8629,7 +8580,7 @@
         <w:t>本合同适用中华人民共和国法律（不包括中国香港、中国澳门、中国台湾地区法律）。</w:t>
       </w:r>
     </w:p>
-    <w:p>
+    <w:p ns2:paraId="32CAE8C5">
       <w:pPr>
         <w:bidi w:val="0"/>
         <w:rPr>
@@ -8644,7 +8595,7 @@
         <w:t>在本合同履行过程中发生争议，双方应当友好协商解决，双方友好协商未成，双方同意将争议提交至甲方所在地法院裁决。诉讼进行过程中，双方应继续履行本合同未涉及诉讼的其他部分。</w:t>
       </w:r>
     </w:p>
-    <w:p>
+    <w:p ns2:paraId="5673FB01">
       <w:pPr>
         <w:pStyle w:val="2"/>
         <w:numPr>
@@ -8666,7 +8617,7 @@
         <w:t>通知与送达</w:t>
       </w:r>
     </w:p>
-    <w:p>
+    <w:p ns2:paraId="4BA20689">
       <w:pPr>
         <w:keepNext w:val="0"/>
         <w:keepLines w:val="0"/>
@@ -8697,7 +8648,7 @@
         <w:t>合同首页双方联系地址、双方联系人、联系电话、电子邮箱为双方有效通讯信息，本合同项下及与本合同有关的所有的通知及联络应以书面形式作出，并按照本合同中的首页约定的通讯信息向对方送达。本合同中的首页约定的通讯信息适用范围包括双方协议履行时各类通知、协议等文件以及就协议发生纠纷时相关文件和法律文书（包括但不限于在争议进入仲裁、民事诉讼程序后的一审、二审、再审和执行程序的司法文书）的送达、接收。</w:t>
       </w:r>
     </w:p>
-    <w:p>
+    <w:p ns2:paraId="51202476">
       <w:pPr>
         <w:keepNext w:val="0"/>
         <w:keepLines w:val="0"/>
@@ -8732,7 +8683,7 @@
         <w:t>对于任何通知或联络，如直接交付，在交付时视为收讫；如用电子邮箱，在发信服务器上所记录的发出时间视为送达时间；如用挂号信邮寄，在寄出五天后视为收讫；如以特快专递方式邮寄，则在寄出后第三天后即视为送达。</w:t>
       </w:r>
     </w:p>
-    <w:p>
+    <w:p ns2:paraId="1E299778">
       <w:pPr>
         <w:keepNext w:val="0"/>
         <w:keepLines w:val="0"/>
@@ -8767,7 +8718,7 @@
         <w:t>本合同执行期限内，任何一方有权改变相关通讯信息，变更应及时书面通知另一方，在变更通知送达另一方前，变更前的通讯信息仍视为有效联系方式。 因提供或者确认的送达方式不准确、送达方式变更后未及时依程序告知对方或指定的接收人拒绝签收等原因，导致协议相关文件、法律文书未能被实际接收的，双方同意仍视为已有效送达且以文书被退回之日视为送达之日。</w:t>
       </w:r>
     </w:p>
-    <w:p>
+    <w:p ns2:paraId="20037888">
       <w:pPr>
         <w:keepNext w:val="0"/>
         <w:keepLines w:val="0"/>
@@ -8800,7 +8751,7 @@
         <w:t>本合同中送达条款为独立条款，不受协议无效、变更或撤销的影响。</w:t>
       </w:r>
     </w:p>
-    <w:p>
+    <w:p ns2:paraId="11379DB9">
       <w:pPr>
         <w:pStyle w:val="2"/>
         <w:numPr>
@@ -8822,7 +8773,7 @@
         <w:t>合同生效</w:t>
       </w:r>
     </w:p>
-    <w:p>
+    <w:p ns2:paraId="20EBDD6C">
       <w:pPr>
         <w:keepNext/>
         <w:keepLines w:val="0"/>
@@ -8866,7 +8817,7 @@
         <w:t>双方同意采取以下第 1种合同生效方式</w:t>
       </w:r>
     </w:p>
-    <w:p>
+    <w:p ns2:paraId="659105AE">
       <w:pPr>
         <w:keepNext w:val="0"/>
         <w:keepLines w:val="0"/>
@@ -8912,7 +8863,6 @@
           <w:kern w:val="2"/>
           <w:sz w:val="21"/>
           <w:szCs w:val="21"/>
-          <w:highlight w:val="yellow"/>
           <w:u w:val="single"/>
           <w:lang w:val="en-US" w:eastAsia="zh-CN" w:bidi="ar"/>
         </w:rPr>
@@ -8934,7 +8884,6 @@
           <w:kern w:val="2"/>
           <w:sz w:val="21"/>
           <w:szCs w:val="21"/>
-          <w:highlight w:val="yellow"/>
           <w:u w:val="single"/>
           <w:lang w:val="en-US" w:eastAsia="zh-CN" w:bidi="ar"/>
         </w:rPr>
@@ -8951,7 +8900,7 @@
         <w:t>份，均具同等的法律效力；</w:t>
       </w:r>
     </w:p>
-    <w:p>
+    <w:p ns2:paraId="60015117">
       <w:pPr>
         <w:keepNext w:val="0"/>
         <w:keepLines w:val="0"/>
@@ -8992,7 +8941,7 @@
         <w:t>2、电子签章方式：本合同由双方采取电子签章方式签署，自双方盖章后生效，经签署的电子文档为原件，打印件或其他纸件与原件有冲突时，以原件为准。为免歧义，经电子签署的电子文档，属于书面形式的文档。</w:t>
       </w:r>
     </w:p>
-    <w:p>
+    <w:p ns2:paraId="143F139E">
       <w:pPr>
         <w:keepNext/>
         <w:keepLines w:val="0"/>
@@ -9036,7 +8985,7 @@
         <w:t>在履行合同过程中对于具体内容需要变更的，由签约双方另行协商并书面约定，作为本合同的变更文本，与本合同具有同等法律效力。</w:t>
       </w:r>
     </w:p>
-    <w:p>
+    <w:p ns2:paraId="0C83FCEC">
       <w:pPr>
         <w:keepNext/>
         <w:keepLines w:val="0"/>
@@ -9124,7 +9073,7 @@
         <w:t>日内结清，否则按逾期付款处理。如乙方未在规定时间结清，乙方同意甲方有权直接从应付货款中扣除。</w:t>
       </w:r>
     </w:p>
-    <w:p>
+    <w:p ns2:paraId="1AB48963">
       <w:pPr>
         <w:keepNext/>
         <w:keepLines w:val="0"/>
@@ -9164,7 +9113,7 @@
         <w:t>甲方致力于保障风清气正的商业环境，严厉打击任何有违良好合作氛围的行为，甲方统一举报投诉受理渠道：</w:t>
       </w:r>
     </w:p>
-    <w:p>
+    <w:p ns2:paraId="3DD0DE7D">
       <w:pPr>
         <w:spacing w:line="440" w:lineRule="exact"/>
         <w:ind w:left="0" w:leftChars="0" w:firstLine="0" w:firstLineChars="0"/>
@@ -9224,7 +9173,7 @@
         <w:gridCol w:w="4728"/>
         <w:gridCol w:w="4729"/>
       </w:tblGrid>
-      <w:tr>
+      <w:tr ns2:paraId="7DEB450B">
         <w:trPr>
           <w:trHeight w:val="3530" w:hRule="atLeast"/>
         </w:trPr>
@@ -9238,7 +9187,7 @@
               <w:right w:val="nil"/>
             </w:tcBorders>
           </w:tcPr>
-          <w:p>
+          <w:p ns2:paraId="57F110A3">
             <w:pPr>
               <w:keepNext w:val="0"/>
               <w:keepLines w:val="0"/>
@@ -9257,7 +9206,7 @@
               </w:rPr>
             </w:pPr>
           </w:p>
-          <w:p>
+          <w:p ns2:paraId="6AB82CF9">
             <w:pPr>
               <w:keepNext w:val="0"/>
               <w:keepLines w:val="0"/>
@@ -9276,7 +9225,7 @@
               </w:rPr>
             </w:pPr>
           </w:p>
-          <w:p>
+          <w:p ns2:paraId="5393DDC3">
             <w:pPr>
               <w:keepNext w:val="0"/>
               <w:keepLines w:val="0"/>
@@ -9353,7 +9302,7 @@
               <w:t xml:space="preserve">                        </w:t>
             </w:r>
           </w:p>
-          <w:p>
+          <w:p ns2:paraId="6A4637A2">
             <w:pPr>
               <w:keepNext w:val="0"/>
               <w:keepLines w:val="0"/>
@@ -9390,7 +9339,7 @@
               <w:t>：</w:t>
             </w:r>
           </w:p>
-          <w:p>
+          <w:p ns2:paraId="0C8C4B55">
             <w:pPr>
               <w:keepNext w:val="0"/>
               <w:keepLines w:val="0"/>
@@ -9425,7 +9374,7 @@
               <w:right w:val="nil"/>
             </w:tcBorders>
           </w:tcPr>
-          <w:p>
+          <w:p ns2:paraId="14A14261">
             <w:pPr>
               <w:keepNext w:val="0"/>
               <w:keepLines w:val="0"/>
@@ -9445,7 +9394,7 @@
               </w:rPr>
             </w:pPr>
           </w:p>
-          <w:p>
+          <w:p ns2:paraId="725EC3C9">
             <w:pPr>
               <w:keepNext w:val="0"/>
               <w:keepLines w:val="0"/>
@@ -9465,7 +9414,7 @@
               </w:rPr>
             </w:pPr>
           </w:p>
-          <w:p>
+          <w:p ns2:paraId="4B9DD5B0">
             <w:pPr>
               <w:keepNext w:val="0"/>
               <w:keepLines w:val="0"/>
@@ -9526,7 +9475,7 @@
               <w:t xml:space="preserve">   </w:t>
             </w:r>
           </w:p>
-          <w:p>
+          <w:p ns2:paraId="3ABC414C">
             <w:pPr>
               <w:keepNext w:val="0"/>
               <w:keepLines w:val="0"/>
@@ -9563,7 +9512,7 @@
               <w:t>：</w:t>
             </w:r>
           </w:p>
-          <w:p>
+          <w:p ns2:paraId="08FA40C1">
             <w:pPr>
               <w:keepNext w:val="0"/>
               <w:keepLines w:val="0"/>
@@ -9590,13 +9539,14 @@
         </w:tc>
       </w:tr>
     </w:tbl>
-    <w:p>
+    <w:p ns2:paraId="6D580B98">
       <w:pPr>
         <w:pStyle w:val="18"/>
         <w:rPr>
           <w:rFonts w:hint="default" w:ascii="黑体" w:eastAsia="黑体"/>
           <w:lang w:val="en-US"/>
         </w:rPr>
+        <w:pageBreakBefore w:val="1"/>
       </w:pPr>
       <w:r>
         <w:rPr>
@@ -9634,7 +9584,7 @@
         <w:t>产品/服务及报价清单</w:t>
       </w:r>
     </w:p>
-    <w:p>
+    <w:p ns2:paraId="26A219B9">
       <w:pPr>
         <w:spacing w:line="440" w:lineRule="exact"/>
         <w:rPr>
@@ -9673,12 +9623,12 @@
         <w:gridCol w:w="672"/>
         <w:gridCol w:w="1527"/>
       </w:tblGrid>
-      <w:tr>
+      <w:tr ns2:paraId="6BC51B20">
         <w:tc>
           <w:tcPr>
             <w:tcW w:w="641" w:type="dxa"/>
           </w:tcPr>
-          <w:p>
+          <w:p ns2:paraId="04C62E1E">
             <w:pPr>
               <w:keepNext w:val="0"/>
               <w:keepLines w:val="0"/>
@@ -9706,7 +9656,7 @@
           <w:tcPr>
             <w:tcW w:w="1756" w:type="dxa"/>
           </w:tcPr>
-          <w:p>
+          <w:p ns2:paraId="2EF68071">
             <w:pPr>
               <w:keepNext w:val="0"/>
               <w:keepLines w:val="0"/>
@@ -9734,7 +9684,7 @@
           <w:tcPr>
             <w:tcW w:w="2626" w:type="dxa"/>
           </w:tcPr>
-          <w:p>
+          <w:p ns2:paraId="2A4B7716">
             <w:pPr>
               <w:keepNext w:val="0"/>
               <w:keepLines w:val="0"/>
@@ -9767,7 +9717,7 @@
           <w:tcPr>
             <w:tcW w:w="657" w:type="dxa"/>
           </w:tcPr>
-          <w:p>
+          <w:p ns2:paraId="5FEFA809">
             <w:pPr>
               <w:keepNext w:val="0"/>
               <w:keepLines w:val="0"/>
@@ -9795,7 +9745,7 @@
           <w:tcPr>
             <w:tcW w:w="778" w:type="dxa"/>
           </w:tcPr>
-          <w:p>
+          <w:p ns2:paraId="6C97447F">
             <w:pPr>
               <w:keepNext w:val="0"/>
               <w:keepLines w:val="0"/>
@@ -9825,7 +9775,7 @@
             <w:shd w:val="clear" w:color="auto" w:fill="auto"/>
             <w:vAlign w:val="top"/>
           </w:tcPr>
-          <w:p>
+          <w:p ns2:paraId="13D3A8F7">
             <w:pPr>
               <w:keepNext w:val="0"/>
               <w:keepLines w:val="0"/>
@@ -9856,7 +9806,7 @@
           <w:tcPr>
             <w:tcW w:w="1527" w:type="dxa"/>
           </w:tcPr>
-          <w:p>
+          <w:p ns2:paraId="21131F59">
             <w:pPr>
               <w:keepNext w:val="0"/>
               <w:keepLines w:val="0"/>
@@ -9890,13 +9840,13 @@
           </w:p>
         </w:tc>
       </w:tr>
-      <w:tr>
+      <w:tr ns2:paraId="32A57F5A">
         <w:tc>
           <w:tcPr>
             <w:tcW w:w="641" w:type="dxa"/>
             <w:vAlign w:val="center"/>
           </w:tcPr>
-          <w:p>
+          <w:p ns2:paraId="25218B7E">
             <w:pPr>
               <w:keepNext w:val="0"/>
               <w:keepLines w:val="0"/>
@@ -9925,7 +9875,7 @@
             <w:tcW w:w="1756" w:type="dxa"/>
             <w:vAlign w:val="center"/>
           </w:tcPr>
-          <w:p>
+          <w:p ns2:paraId="0648E79E">
             <w:pPr>
               <w:keepNext w:val="0"/>
               <w:keepLines w:val="0"/>
@@ -9956,7 +9906,7 @@
             <w:tcW w:w="2626" w:type="dxa"/>
             <w:vAlign w:val="center"/>
           </w:tcPr>
-          <w:p>
+          <w:p ns2:paraId="4B809C41">
             <w:pPr>
               <w:keepNext w:val="0"/>
               <w:keepLines w:val="0"/>
@@ -9981,7 +9931,7 @@
               <w:t>私有化部署：</w:t>
             </w:r>
           </w:p>
-          <w:p>
+          <w:p ns2:paraId="265906D2">
             <w:pPr>
               <w:keepNext w:val="0"/>
               <w:keepLines w:val="0"/>
@@ -10006,7 +9956,7 @@
               <w:t>一次性买断税率13%</w:t>
             </w:r>
           </w:p>
-          <w:p>
+          <w:p ns2:paraId="4591B14B">
             <w:pPr>
               <w:keepNext w:val="0"/>
               <w:keepLines w:val="0"/>
@@ -10037,7 +9987,7 @@
             <w:tcW w:w="657" w:type="dxa"/>
             <w:vAlign w:val="center"/>
           </w:tcPr>
-          <w:p>
+          <w:p ns2:paraId="524E72AA">
             <w:pPr>
               <w:keepNext w:val="0"/>
               <w:keepLines w:val="0"/>
@@ -10066,7 +10016,7 @@
             <w:tcW w:w="778" w:type="dxa"/>
             <w:vAlign w:val="center"/>
           </w:tcPr>
-          <w:p>
+          <w:p ns2:paraId="62525DFE">
             <w:pPr>
               <w:keepNext w:val="0"/>
               <w:keepLines w:val="0"/>
@@ -10096,7 +10046,7 @@
             <w:shd w:val="clear" w:color="auto" w:fill="auto"/>
             <w:vAlign w:val="center"/>
           </w:tcPr>
-          <w:p>
+          <w:p ns2:paraId="457CBFFC">
             <w:pPr>
               <w:keepNext w:val="0"/>
               <w:keepLines w:val="0"/>
@@ -10119,7 +10069,7 @@
             <w:tcW w:w="1527" w:type="dxa"/>
             <w:vAlign w:val="center"/>
           </w:tcPr>
-          <w:p>
+          <w:p ns2:paraId="48E9A3CA">
             <w:pPr>
               <w:keepNext w:val="0"/>
               <w:keepLines w:val="0"/>
@@ -10136,13 +10086,13 @@
           </w:p>
         </w:tc>
       </w:tr>
-      <w:tr>
+      <w:tr ns2:paraId="66BEDED7">
         <w:tc>
           <w:tcPr>
             <w:tcW w:w="641" w:type="dxa"/>
             <w:vAlign w:val="center"/>
           </w:tcPr>
-          <w:p>
+          <w:p ns2:paraId="2053FB9E">
             <w:pPr>
               <w:keepNext w:val="0"/>
               <w:keepLines w:val="0"/>
@@ -10171,7 +10121,7 @@
             <w:tcW w:w="1756" w:type="dxa"/>
             <w:vAlign w:val="center"/>
           </w:tcPr>
-          <w:p>
+          <w:p ns2:paraId="3111ED89">
             <w:pPr>
               <w:keepNext w:val="0"/>
               <w:keepLines w:val="0"/>
@@ -10202,7 +10152,7 @@
             <w:tcW w:w="2626" w:type="dxa"/>
             <w:vAlign w:val="center"/>
           </w:tcPr>
-          <w:p>
+          <w:p ns2:paraId="3B57EAD8">
             <w:pPr>
               <w:keepNext w:val="0"/>
               <w:keepLines w:val="0"/>
@@ -10281,7 +10231,7 @@
             <w:tcW w:w="657" w:type="dxa"/>
             <w:vAlign w:val="center"/>
           </w:tcPr>
-          <w:p>
+          <w:p ns2:paraId="70BB06C9">
             <w:pPr>
               <w:keepNext w:val="0"/>
               <w:keepLines w:val="0"/>
@@ -10312,7 +10262,7 @@
             <w:tcW w:w="778" w:type="dxa"/>
             <w:vAlign w:val="center"/>
           </w:tcPr>
-          <w:p>
+          <w:p ns2:paraId="6CC94DCC">
             <w:pPr>
               <w:keepNext w:val="0"/>
               <w:keepLines w:val="0"/>
@@ -10344,7 +10294,7 @@
             <w:shd w:val="clear" w:color="auto" w:fill="auto"/>
             <w:vAlign w:val="center"/>
           </w:tcPr>
-          <w:p>
+          <w:p ns2:paraId="303B123E">
             <w:pPr>
               <w:keepNext w:val="0"/>
               <w:keepLines w:val="0"/>
@@ -10377,7 +10327,7 @@
             <w:tcW w:w="1527" w:type="dxa"/>
             <w:vAlign w:val="center"/>
           </w:tcPr>
-          <w:p>
+          <w:p ns2:paraId="1AB66F0C">
             <w:pPr>
               <w:keepNext w:val="0"/>
               <w:keepLines w:val="0"/>
@@ -10395,13 +10345,13 @@
           </w:p>
         </w:tc>
       </w:tr>
-      <w:tr>
+      <w:tr ns2:paraId="52E6AAD8">
         <w:tc>
           <w:tcPr>
             <w:tcW w:w="641" w:type="dxa"/>
             <w:vAlign w:val="center"/>
           </w:tcPr>
-          <w:p>
+          <w:p ns2:paraId="05C49BD4">
             <w:pPr>
               <w:keepNext w:val="0"/>
               <w:keepLines w:val="0"/>
@@ -10430,7 +10380,7 @@
             <w:tcW w:w="1756" w:type="dxa"/>
             <w:vAlign w:val="center"/>
           </w:tcPr>
-          <w:p>
+          <w:p ns2:paraId="339468EF">
             <w:pPr>
               <w:keepNext w:val="0"/>
               <w:keepLines w:val="0"/>
@@ -10461,7 +10411,7 @@
             <w:tcW w:w="2626" w:type="dxa"/>
             <w:vAlign w:val="center"/>
           </w:tcPr>
-          <w:p>
+          <w:p ns2:paraId="60C276EB">
             <w:pPr>
               <w:keepNext w:val="0"/>
               <w:keepLines w:val="0"/>
@@ -10509,7 +10459,7 @@
               <w:t>1、系统部署：平台部署至客户现有生产环境并完成验证；</w:t>
             </w:r>
           </w:p>
-          <w:p>
+          <w:p ns2:paraId="704F2572">
             <w:pPr>
               <w:keepNext w:val="0"/>
               <w:keepLines w:val="0"/>
@@ -10587,7 +10537,7 @@
             <w:tcW w:w="657" w:type="dxa"/>
             <w:vAlign w:val="center"/>
           </w:tcPr>
-          <w:p>
+          <w:p ns2:paraId="53E1E4AA">
             <w:pPr>
               <w:keepNext w:val="0"/>
               <w:keepLines w:val="0"/>
@@ -10616,7 +10566,7 @@
             <w:tcW w:w="778" w:type="dxa"/>
             <w:vAlign w:val="center"/>
           </w:tcPr>
-          <w:p>
+          <w:p ns2:paraId="1CDC6A3D">
             <w:pPr>
               <w:keepNext w:val="0"/>
               <w:keepLines w:val="0"/>
@@ -10646,7 +10596,7 @@
             <w:shd w:val="clear" w:color="auto" w:fill="auto"/>
             <w:vAlign w:val="center"/>
           </w:tcPr>
-          <w:p>
+          <w:p ns2:paraId="6FCF53B0">
             <w:pPr>
               <w:keepNext w:val="0"/>
               <w:keepLines w:val="0"/>
@@ -10679,7 +10629,7 @@
             <w:tcW w:w="1527" w:type="dxa"/>
             <w:vAlign w:val="center"/>
           </w:tcPr>
-          <w:p>
+          <w:p ns2:paraId="7CF9E743">
             <w:pPr>
               <w:keepNext w:val="0"/>
               <w:keepLines w:val="0"/>
@@ -10696,13 +10646,13 @@
           </w:p>
         </w:tc>
       </w:tr>
-      <w:tr>
+      <w:tr ns2:paraId="3FF37575">
         <w:tc>
           <w:tcPr>
             <w:tcW w:w="641" w:type="dxa"/>
             <w:vAlign w:val="center"/>
           </w:tcPr>
-          <w:p>
+          <w:p ns2:paraId="3E369179">
             <w:pPr>
               <w:keepNext w:val="0"/>
               <w:keepLines w:val="0"/>
@@ -10733,7 +10683,7 @@
             <w:tcW w:w="1756" w:type="dxa"/>
             <w:vAlign w:val="center"/>
           </w:tcPr>
-          <w:p>
+          <w:p ns2:paraId="2A13C7F3">
             <w:pPr>
               <w:keepNext w:val="0"/>
               <w:keepLines w:val="0"/>
@@ -10764,7 +10714,7 @@
             <w:tcW w:w="2626" w:type="dxa"/>
             <w:vAlign w:val="center"/>
           </w:tcPr>
-          <w:p>
+          <w:p ns2:paraId="0F127B11">
             <w:pPr>
               <w:keepNext w:val="0"/>
               <w:keepLines w:val="0"/>
@@ -10795,7 +10745,7 @@
             <w:tcW w:w="657" w:type="dxa"/>
             <w:vAlign w:val="center"/>
           </w:tcPr>
-          <w:p>
+          <w:p ns2:paraId="76BF4CA2">
             <w:pPr>
               <w:keepNext w:val="0"/>
               <w:keepLines w:val="0"/>
@@ -10826,7 +10776,7 @@
             <w:tcW w:w="778" w:type="dxa"/>
             <w:vAlign w:val="center"/>
           </w:tcPr>
-          <w:p>
+          <w:p ns2:paraId="3FC6F623">
             <w:pPr>
               <w:keepNext w:val="0"/>
               <w:keepLines w:val="0"/>
@@ -10858,7 +10808,7 @@
             <w:shd w:val="clear" w:color="auto" w:fill="auto"/>
             <w:vAlign w:val="center"/>
           </w:tcPr>
-          <w:p>
+          <w:p ns2:paraId="75D86F18">
             <w:pPr>
               <w:keepNext w:val="0"/>
               <w:keepLines w:val="0"/>
@@ -10891,7 +10841,7 @@
             <w:tcW w:w="1527" w:type="dxa"/>
             <w:vAlign w:val="center"/>
           </w:tcPr>
-          <w:p>
+          <w:p ns2:paraId="78E0C210">
             <w:pPr>
               <w:keepNext w:val="0"/>
               <w:keepLines w:val="0"/>
@@ -10908,13 +10858,13 @@
           </w:p>
         </w:tc>
       </w:tr>
-      <w:tr>
+      <w:tr ns2:paraId="12BD2579">
         <w:tc>
           <w:tcPr>
             <w:tcW w:w="641" w:type="dxa"/>
             <w:vAlign w:val="center"/>
           </w:tcPr>
-          <w:p>
+          <w:p ns2:paraId="04252A60">
             <w:pPr>
               <w:keepNext w:val="0"/>
               <w:keepLines w:val="0"/>
@@ -10945,7 +10895,7 @@
             <w:tcW w:w="1756" w:type="dxa"/>
             <w:vAlign w:val="center"/>
           </w:tcPr>
-          <w:p>
+          <w:p ns2:paraId="1D00714E">
             <w:pPr>
               <w:keepNext w:val="0"/>
               <w:keepLines w:val="0"/>
@@ -10976,7 +10926,7 @@
             <w:tcW w:w="2626" w:type="dxa"/>
             <w:vAlign w:val="center"/>
           </w:tcPr>
-          <w:p>
+          <w:p ns2:paraId="4306A168">
             <w:pPr>
               <w:keepNext w:val="0"/>
               <w:keepLines w:val="0"/>
@@ -11007,7 +10957,7 @@
             <w:tcW w:w="657" w:type="dxa"/>
             <w:vAlign w:val="center"/>
           </w:tcPr>
-          <w:p>
+          <w:p ns2:paraId="2EF9A84D">
             <w:pPr>
               <w:keepNext w:val="0"/>
               <w:keepLines w:val="0"/>
@@ -11038,7 +10988,7 @@
             <w:tcW w:w="778" w:type="dxa"/>
             <w:vAlign w:val="center"/>
           </w:tcPr>
-          <w:p>
+          <w:p ns2:paraId="4FC5C1D0">
             <w:pPr>
               <w:keepNext w:val="0"/>
               <w:keepLines w:val="0"/>
@@ -11070,7 +11020,7 @@
             <w:shd w:val="clear" w:color="auto" w:fill="auto"/>
             <w:vAlign w:val="center"/>
           </w:tcPr>
-          <w:p>
+          <w:p ns2:paraId="5C8C5224">
             <w:pPr>
               <w:keepNext w:val="0"/>
               <w:keepLines w:val="0"/>
@@ -11103,7 +11053,7 @@
             <w:tcW w:w="1527" w:type="dxa"/>
             <w:vAlign w:val="center"/>
           </w:tcPr>
-          <w:p>
+          <w:p ns2:paraId="0B00F43C">
             <w:pPr>
               <w:keepNext w:val="0"/>
               <w:keepLines w:val="0"/>
@@ -11120,13 +11070,13 @@
           </w:p>
         </w:tc>
       </w:tr>
-      <w:tr>
+      <w:tr ns2:paraId="33258705">
         <w:tc>
           <w:tcPr>
             <w:tcW w:w="641" w:type="dxa"/>
             <w:vAlign w:val="center"/>
           </w:tcPr>
-          <w:p>
+          <w:p ns2:paraId="26735B9D">
             <w:pPr>
               <w:keepNext w:val="0"/>
               <w:keepLines w:val="0"/>
@@ -11157,7 +11107,7 @@
             <w:tcW w:w="1756" w:type="dxa"/>
             <w:vAlign w:val="center"/>
           </w:tcPr>
-          <w:p>
+          <w:p ns2:paraId="18E5DF62">
             <w:pPr>
               <w:keepNext w:val="0"/>
               <w:keepLines w:val="0"/>
@@ -11188,7 +11138,7 @@
             <w:tcW w:w="2626" w:type="dxa"/>
             <w:vAlign w:val="center"/>
           </w:tcPr>
-          <w:p>
+          <w:p ns2:paraId="2EB151C4">
             <w:pPr>
               <w:keepNext w:val="0"/>
               <w:keepLines w:val="0"/>
@@ -11219,7 +11169,7 @@
             <w:tcW w:w="657" w:type="dxa"/>
             <w:vAlign w:val="center"/>
           </w:tcPr>
-          <w:p>
+          <w:p ns2:paraId="0F3D9E59">
             <w:pPr>
               <w:keepNext w:val="0"/>
               <w:keepLines w:val="0"/>
@@ -11250,7 +11200,7 @@
             <w:tcW w:w="778" w:type="dxa"/>
             <w:vAlign w:val="center"/>
           </w:tcPr>
-          <w:p>
+          <w:p ns2:paraId="14123EC1">
             <w:pPr>
               <w:keepNext w:val="0"/>
               <w:keepLines w:val="0"/>
@@ -11280,7 +11230,7 @@
             <w:shd w:val="clear" w:color="auto" w:fill="auto"/>
             <w:vAlign w:val="center"/>
           </w:tcPr>
-          <w:p>
+          <w:p ns2:paraId="78526A6C">
             <w:pPr>
               <w:keepNext w:val="0"/>
               <w:keepLines w:val="0"/>
@@ -11313,7 +11263,7 @@
             <w:tcW w:w="1527" w:type="dxa"/>
             <w:vAlign w:val="center"/>
           </w:tcPr>
-          <w:p>
+          <w:p ns2:paraId="75DCAABE">
             <w:pPr>
               <w:keepNext w:val="0"/>
               <w:keepLines w:val="0"/>
@@ -11330,14 +11280,14 @@
           </w:p>
         </w:tc>
       </w:tr>
-      <w:tr>
+      <w:tr ns2:paraId="75AA574E">
         <w:tc>
           <w:tcPr>
             <w:tcW w:w="8657" w:type="dxa"/>
             <w:gridSpan w:val="7"/>
             <w:vAlign w:val="center"/>
           </w:tcPr>
-          <w:p>
+          <w:p ns2:paraId="7469EF6E">
             <w:pPr>
               <w:keepNext w:val="0"/>
               <w:keepLines w:val="0"/>
@@ -11448,7 +11398,7 @@
         </w:tc>
       </w:tr>
     </w:tbl>
-    <w:p>
+    <w:p ns2:paraId="602562AE">
       <w:pPr>
         <w:pStyle w:val="43"/>
         <w:spacing w:before="0" w:after="120" w:line="360" w:lineRule="auto"/>
@@ -11474,19 +11424,20 @@
         <w:t>备注：1. 金额应明确是否含税；2. 现场服务、第三方资源及超出范围的工作须在备注中说明；3. 本表与正文约定不一致时，以双方最后签署的变更单为准。</w:t>
       </w:r>
     </w:p>
-    <w:p>
+    <w:p ns2:paraId="275EA441">
       <w:pPr>
         <w:rPr>
           <w:rFonts w:hint="eastAsia"/>
         </w:rPr>
       </w:pPr>
     </w:p>
-    <w:p>
+    <w:p ns2:paraId="576EEE52">
       <w:pPr>
         <w:pStyle w:val="18"/>
         <w:rPr>
           <w:rFonts w:hint="eastAsia" w:ascii="黑体" w:eastAsia="黑体"/>
         </w:rPr>
+        <w:pageBreakBefore w:val="1"/>
       </w:pPr>
       <w:r>
         <w:rPr>
@@ -11534,7 +11485,7 @@
         <w:t>清单</w:t>
       </w:r>
     </w:p>
-    <w:p/>
+    <w:p ns2:paraId="58A903DE"/>
     <w:tbl>
       <w:tblPr>
         <w:tblStyle w:val="20"/>
@@ -11562,12 +11513,12 @@
         <w:gridCol w:w="1741"/>
         <w:gridCol w:w="1801"/>
       </w:tblGrid>
-      <w:tr>
+      <w:tr ns2:paraId="1928E77B">
         <w:tc>
           <w:tcPr>
             <w:tcW w:w="1771" w:type="dxa"/>
           </w:tcPr>
-          <w:p>
+          <w:p ns2:paraId="02AA3A57">
             <w:pPr>
               <w:keepNext w:val="0"/>
               <w:keepLines w:val="0"/>
@@ -11606,7 +11557,7 @@
           <w:tcPr>
             <w:tcW w:w="3946" w:type="dxa"/>
           </w:tcPr>
-          <w:p>
+          <w:p ns2:paraId="0203DB11">
             <w:pPr>
               <w:keepNext w:val="0"/>
               <w:keepLines w:val="0"/>
@@ -11637,7 +11588,7 @@
             <w:tcW w:w="1741" w:type="dxa"/>
             <w:vAlign w:val="center"/>
           </w:tcPr>
-          <w:p>
+          <w:p ns2:paraId="37360F60">
             <w:pPr>
               <w:keepNext w:val="0"/>
               <w:keepLines w:val="0"/>
@@ -11668,7 +11619,7 @@
             <w:tcW w:w="1801" w:type="dxa"/>
             <w:vAlign w:val="center"/>
           </w:tcPr>
-          <w:p>
+          <w:p ns2:paraId="20DE4751">
             <w:pPr>
               <w:keepNext w:val="0"/>
               <w:keepLines w:val="0"/>
@@ -11695,13 +11646,13 @@
           </w:p>
         </w:tc>
       </w:tr>
-      <w:tr>
+      <w:tr ns2:paraId="6C7093E7">
         <w:tc>
           <w:tcPr>
             <w:tcW w:w="1771" w:type="dxa"/>
             <w:vAlign w:val="center"/>
           </w:tcPr>
-          <w:p>
+          <w:p ns2:paraId="47F12BEA">
             <w:pPr>
               <w:keepNext w:val="0"/>
               <w:keepLines w:val="0"/>
@@ -11723,7 +11674,7 @@
             <w:tcW w:w="3946" w:type="dxa"/>
             <w:vAlign w:val="center"/>
           </w:tcPr>
-          <w:p>
+          <w:p ns2:paraId="1B543EF1">
             <w:pPr>
               <w:keepNext w:val="0"/>
               <w:keepLines w:val="0"/>
@@ -11744,7 +11695,7 @@
             <w:tcW w:w="1741" w:type="dxa"/>
             <w:vAlign w:val="center"/>
           </w:tcPr>
-          <w:p>
+          <w:p ns2:paraId="74B0DB61">
             <w:pPr>
               <w:keepNext w:val="0"/>
               <w:keepLines w:val="0"/>
@@ -11765,7 +11716,7 @@
             <w:tcW w:w="1801" w:type="dxa"/>
             <w:vAlign w:val="center"/>
           </w:tcPr>
-          <w:p>
+          <w:p ns2:paraId="55705075">
             <w:pPr>
               <w:keepNext w:val="0"/>
               <w:keepLines w:val="0"/>
@@ -11782,13 +11733,13 @@
           </w:p>
         </w:tc>
       </w:tr>
-      <w:tr>
+      <w:tr ns2:paraId="02AD565E">
         <w:tc>
           <w:tcPr>
             <w:tcW w:w="1771" w:type="dxa"/>
             <w:vAlign w:val="center"/>
           </w:tcPr>
-          <w:p>
+          <w:p ns2:paraId="13B31DE7">
             <w:pPr>
               <w:keepNext w:val="0"/>
               <w:keepLines w:val="0"/>
@@ -11810,7 +11761,7 @@
             <w:tcW w:w="3946" w:type="dxa"/>
             <w:vAlign w:val="center"/>
           </w:tcPr>
-          <w:p>
+          <w:p ns2:paraId="20E89686">
             <w:pPr>
               <w:keepNext w:val="0"/>
               <w:keepLines w:val="0"/>
@@ -11832,7 +11783,7 @@
             <w:tcW w:w="1741" w:type="dxa"/>
             <w:vAlign w:val="center"/>
           </w:tcPr>
-          <w:p>
+          <w:p ns2:paraId="53D64EDA">
             <w:pPr>
               <w:keepNext w:val="0"/>
               <w:keepLines w:val="0"/>
@@ -11853,7 +11804,7 @@
             <w:tcW w:w="1801" w:type="dxa"/>
             <w:vAlign w:val="center"/>
           </w:tcPr>
-          <w:p>
+          <w:p ns2:paraId="3ADB937E">
             <w:pPr>
               <w:keepNext w:val="0"/>
               <w:keepLines w:val="0"/>
@@ -11870,13 +11821,13 @@
           </w:p>
         </w:tc>
       </w:tr>
-      <w:tr>
+      <w:tr ns2:paraId="0D279830">
         <w:tc>
           <w:tcPr>
             <w:tcW w:w="1771" w:type="dxa"/>
             <w:vAlign w:val="center"/>
           </w:tcPr>
-          <w:p>
+          <w:p ns2:paraId="040E4FFB">
             <w:pPr>
               <w:keepNext w:val="0"/>
               <w:keepLines w:val="0"/>
@@ -11898,7 +11849,7 @@
             <w:tcW w:w="3946" w:type="dxa"/>
             <w:vAlign w:val="center"/>
           </w:tcPr>
-          <w:p>
+          <w:p ns2:paraId="01EB3A3B">
             <w:pPr>
               <w:keepNext w:val="0"/>
               <w:keepLines w:val="0"/>
@@ -11919,7 +11870,7 @@
             <w:tcW w:w="1741" w:type="dxa"/>
             <w:vAlign w:val="center"/>
           </w:tcPr>
-          <w:p>
+          <w:p ns2:paraId="3F18B465">
             <w:pPr>
               <w:keepNext w:val="0"/>
               <w:keepLines w:val="0"/>
@@ -11940,7 +11891,7 @@
             <w:tcW w:w="1801" w:type="dxa"/>
             <w:vAlign w:val="center"/>
           </w:tcPr>
-          <w:p>
+          <w:p ns2:paraId="428C4431">
             <w:pPr>
               <w:keepNext w:val="0"/>
               <w:keepLines w:val="0"/>
@@ -11957,20 +11908,20 @@
           </w:p>
         </w:tc>
       </w:tr>
-      <w:tr>
+      <w:tr ns2:paraId="1BDF03D5">
         <w:tc>
           <w:tcPr>
             <w:tcW w:w="1771" w:type="dxa"/>
             <w:vAlign w:val="center"/>
           </w:tcPr>
-          <w:p>
+          <w:p ns2:paraId="3F25A9ED">
             <w:pPr>
               <w:keepNext w:val="0"/>
               <w:keepLines w:val="0"/>
               <w:suppressLineNumbers w:val="0"/>
               <w:spacing w:before="0" w:beforeAutospacing="0" w:after="0" w:afterAutospacing="0" w:line="440" w:lineRule="exact"/>
               <w:ind w:left="0" w:leftChars="0" w:right="0" w:firstLine="0" w:firstLineChars="0"/>
-              <w:jc w:val="left"/>
+              <w:jc w:val="center"/>
               <w:rPr>
                 <w:rFonts w:hint="eastAsia" w:ascii="宋体" w:hAnsi="宋体" w:eastAsia="宋体" w:cs="宋体"/>
                 <w:sz w:val="21"/>
@@ -11984,7 +11935,7 @@
             <w:tcW w:w="3946" w:type="dxa"/>
             <w:vAlign w:val="center"/>
           </w:tcPr>
-          <w:p>
+          <w:p ns2:paraId="0B90A4B1">
             <w:pPr>
               <w:keepNext w:val="0"/>
               <w:keepLines w:val="0"/>
@@ -12005,14 +11956,14 @@
             <w:tcW w:w="1741" w:type="dxa"/>
             <w:vAlign w:val="center"/>
           </w:tcPr>
-          <w:p>
+          <w:p ns2:paraId="29D64C2B">
             <w:pPr>
               <w:keepNext w:val="0"/>
               <w:keepLines w:val="0"/>
               <w:suppressLineNumbers w:val="0"/>
               <w:spacing w:before="0" w:beforeAutospacing="0" w:after="0" w:afterAutospacing="0" w:line="440" w:lineRule="exact"/>
               <w:ind w:left="0" w:leftChars="0" w:right="0" w:firstLine="0" w:firstLineChars="0"/>
-              <w:jc w:val="right"/>
+              <w:jc w:val="center"/>
               <w:rPr>
                 <w:rFonts w:hint="eastAsia" w:ascii="宋体" w:hAnsi="宋体" w:eastAsia="宋体" w:cs="宋体"/>
                 <w:sz w:val="21"/>
@@ -12026,14 +11977,14 @@
             <w:tcW w:w="1801" w:type="dxa"/>
             <w:vAlign w:val="center"/>
           </w:tcPr>
-          <w:p>
+          <w:p ns2:paraId="06BFD738">
             <w:pPr>
               <w:keepNext w:val="0"/>
               <w:keepLines w:val="0"/>
               <w:suppressLineNumbers w:val="0"/>
               <w:spacing w:before="0" w:beforeAutospacing="0" w:after="0" w:afterAutospacing="0" w:line="440" w:lineRule="exact"/>
               <w:ind w:left="0" w:leftChars="0" w:right="0" w:firstLine="0" w:firstLineChars="0"/>
-              <w:jc w:val="right"/>
+              <w:jc w:val="center"/>
               <w:rPr>
                 <w:rFonts w:hint="eastAsia" w:ascii="宋体" w:hAnsi="宋体" w:eastAsia="宋体" w:cs="宋体"/>
                 <w:sz w:val="21"/>
@@ -12044,7 +11995,7 @@
         </w:tc>
       </w:tr>
     </w:tbl>
-    <w:p>
+    <w:p ns2:paraId="7DFED8F2">
       <w:pPr>
         <w:pStyle w:val="43"/>
         <w:keepNext w:val="0"/>
@@ -12087,7 +12038,7 @@
         <w:t>项目负责人及确认方式：甲方负责人______________；乙方负责人______________；日常确认渠道：□邮件  □工单  □项目管理工具  □其他：________________。</w:t>
       </w:r>
     </w:p>
-    <w:p>
+    <w:p ns2:paraId="030D83EB">
       <w:pPr>
         <w:pStyle w:val="43"/>
         <w:keepNext w:val="0"/>
@@ -12130,9 +12081,10 @@
         <w:t>本附件经双方授权代表签署后生效，与本合同正文具有同等法律效力。</w:t>
       </w:r>
     </w:p>
-    <w:p>
+    <w:p ns2:paraId="48D41C35">
       <w:pPr>
         <w:pStyle w:val="18"/>
+        <w:pageBreakBefore w:val="1"/>
       </w:pPr>
       <w:r>
         <w:rPr>
@@ -12174,7 +12126,7 @@
         <w:gridCol w:w="1434"/>
         <w:gridCol w:w="1434"/>
       </w:tblGrid>
-      <w:tr>
+      <w:tr ns2:paraId="5E58FA3A">
         <w:trPr>
           <w:trHeight w:val="482" w:hRule="atLeast"/>
           <w:jc w:val="center"/>
@@ -12190,7 +12142,7 @@
             </w:tcMar>
             <w:vAlign w:val="center"/>
           </w:tcPr>
-          <w:p>
+          <w:p ns2:paraId="12298C80">
             <w:pPr>
               <w:keepNext w:val="0"/>
               <w:keepLines w:val="0"/>
@@ -12201,11 +12153,11 @@
               <w:rPr>
                 <w:rFonts w:hint="eastAsia" w:ascii="宋体" w:hAnsi="宋体" w:eastAsia="宋体" w:cs="宋体"/>
                 <w:color w:val="000000" w:themeColor="text1"/>
-                <w14:textFill>
-                  <w14:solidFill>
-                    <w14:schemeClr w14:val="tx1"/>
-                  </w14:solidFill>
-                </w14:textFill>
+                <ns2:textFill>
+                  <ns2:solidFill>
+                    <ns2:schemeClr ns2:val="tx1"/>
+                  </ns2:solidFill>
+                </ns2:textFill>
               </w:rPr>
             </w:pPr>
             <w:r>
@@ -12214,11 +12166,11 @@
                 <w:b w:val="0"/>
                 <w:color w:val="000000" w:themeColor="text1"/>
                 <w:sz w:val="24"/>
-                <w14:textFill>
-                  <w14:solidFill>
-                    <w14:schemeClr w14:val="tx1"/>
-                  </w14:solidFill>
-                </w14:textFill>
+                <ns2:textFill>
+                  <ns2:solidFill>
+                    <ns2:schemeClr ns2:val="tx1"/>
+                  </ns2:solidFill>
+                </ns2:textFill>
               </w:rPr>
               <w:t>软件名称</w:t>
             </w:r>
@@ -12235,7 +12187,7 @@
             </w:tcMar>
             <w:vAlign w:val="center"/>
           </w:tcPr>
-          <w:p>
+          <w:p ns2:paraId="65044C7C">
             <w:pPr>
               <w:keepNext w:val="0"/>
               <w:keepLines w:val="0"/>
@@ -12247,11 +12199,11 @@
                 <w:rFonts w:hint="eastAsia" w:ascii="宋体" w:hAnsi="宋体" w:eastAsia="宋体" w:cs="宋体"/>
                 <w:color w:val="000000" w:themeColor="text1"/>
                 <w:lang w:eastAsia="zh-CN"/>
-                <w14:textFill>
-                  <w14:solidFill>
-                    <w14:schemeClr w14:val="tx1"/>
-                  </w14:solidFill>
-                </w14:textFill>
+                <ns2:textFill>
+                  <ns2:solidFill>
+                    <ns2:schemeClr ns2:val="tx1"/>
+                  </ns2:solidFill>
+                </ns2:textFill>
               </w:rPr>
             </w:pPr>
             <w:r>
@@ -12261,11 +12213,11 @@
                 <w:color w:val="000000" w:themeColor="text1"/>
                 <w:sz w:val="22"/>
                 <w:lang w:val="en-US" w:eastAsia="zh-CN"/>
-                <w14:textFill>
-                  <w14:solidFill>
-                    <w14:schemeClr w14:val="tx1"/>
-                  </w14:solidFill>
-                </w14:textFill>
+                <ns2:textFill>
+                  <ns2:solidFill>
+                    <ns2:schemeClr ns2:val="tx1"/>
+                  </ns2:solidFill>
+                </ns2:textFill>
               </w:rPr>
               <w:t>FastGPT</w:t>
             </w:r>
@@ -12283,7 +12235,7 @@
             </w:tcMar>
             <w:vAlign w:val="center"/>
           </w:tcPr>
-          <w:p>
+          <w:p ns2:paraId="691C3D0F">
             <w:pPr>
               <w:keepNext w:val="0"/>
               <w:keepLines w:val="0"/>
@@ -12294,11 +12246,11 @@
               <w:rPr>
                 <w:rFonts w:hint="eastAsia" w:ascii="宋体" w:hAnsi="宋体" w:eastAsia="宋体" w:cs="宋体"/>
                 <w:color w:val="000000" w:themeColor="text1"/>
-                <w14:textFill>
-                  <w14:solidFill>
-                    <w14:schemeClr w14:val="tx1"/>
-                  </w14:solidFill>
-                </w14:textFill>
+                <ns2:textFill>
+                  <ns2:solidFill>
+                    <ns2:schemeClr ns2:val="tx1"/>
+                  </ns2:solidFill>
+                </ns2:textFill>
               </w:rPr>
             </w:pPr>
             <w:r>
@@ -12307,11 +12259,11 @@
                 <w:b w:val="0"/>
                 <w:color w:val="000000" w:themeColor="text1"/>
                 <w:sz w:val="24"/>
-                <w14:textFill>
-                  <w14:solidFill>
-                    <w14:schemeClr w14:val="tx1"/>
-                  </w14:solidFill>
-                </w14:textFill>
+                <ns2:textFill>
+                  <ns2:solidFill>
+                    <ns2:schemeClr ns2:val="tx1"/>
+                  </ns2:solidFill>
+                </ns2:textFill>
               </w:rPr>
               <w:t>合同编号</w:t>
             </w:r>
@@ -12329,7 +12281,7 @@
             </w:tcMar>
             <w:vAlign w:val="center"/>
           </w:tcPr>
-          <w:p>
+          <w:p ns2:paraId="04A13D75">
             <w:pPr>
               <w:keepNext w:val="0"/>
               <w:keepLines w:val="0"/>
@@ -12340,11 +12292,11 @@
               <w:rPr>
                 <w:rFonts w:hint="eastAsia" w:ascii="宋体" w:hAnsi="宋体" w:eastAsia="宋体" w:cs="宋体"/>
                 <w:color w:val="000000" w:themeColor="text1"/>
-                <w14:textFill>
-                  <w14:solidFill>
-                    <w14:schemeClr w14:val="tx1"/>
-                  </w14:solidFill>
-                </w14:textFill>
+                <ns2:textFill>
+                  <ns2:solidFill>
+                    <ns2:schemeClr ns2:val="tx1"/>
+                  </ns2:solidFill>
+                </ns2:textFill>
               </w:rPr>
             </w:pPr>
             <w:r>
@@ -12353,18 +12305,18 @@
                 <w:b w:val="0"/>
                 <w:color w:val="000000" w:themeColor="text1"/>
                 <w:sz w:val="22"/>
-                <w14:textFill>
-                  <w14:solidFill>
-                    <w14:schemeClr w14:val="tx1"/>
-                  </w14:solidFill>
-                </w14:textFill>
+                <ns2:textFill>
+                  <ns2:solidFill>
+                    <ns2:schemeClr ns2:val="tx1"/>
+                  </ns2:solidFill>
+                </ns2:textFill>
               </w:rPr>
               <w:t>【填写合同编号】</w:t>
             </w:r>
           </w:p>
         </w:tc>
       </w:tr>
-      <w:tr>
+      <w:tr ns2:paraId="565FFC6E">
         <w:trPr>
           <w:trHeight w:val="482" w:hRule="atLeast"/>
           <w:jc w:val="center"/>
@@ -12380,7 +12332,7 @@
             </w:tcMar>
             <w:vAlign w:val="center"/>
           </w:tcPr>
-          <w:p>
+          <w:p ns2:paraId="55FB4561">
             <w:pPr>
               <w:keepNext w:val="0"/>
               <w:keepLines w:val="0"/>
@@ -12392,11 +12344,11 @@
                 <w:rFonts w:hint="eastAsia" w:ascii="宋体" w:hAnsi="宋体" w:eastAsia="宋体" w:cs="宋体"/>
                 <w:color w:val="000000" w:themeColor="text1"/>
                 <w:lang w:val="en-US" w:eastAsia="zh-CN"/>
-                <w14:textFill>
-                  <w14:solidFill>
-                    <w14:schemeClr w14:val="tx1"/>
-                  </w14:solidFill>
-                </w14:textFill>
+                <ns2:textFill>
+                  <ns2:solidFill>
+                    <ns2:schemeClr ns2:val="tx1"/>
+                  </ns2:solidFill>
+                </ns2:textFill>
               </w:rPr>
             </w:pPr>
             <w:r>
@@ -12406,11 +12358,11 @@
                 <w:color w:val="000000" w:themeColor="text1"/>
                 <w:sz w:val="24"/>
                 <w:lang w:val="en-US" w:eastAsia="zh-CN"/>
-                <w14:textFill>
-                  <w14:solidFill>
-                    <w14:schemeClr w14:val="tx1"/>
-                  </w14:solidFill>
-                </w14:textFill>
+                <ns2:textFill>
+                  <ns2:solidFill>
+                    <ns2:schemeClr ns2:val="tx1"/>
+                  </ns2:solidFill>
+                </ns2:textFill>
               </w:rPr>
               <w:t>委托方</w:t>
             </w:r>
@@ -12427,7 +12379,7 @@
             </w:tcMar>
             <w:vAlign w:val="center"/>
           </w:tcPr>
-          <w:p>
+          <w:p ns2:paraId="522B6195">
             <w:pPr>
               <w:keepNext w:val="0"/>
               <w:keepLines w:val="0"/>
@@ -12438,11 +12390,11 @@
               <w:rPr>
                 <w:rFonts w:hint="eastAsia" w:ascii="宋体" w:hAnsi="宋体" w:eastAsia="宋体" w:cs="宋体"/>
                 <w:color w:val="000000" w:themeColor="text1"/>
-                <w14:textFill>
-                  <w14:solidFill>
-                    <w14:schemeClr w14:val="tx1"/>
-                  </w14:solidFill>
-                </w14:textFill>
+                <ns2:textFill>
+                  <ns2:solidFill>
+                    <ns2:schemeClr ns2:val="tx1"/>
+                  </ns2:solidFill>
+                </ns2:textFill>
               </w:rPr>
             </w:pPr>
             <w:r>
@@ -12451,11 +12403,11 @@
                 <w:b w:val="0"/>
                 <w:color w:val="000000" w:themeColor="text1"/>
                 <w:sz w:val="22"/>
-                <w14:textFill>
-                  <w14:solidFill>
-                    <w14:schemeClr w14:val="tx1"/>
-                  </w14:solidFill>
-                </w14:textFill>
+                <ns2:textFill>
+                  <ns2:solidFill>
+                    <ns2:schemeClr ns2:val="tx1"/>
+                  </ns2:solidFill>
+                </ns2:textFill>
               </w:rPr>
               <w:t>【填写</w:t>
             </w:r>
@@ -12466,11 +12418,11 @@
                 <w:color w:val="000000" w:themeColor="text1"/>
                 <w:sz w:val="22"/>
                 <w:lang w:val="en-US" w:eastAsia="zh-CN"/>
-                <w14:textFill>
-                  <w14:solidFill>
-                    <w14:schemeClr w14:val="tx1"/>
-                  </w14:solidFill>
-                </w14:textFill>
+                <ns2:textFill>
+                  <ns2:solidFill>
+                    <ns2:schemeClr ns2:val="tx1"/>
+                  </ns2:solidFill>
+                </ns2:textFill>
               </w:rPr>
               <w:t>甲方公司</w:t>
             </w:r>
@@ -12480,11 +12432,11 @@
                 <w:b w:val="0"/>
                 <w:color w:val="000000" w:themeColor="text1"/>
                 <w:sz w:val="22"/>
-                <w14:textFill>
-                  <w14:solidFill>
-                    <w14:schemeClr w14:val="tx1"/>
-                  </w14:solidFill>
-                </w14:textFill>
+                <ns2:textFill>
+                  <ns2:solidFill>
+                    <ns2:schemeClr ns2:val="tx1"/>
+                  </ns2:solidFill>
+                </ns2:textFill>
               </w:rPr>
               <w:t>】</w:t>
             </w:r>
@@ -12502,7 +12454,7 @@
             </w:tcMar>
             <w:vAlign w:val="center"/>
           </w:tcPr>
-          <w:p>
+          <w:p ns2:paraId="4A060432">
             <w:pPr>
               <w:keepNext w:val="0"/>
               <w:keepLines w:val="0"/>
@@ -12513,11 +12465,11 @@
               <w:rPr>
                 <w:rFonts w:hint="eastAsia" w:ascii="宋体" w:hAnsi="宋体" w:eastAsia="宋体" w:cs="宋体"/>
                 <w:color w:val="000000" w:themeColor="text1"/>
-                <w14:textFill>
-                  <w14:solidFill>
-                    <w14:schemeClr w14:val="tx1"/>
-                  </w14:solidFill>
-                </w14:textFill>
+                <ns2:textFill>
+                  <ns2:solidFill>
+                    <ns2:schemeClr ns2:val="tx1"/>
+                  </ns2:solidFill>
+                </ns2:textFill>
               </w:rPr>
             </w:pPr>
             <w:r>
@@ -12526,11 +12478,11 @@
                 <w:b w:val="0"/>
                 <w:color w:val="000000" w:themeColor="text1"/>
                 <w:sz w:val="24"/>
-                <w14:textFill>
-                  <w14:solidFill>
-                    <w14:schemeClr w14:val="tx1"/>
-                  </w14:solidFill>
-                </w14:textFill>
+                <ns2:textFill>
+                  <ns2:solidFill>
+                    <ns2:schemeClr ns2:val="tx1"/>
+                  </ns2:solidFill>
+                </ns2:textFill>
               </w:rPr>
               <w:t>项目负责人</w:t>
             </w:r>
@@ -12548,7 +12500,7 @@
             </w:tcMar>
             <w:vAlign w:val="center"/>
           </w:tcPr>
-          <w:p>
+          <w:p ns2:paraId="4273F718">
             <w:pPr>
               <w:keepNext w:val="0"/>
               <w:keepLines w:val="0"/>
@@ -12559,11 +12511,11 @@
               <w:rPr>
                 <w:rFonts w:hint="eastAsia" w:ascii="宋体" w:hAnsi="宋体" w:eastAsia="宋体" w:cs="宋体"/>
                 <w:color w:val="000000" w:themeColor="text1"/>
-                <w14:textFill>
-                  <w14:solidFill>
-                    <w14:schemeClr w14:val="tx1"/>
-                  </w14:solidFill>
-                </w14:textFill>
+                <ns2:textFill>
+                  <ns2:solidFill>
+                    <ns2:schemeClr ns2:val="tx1"/>
+                  </ns2:solidFill>
+                </ns2:textFill>
               </w:rPr>
             </w:pPr>
             <w:r>
@@ -12572,18 +12524,18 @@
                 <w:b w:val="0"/>
                 <w:color w:val="000000" w:themeColor="text1"/>
                 <w:sz w:val="22"/>
-                <w14:textFill>
-                  <w14:solidFill>
-                    <w14:schemeClr w14:val="tx1"/>
-                  </w14:solidFill>
-                </w14:textFill>
+                <ns2:textFill>
+                  <ns2:solidFill>
+                    <ns2:schemeClr ns2:val="tx1"/>
+                  </ns2:solidFill>
+                </ns2:textFill>
               </w:rPr>
               <w:t>【填写负责人】</w:t>
             </w:r>
           </w:p>
         </w:tc>
       </w:tr>
-      <w:tr>
+      <w:tr ns2:paraId="79C64218">
         <w:trPr>
           <w:trHeight w:val="482" w:hRule="atLeast"/>
           <w:jc w:val="center"/>
@@ -12599,7 +12551,7 @@
             </w:tcMar>
             <w:vAlign w:val="center"/>
           </w:tcPr>
-          <w:p>
+          <w:p ns2:paraId="01E90749">
             <w:pPr>
               <w:keepNext w:val="0"/>
               <w:keepLines w:val="0"/>
@@ -12610,11 +12562,11 @@
               <w:rPr>
                 <w:rFonts w:hint="eastAsia" w:ascii="宋体" w:hAnsi="宋体" w:eastAsia="宋体" w:cs="宋体"/>
                 <w:color w:val="000000" w:themeColor="text1"/>
-                <w14:textFill>
-                  <w14:solidFill>
-                    <w14:schemeClr w14:val="tx1"/>
-                  </w14:solidFill>
-                </w14:textFill>
+                <ns2:textFill>
+                  <ns2:solidFill>
+                    <ns2:schemeClr ns2:val="tx1"/>
+                  </ns2:solidFill>
+                </ns2:textFill>
               </w:rPr>
             </w:pPr>
             <w:r>
@@ -12623,11 +12575,11 @@
                 <w:b w:val="0"/>
                 <w:color w:val="000000" w:themeColor="text1"/>
                 <w:sz w:val="24"/>
-                <w14:textFill>
-                  <w14:solidFill>
-                    <w14:schemeClr w14:val="tx1"/>
-                  </w14:solidFill>
-                </w14:textFill>
+                <ns2:textFill>
+                  <ns2:solidFill>
+                    <ns2:schemeClr ns2:val="tx1"/>
+                  </ns2:solidFill>
+                </ns2:textFill>
               </w:rPr>
               <w:t>数量（单位）</w:t>
             </w:r>
@@ -12644,7 +12596,7 @@
             </w:tcMar>
             <w:vAlign w:val="center"/>
           </w:tcPr>
-          <w:p>
+          <w:p ns2:paraId="6AEF02F9">
             <w:pPr>
               <w:keepNext w:val="0"/>
               <w:keepLines w:val="0"/>
@@ -12655,11 +12607,11 @@
               <w:rPr>
                 <w:rFonts w:hint="eastAsia" w:ascii="宋体" w:hAnsi="宋体" w:eastAsia="宋体" w:cs="宋体"/>
                 <w:color w:val="000000" w:themeColor="text1"/>
-                <w14:textFill>
-                  <w14:solidFill>
-                    <w14:schemeClr w14:val="tx1"/>
-                  </w14:solidFill>
-                </w14:textFill>
+                <ns2:textFill>
+                  <ns2:solidFill>
+                    <ns2:schemeClr ns2:val="tx1"/>
+                  </ns2:solidFill>
+                </ns2:textFill>
               </w:rPr>
             </w:pPr>
             <w:r>
@@ -12668,11 +12620,11 @@
                 <w:b w:val="0"/>
                 <w:color w:val="000000" w:themeColor="text1"/>
                 <w:sz w:val="22"/>
-                <w14:textFill>
-                  <w14:solidFill>
-                    <w14:schemeClr w14:val="tx1"/>
-                  </w14:solidFill>
-                </w14:textFill>
+                <ns2:textFill>
+                  <ns2:solidFill>
+                    <ns2:schemeClr ns2:val="tx1"/>
+                  </ns2:solidFill>
+                </ns2:textFill>
               </w:rPr>
               <w:t>【填写数量】</w:t>
             </w:r>
@@ -12690,7 +12642,7 @@
             </w:tcMar>
             <w:vAlign w:val="center"/>
           </w:tcPr>
-          <w:p>
+          <w:p ns2:paraId="67F5503C">
             <w:pPr>
               <w:keepNext w:val="0"/>
               <w:keepLines w:val="0"/>
@@ -12701,11 +12653,11 @@
               <w:rPr>
                 <w:rFonts w:hint="eastAsia" w:ascii="宋体" w:hAnsi="宋体" w:eastAsia="宋体" w:cs="宋体"/>
                 <w:color w:val="000000" w:themeColor="text1"/>
-                <w14:textFill>
-                  <w14:solidFill>
-                    <w14:schemeClr w14:val="tx1"/>
-                  </w14:solidFill>
-                </w14:textFill>
+                <ns2:textFill>
+                  <ns2:solidFill>
+                    <ns2:schemeClr ns2:val="tx1"/>
+                  </ns2:solidFill>
+                </ns2:textFill>
               </w:rPr>
             </w:pPr>
             <w:r>
@@ -12714,11 +12666,11 @@
                 <w:b w:val="0"/>
                 <w:color w:val="000000" w:themeColor="text1"/>
                 <w:sz w:val="22"/>
-                <w14:textFill>
-                  <w14:solidFill>
-                    <w14:schemeClr w14:val="tx1"/>
-                  </w14:solidFill>
-                </w14:textFill>
+                <ns2:textFill>
+                  <ns2:solidFill>
+                    <ns2:schemeClr ns2:val="tx1"/>
+                  </ns2:solidFill>
+                </ns2:textFill>
               </w:rPr>
               <w:t>合同签订日期</w:t>
             </w:r>
@@ -12736,7 +12688,7 @@
             </w:tcMar>
             <w:vAlign w:val="center"/>
           </w:tcPr>
-          <w:p>
+          <w:p ns2:paraId="738E450C">
             <w:pPr>
               <w:keepNext w:val="0"/>
               <w:keepLines w:val="0"/>
@@ -12747,11 +12699,11 @@
               <w:rPr>
                 <w:rFonts w:hint="eastAsia" w:ascii="宋体" w:hAnsi="宋体" w:eastAsia="宋体" w:cs="宋体"/>
                 <w:color w:val="000000" w:themeColor="text1"/>
-                <w14:textFill>
-                  <w14:solidFill>
-                    <w14:schemeClr w14:val="tx1"/>
-                  </w14:solidFill>
-                </w14:textFill>
+                <ns2:textFill>
+                  <ns2:solidFill>
+                    <ns2:schemeClr ns2:val="tx1"/>
+                  </ns2:solidFill>
+                </ns2:textFill>
               </w:rPr>
             </w:pPr>
             <w:r>
@@ -12760,18 +12712,18 @@
                 <w:b w:val="0"/>
                 <w:color w:val="000000" w:themeColor="text1"/>
                 <w:sz w:val="22"/>
-                <w14:textFill>
-                  <w14:solidFill>
-                    <w14:schemeClr w14:val="tx1"/>
-                  </w14:solidFill>
-                </w14:textFill>
+                <ns2:textFill>
+                  <ns2:solidFill>
+                    <ns2:schemeClr ns2:val="tx1"/>
+                  </ns2:solidFill>
+                </ns2:textFill>
               </w:rPr>
               <w:t>【填写日期】</w:t>
             </w:r>
           </w:p>
         </w:tc>
       </w:tr>
-      <w:tr>
+      <w:tr ns2:paraId="3D9ADD71">
         <w:trPr>
           <w:trHeight w:val="482" w:hRule="atLeast"/>
           <w:jc w:val="center"/>
@@ -12787,7 +12739,7 @@
             </w:tcMar>
             <w:vAlign w:val="center"/>
           </w:tcPr>
-          <w:p>
+          <w:p ns2:paraId="0FD59C85">
             <w:pPr>
               <w:keepNext w:val="0"/>
               <w:keepLines w:val="0"/>
@@ -12798,11 +12750,11 @@
               <w:rPr>
                 <w:rFonts w:hint="eastAsia" w:ascii="宋体" w:hAnsi="宋体" w:eastAsia="宋体" w:cs="宋体"/>
                 <w:color w:val="000000" w:themeColor="text1"/>
-                <w14:textFill>
-                  <w14:solidFill>
-                    <w14:schemeClr w14:val="tx1"/>
-                  </w14:solidFill>
-                </w14:textFill>
+                <ns2:textFill>
+                  <ns2:solidFill>
+                    <ns2:schemeClr ns2:val="tx1"/>
+                  </ns2:solidFill>
+                </ns2:textFill>
               </w:rPr>
             </w:pPr>
             <w:r>
@@ -12811,11 +12763,11 @@
                 <w:b w:val="0"/>
                 <w:color w:val="000000" w:themeColor="text1"/>
                 <w:sz w:val="24"/>
-                <w14:textFill>
-                  <w14:solidFill>
-                    <w14:schemeClr w14:val="tx1"/>
-                  </w14:solidFill>
-                </w14:textFill>
+                <ns2:textFill>
+                  <ns2:solidFill>
+                    <ns2:schemeClr ns2:val="tx1"/>
+                  </ns2:solidFill>
+                </ns2:textFill>
               </w:rPr>
               <w:t>安装日期</w:t>
             </w:r>
@@ -12832,7 +12784,7 @@
             </w:tcMar>
             <w:vAlign w:val="center"/>
           </w:tcPr>
-          <w:p>
+          <w:p ns2:paraId="67C5A7D8">
             <w:pPr>
               <w:keepNext w:val="0"/>
               <w:keepLines w:val="0"/>
@@ -12843,11 +12795,11 @@
               <w:rPr>
                 <w:rFonts w:hint="eastAsia" w:ascii="宋体" w:hAnsi="宋体" w:eastAsia="宋体" w:cs="宋体"/>
                 <w:color w:val="000000" w:themeColor="text1"/>
-                <w14:textFill>
-                  <w14:solidFill>
-                    <w14:schemeClr w14:val="tx1"/>
-                  </w14:solidFill>
-                </w14:textFill>
+                <ns2:textFill>
+                  <ns2:solidFill>
+                    <ns2:schemeClr ns2:val="tx1"/>
+                  </ns2:solidFill>
+                </ns2:textFill>
               </w:rPr>
             </w:pPr>
             <w:r>
@@ -12856,11 +12808,11 @@
                 <w:b w:val="0"/>
                 <w:color w:val="000000" w:themeColor="text1"/>
                 <w:sz w:val="22"/>
-                <w14:textFill>
-                  <w14:solidFill>
-                    <w14:schemeClr w14:val="tx1"/>
-                  </w14:solidFill>
-                </w14:textFill>
+                <ns2:textFill>
+                  <ns2:solidFill>
+                    <ns2:schemeClr ns2:val="tx1"/>
+                  </ns2:solidFill>
+                </ns2:textFill>
               </w:rPr>
               <w:t>【填写日期】</w:t>
             </w:r>
@@ -12878,7 +12830,7 @@
             </w:tcMar>
             <w:vAlign w:val="center"/>
           </w:tcPr>
-          <w:p>
+          <w:p ns2:paraId="77EC9D1C">
             <w:pPr>
               <w:keepNext w:val="0"/>
               <w:keepLines w:val="0"/>
@@ -12889,11 +12841,11 @@
               <w:rPr>
                 <w:rFonts w:hint="eastAsia" w:ascii="宋体" w:hAnsi="宋体" w:eastAsia="宋体" w:cs="宋体"/>
                 <w:color w:val="000000" w:themeColor="text1"/>
-                <w14:textFill>
-                  <w14:solidFill>
-                    <w14:schemeClr w14:val="tx1"/>
-                  </w14:solidFill>
-                </w14:textFill>
+                <ns2:textFill>
+                  <ns2:solidFill>
+                    <ns2:schemeClr ns2:val="tx1"/>
+                  </ns2:solidFill>
+                </ns2:textFill>
               </w:rPr>
             </w:pPr>
             <w:r>
@@ -12902,11 +12854,11 @@
                 <w:b w:val="0"/>
                 <w:color w:val="000000" w:themeColor="text1"/>
                 <w:sz w:val="24"/>
-                <w14:textFill>
-                  <w14:solidFill>
-                    <w14:schemeClr w14:val="tx1"/>
-                  </w14:solidFill>
-                </w14:textFill>
+                <ns2:textFill>
+                  <ns2:solidFill>
+                    <ns2:schemeClr ns2:val="tx1"/>
+                  </ns2:solidFill>
+                </ns2:textFill>
               </w:rPr>
               <w:t>验收日期</w:t>
             </w:r>
@@ -12924,7 +12876,7 @@
             </w:tcMar>
             <w:vAlign w:val="center"/>
           </w:tcPr>
-          <w:p>
+          <w:p ns2:paraId="760B1D3F">
             <w:pPr>
               <w:keepNext w:val="0"/>
               <w:keepLines w:val="0"/>
@@ -12935,11 +12887,11 @@
               <w:rPr>
                 <w:rFonts w:hint="eastAsia" w:ascii="宋体" w:hAnsi="宋体" w:eastAsia="宋体" w:cs="宋体"/>
                 <w:color w:val="000000" w:themeColor="text1"/>
-                <w14:textFill>
-                  <w14:solidFill>
-                    <w14:schemeClr w14:val="tx1"/>
-                  </w14:solidFill>
-                </w14:textFill>
+                <ns2:textFill>
+                  <ns2:solidFill>
+                    <ns2:schemeClr ns2:val="tx1"/>
+                  </ns2:solidFill>
+                </ns2:textFill>
               </w:rPr>
             </w:pPr>
             <w:r>
@@ -12948,18 +12900,18 @@
                 <w:b w:val="0"/>
                 <w:color w:val="000000" w:themeColor="text1"/>
                 <w:sz w:val="22"/>
-                <w14:textFill>
-                  <w14:solidFill>
-                    <w14:schemeClr w14:val="tx1"/>
-                  </w14:solidFill>
-                </w14:textFill>
+                <ns2:textFill>
+                  <ns2:solidFill>
+                    <ns2:schemeClr ns2:val="tx1"/>
+                  </ns2:solidFill>
+                </ns2:textFill>
               </w:rPr>
               <w:t>【填写日期】</w:t>
             </w:r>
           </w:p>
         </w:tc>
       </w:tr>
-      <w:tr>
+      <w:tr ns2:paraId="79B1DE8A">
         <w:trPr>
           <w:trHeight w:val="482" w:hRule="atLeast"/>
           <w:jc w:val="center"/>
@@ -12975,7 +12927,7 @@
             </w:tcMar>
             <w:vAlign w:val="center"/>
           </w:tcPr>
-          <w:p>
+          <w:p ns2:paraId="3E80F8C1">
             <w:pPr>
               <w:keepNext w:val="0"/>
               <w:keepLines w:val="0"/>
@@ -12989,11 +12941,11 @@
                 <w:sz w:val="24"/>
                 <w:szCs w:val="24"/>
                 <w:lang w:val="en-US" w:eastAsia="zh-CN"/>
-                <w14:textFill>
-                  <w14:solidFill>
-                    <w14:schemeClr w14:val="tx1"/>
-                  </w14:solidFill>
-                </w14:textFill>
+                <ns2:textFill>
+                  <ns2:solidFill>
+                    <ns2:schemeClr ns2:val="tx1"/>
+                  </ns2:solidFill>
+                </ns2:textFill>
               </w:rPr>
             </w:pPr>
             <w:r>
@@ -13003,11 +12955,11 @@
                 <w:sz w:val="24"/>
                 <w:szCs w:val="24"/>
                 <w:lang w:val="en-US" w:eastAsia="zh-CN"/>
-                <w14:textFill>
-                  <w14:solidFill>
-                    <w14:schemeClr w14:val="tx1"/>
-                  </w14:solidFill>
-                </w14:textFill>
+                <ns2:textFill>
+                  <ns2:solidFill>
+                    <ns2:schemeClr ns2:val="tx1"/>
+                  </ns2:solidFill>
+                </ns2:textFill>
               </w:rPr>
               <w:t>服务方</w:t>
             </w:r>
@@ -13024,7 +12976,7 @@
             </w:tcMar>
             <w:vAlign w:val="center"/>
           </w:tcPr>
-          <w:p>
+          <w:p ns2:paraId="663489BD">
             <w:pPr>
               <w:keepNext w:val="0"/>
               <w:keepLines w:val="0"/>
@@ -13035,11 +12987,11 @@
               <w:rPr>
                 <w:rFonts w:hint="eastAsia" w:ascii="宋体" w:hAnsi="宋体" w:eastAsia="宋体" w:cs="宋体"/>
                 <w:color w:val="000000" w:themeColor="text1"/>
-                <w14:textFill>
-                  <w14:solidFill>
-                    <w14:schemeClr w14:val="tx1"/>
-                  </w14:solidFill>
-                </w14:textFill>
+                <ns2:textFill>
+                  <ns2:solidFill>
+                    <ns2:schemeClr ns2:val="tx1"/>
+                  </ns2:solidFill>
+                </ns2:textFill>
               </w:rPr>
             </w:pPr>
             <w:r>
@@ -13048,11 +13000,11 @@
                 <w:b w:val="0"/>
                 <w:color w:val="000000" w:themeColor="text1"/>
                 <w:sz w:val="22"/>
-                <w14:textFill>
-                  <w14:solidFill>
-                    <w14:schemeClr w14:val="tx1"/>
-                  </w14:solidFill>
-                </w14:textFill>
+                <ns2:textFill>
+                  <ns2:solidFill>
+                    <ns2:schemeClr ns2:val="tx1"/>
+                  </ns2:solidFill>
+                </ns2:textFill>
               </w:rPr>
               <w:t>【填写</w:t>
             </w:r>
@@ -13063,11 +13015,11 @@
                 <w:color w:val="000000" w:themeColor="text1"/>
                 <w:sz w:val="22"/>
                 <w:lang w:val="en-US" w:eastAsia="zh-CN"/>
-                <w14:textFill>
-                  <w14:solidFill>
-                    <w14:schemeClr w14:val="tx1"/>
-                  </w14:solidFill>
-                </w14:textFill>
+                <ns2:textFill>
+                  <ns2:solidFill>
+                    <ns2:schemeClr ns2:val="tx1"/>
+                  </ns2:solidFill>
+                </ns2:textFill>
               </w:rPr>
               <w:t>乙方公司</w:t>
             </w:r>
@@ -13077,11 +13029,11 @@
                 <w:b w:val="0"/>
                 <w:color w:val="000000" w:themeColor="text1"/>
                 <w:sz w:val="22"/>
-                <w14:textFill>
-                  <w14:solidFill>
-                    <w14:schemeClr w14:val="tx1"/>
-                  </w14:solidFill>
-                </w14:textFill>
+                <ns2:textFill>
+                  <ns2:solidFill>
+                    <ns2:schemeClr ns2:val="tx1"/>
+                  </ns2:solidFill>
+                </ns2:textFill>
               </w:rPr>
               <w:t>】</w:t>
             </w:r>
@@ -13099,7 +13051,7 @@
             </w:tcMar>
             <w:vAlign w:val="center"/>
           </w:tcPr>
-          <w:p>
+          <w:p ns2:paraId="0B07CE2A">
             <w:pPr>
               <w:keepNext w:val="0"/>
               <w:keepLines w:val="0"/>
@@ -13110,11 +13062,11 @@
               <w:rPr>
                 <w:rFonts w:hint="eastAsia" w:ascii="宋体" w:hAnsi="宋体" w:eastAsia="宋体" w:cs="宋体"/>
                 <w:color w:val="000000" w:themeColor="text1"/>
-                <w14:textFill>
-                  <w14:solidFill>
-                    <w14:schemeClr w14:val="tx1"/>
-                  </w14:solidFill>
-                </w14:textFill>
+                <ns2:textFill>
+                  <ns2:solidFill>
+                    <ns2:schemeClr ns2:val="tx1"/>
+                  </ns2:solidFill>
+                </ns2:textFill>
               </w:rPr>
             </w:pPr>
             <w:r>
@@ -13124,11 +13076,11 @@
                 <w:color w:val="000000" w:themeColor="text1"/>
                 <w:sz w:val="22"/>
                 <w:lang w:val="en-US" w:eastAsia="zh-CN"/>
-                <w14:textFill>
-                  <w14:solidFill>
-                    <w14:schemeClr w14:val="tx1"/>
-                  </w14:solidFill>
-                </w14:textFill>
+                <ns2:textFill>
+                  <ns2:solidFill>
+                    <ns2:schemeClr ns2:val="tx1"/>
+                  </ns2:solidFill>
+                </ns2:textFill>
               </w:rPr>
               <w:t>服务</w:t>
             </w:r>
@@ -13138,11 +13090,11 @@
                 <w:b w:val="0"/>
                 <w:color w:val="000000" w:themeColor="text1"/>
                 <w:sz w:val="22"/>
-                <w14:textFill>
-                  <w14:solidFill>
-                    <w14:schemeClr w14:val="tx1"/>
-                  </w14:solidFill>
-                </w14:textFill>
+                <ns2:textFill>
+                  <ns2:solidFill>
+                    <ns2:schemeClr ns2:val="tx1"/>
+                  </ns2:solidFill>
+                </ns2:textFill>
               </w:rPr>
               <w:t>方联系人及联系方式</w:t>
             </w:r>
@@ -13160,7 +13112,7 @@
             </w:tcMar>
             <w:vAlign w:val="center"/>
           </w:tcPr>
-          <w:p>
+          <w:p ns2:paraId="750D9DA1">
             <w:pPr>
               <w:keepNext w:val="0"/>
               <w:keepLines w:val="0"/>
@@ -13171,11 +13123,11 @@
               <w:rPr>
                 <w:rFonts w:hint="eastAsia" w:ascii="宋体" w:hAnsi="宋体" w:eastAsia="宋体" w:cs="宋体"/>
                 <w:color w:val="000000" w:themeColor="text1"/>
-                <w14:textFill>
-                  <w14:solidFill>
-                    <w14:schemeClr w14:val="tx1"/>
-                  </w14:solidFill>
-                </w14:textFill>
+                <ns2:textFill>
+                  <ns2:solidFill>
+                    <ns2:schemeClr ns2:val="tx1"/>
+                  </ns2:solidFill>
+                </ns2:textFill>
               </w:rPr>
             </w:pPr>
             <w:r>
@@ -13184,18 +13136,18 @@
                 <w:b w:val="0"/>
                 <w:color w:val="000000" w:themeColor="text1"/>
                 <w:sz w:val="21"/>
-                <w14:textFill>
-                  <w14:solidFill>
-                    <w14:schemeClr w14:val="tx1"/>
-                  </w14:solidFill>
-                </w14:textFill>
+                <ns2:textFill>
+                  <ns2:solidFill>
+                    <ns2:schemeClr ns2:val="tx1"/>
+                  </ns2:solidFill>
+                </ns2:textFill>
               </w:rPr>
               <w:t>【填写联系人及联系方式】</w:t>
             </w:r>
           </w:p>
         </w:tc>
       </w:tr>
-      <w:tr>
+      <w:tr ns2:paraId="560914BD">
         <w:trPr>
           <w:trHeight w:val="482" w:hRule="atLeast"/>
           <w:jc w:val="center"/>
@@ -13211,7 +13163,7 @@
             </w:tcMar>
             <w:vAlign w:val="center"/>
           </w:tcPr>
-          <w:p>
+          <w:p ns2:paraId="5DBAD7C3">
             <w:pPr>
               <w:keepNext w:val="0"/>
               <w:keepLines w:val="0"/>
@@ -13222,11 +13174,11 @@
               <w:rPr>
                 <w:rFonts w:hint="eastAsia" w:ascii="宋体" w:hAnsi="宋体" w:eastAsia="宋体" w:cs="宋体"/>
                 <w:color w:val="000000" w:themeColor="text1"/>
-                <w14:textFill>
-                  <w14:solidFill>
-                    <w14:schemeClr w14:val="tx1"/>
-                  </w14:solidFill>
-                </w14:textFill>
+                <ns2:textFill>
+                  <ns2:solidFill>
+                    <ns2:schemeClr ns2:val="tx1"/>
+                  </ns2:solidFill>
+                </ns2:textFill>
               </w:rPr>
             </w:pPr>
             <w:r>
@@ -13235,11 +13187,11 @@
                 <w:b w:val="0"/>
                 <w:color w:val="000000" w:themeColor="text1"/>
                 <w:sz w:val="24"/>
-                <w14:textFill>
-                  <w14:solidFill>
-                    <w14:schemeClr w14:val="tx1"/>
-                  </w14:solidFill>
-                </w14:textFill>
+                <ns2:textFill>
+                  <ns2:solidFill>
+                    <ns2:schemeClr ns2:val="tx1"/>
+                  </ns2:solidFill>
+                </ns2:textFill>
               </w:rPr>
               <w:t>合同金额</w:t>
             </w:r>
@@ -13247,11 +13199,11 @@
               <w:rPr>
                 <w:rFonts w:hint="eastAsia" w:ascii="宋体" w:hAnsi="宋体" w:eastAsia="宋体" w:cs="宋体"/>
                 <w:color w:val="000000" w:themeColor="text1"/>
-                <w14:textFill>
-                  <w14:solidFill>
-                    <w14:schemeClr w14:val="tx1"/>
-                  </w14:solidFill>
-                </w14:textFill>
+                <ns2:textFill>
+                  <ns2:solidFill>
+                    <ns2:schemeClr ns2:val="tx1"/>
+                  </ns2:solidFill>
+                </ns2:textFill>
               </w:rPr>
               <w:br w:type="textWrapping"/>
             </w:r>
@@ -13261,11 +13213,11 @@
                 <w:b w:val="0"/>
                 <w:color w:val="000000" w:themeColor="text1"/>
                 <w:sz w:val="24"/>
-                <w14:textFill>
-                  <w14:solidFill>
-                    <w14:schemeClr w14:val="tx1"/>
-                  </w14:solidFill>
-                </w14:textFill>
+                <ns2:textFill>
+                  <ns2:solidFill>
+                    <ns2:schemeClr ns2:val="tx1"/>
+                  </ns2:solidFill>
+                </ns2:textFill>
               </w:rPr>
               <w:t>（元）</w:t>
             </w:r>
@@ -13282,7 +13234,7 @@
             </w:tcMar>
             <w:vAlign w:val="center"/>
           </w:tcPr>
-          <w:p>
+          <w:p ns2:paraId="1B4B4F93">
             <w:pPr>
               <w:keepNext w:val="0"/>
               <w:keepLines w:val="0"/>
@@ -13293,11 +13245,11 @@
               <w:rPr>
                 <w:rFonts w:hint="eastAsia" w:ascii="宋体" w:hAnsi="宋体" w:eastAsia="宋体" w:cs="宋体"/>
                 <w:color w:val="000000" w:themeColor="text1"/>
-                <w14:textFill>
-                  <w14:solidFill>
-                    <w14:schemeClr w14:val="tx1"/>
-                  </w14:solidFill>
-                </w14:textFill>
+                <ns2:textFill>
+                  <ns2:solidFill>
+                    <ns2:schemeClr ns2:val="tx1"/>
+                  </ns2:solidFill>
+                </ns2:textFill>
               </w:rPr>
             </w:pPr>
             <w:r>
@@ -13306,11 +13258,11 @@
                 <w:b w:val="0"/>
                 <w:color w:val="000000" w:themeColor="text1"/>
                 <w:sz w:val="22"/>
-                <w14:textFill>
-                  <w14:solidFill>
-                    <w14:schemeClr w14:val="tx1"/>
-                  </w14:solidFill>
-                </w14:textFill>
+                <ns2:textFill>
+                  <ns2:solidFill>
+                    <ns2:schemeClr ns2:val="tx1"/>
+                  </ns2:solidFill>
+                </ns2:textFill>
               </w:rPr>
               <w:t>【填写金额】</w:t>
             </w:r>
@@ -13328,7 +13280,7 @@
             </w:tcMar>
             <w:vAlign w:val="center"/>
           </w:tcPr>
-          <w:p>
+          <w:p ns2:paraId="31E75B25">
             <w:pPr>
               <w:keepNext w:val="0"/>
               <w:keepLines w:val="0"/>
@@ -13339,11 +13291,11 @@
               <w:rPr>
                 <w:rFonts w:hint="eastAsia" w:ascii="宋体" w:hAnsi="宋体" w:eastAsia="宋体" w:cs="宋体"/>
                 <w:color w:val="000000" w:themeColor="text1"/>
-                <w14:textFill>
-                  <w14:solidFill>
-                    <w14:schemeClr w14:val="tx1"/>
-                  </w14:solidFill>
-                </w14:textFill>
+                <ns2:textFill>
+                  <ns2:solidFill>
+                    <ns2:schemeClr ns2:val="tx1"/>
+                  </ns2:solidFill>
+                </ns2:textFill>
               </w:rPr>
             </w:pPr>
             <w:r>
@@ -13352,11 +13304,11 @@
                 <w:b w:val="0"/>
                 <w:color w:val="000000" w:themeColor="text1"/>
                 <w:sz w:val="24"/>
-                <w14:textFill>
-                  <w14:solidFill>
-                    <w14:schemeClr w14:val="tx1"/>
-                  </w14:solidFill>
-                </w14:textFill>
+                <ns2:textFill>
+                  <ns2:solidFill>
+                    <ns2:schemeClr ns2:val="tx1"/>
+                  </ns2:solidFill>
+                </ns2:textFill>
               </w:rPr>
               <w:t>部署地点</w:t>
             </w:r>
@@ -13374,7 +13326,7 @@
             </w:tcMar>
             <w:vAlign w:val="center"/>
           </w:tcPr>
-          <w:p>
+          <w:p ns2:paraId="4A31424C">
             <w:pPr>
               <w:keepNext w:val="0"/>
               <w:keepLines w:val="0"/>
@@ -13385,11 +13337,11 @@
               <w:rPr>
                 <w:rFonts w:hint="eastAsia" w:ascii="宋体" w:hAnsi="宋体" w:eastAsia="宋体" w:cs="宋体"/>
                 <w:color w:val="000000" w:themeColor="text1"/>
-                <w14:textFill>
-                  <w14:solidFill>
-                    <w14:schemeClr w14:val="tx1"/>
-                  </w14:solidFill>
-                </w14:textFill>
+                <ns2:textFill>
+                  <ns2:solidFill>
+                    <ns2:schemeClr ns2:val="tx1"/>
+                  </ns2:solidFill>
+                </ns2:textFill>
               </w:rPr>
             </w:pPr>
             <w:r>
@@ -13398,18 +13350,18 @@
                 <w:b w:val="0"/>
                 <w:color w:val="000000" w:themeColor="text1"/>
                 <w:sz w:val="22"/>
-                <w14:textFill>
-                  <w14:solidFill>
-                    <w14:schemeClr w14:val="tx1"/>
-                  </w14:solidFill>
-                </w14:textFill>
+                <ns2:textFill>
+                  <ns2:solidFill>
+                    <ns2:schemeClr ns2:val="tx1"/>
+                  </ns2:solidFill>
+                </ns2:textFill>
               </w:rPr>
               <w:t>【填写地点】</w:t>
             </w:r>
           </w:p>
         </w:tc>
       </w:tr>
-      <w:tr>
+      <w:tr ns2:paraId="7B470A85">
         <w:trPr>
           <w:trHeight w:val="369" w:hRule="atLeast"/>
           <w:jc w:val="center"/>
@@ -13426,7 +13378,7 @@
             </w:tcMar>
             <w:vAlign w:val="center"/>
           </w:tcPr>
-          <w:p>
+          <w:p ns2:paraId="6AD314DD">
             <w:pPr>
               <w:keepNext w:val="0"/>
               <w:keepLines w:val="0"/>
@@ -13458,7 +13410,7 @@
           </w:p>
         </w:tc>
       </w:tr>
-      <w:tr>
+      <w:tr ns2:paraId="466BDA6F">
         <w:trPr>
           <w:trHeight w:val="351" w:hRule="atLeast"/>
           <w:jc w:val="center"/>
@@ -13474,7 +13426,7 @@
             </w:tcMar>
             <w:vAlign w:val="center"/>
           </w:tcPr>
-          <w:p>
+          <w:p ns2:paraId="6BBAD2A4">
             <w:pPr>
               <w:keepNext w:val="0"/>
               <w:keepLines w:val="0"/>
@@ -13507,7 +13459,7 @@
             </w:tcMar>
             <w:vAlign w:val="center"/>
           </w:tcPr>
-          <w:p>
+          <w:p ns2:paraId="0915B84A">
             <w:pPr>
               <w:keepNext w:val="0"/>
               <w:keepLines w:val="0"/>
@@ -13551,7 +13503,7 @@
             </w:tcMar>
             <w:vAlign w:val="center"/>
           </w:tcPr>
-          <w:p>
+          <w:p ns2:paraId="3BEEFA77">
             <w:pPr>
               <w:keepNext w:val="0"/>
               <w:keepLines w:val="0"/>
@@ -13587,7 +13539,7 @@
             </w:tcMar>
             <w:vAlign w:val="center"/>
           </w:tcPr>
-          <w:p>
+          <w:p ns2:paraId="2155DD8D">
             <w:pPr>
               <w:keepNext w:val="0"/>
               <w:keepLines w:val="0"/>
@@ -13619,7 +13571,7 @@
             </w:tcMar>
             <w:vAlign w:val="center"/>
           </w:tcPr>
-          <w:p>
+          <w:p ns2:paraId="167076C2">
             <w:pPr>
               <w:keepNext w:val="0"/>
               <w:keepLines w:val="0"/>
@@ -13641,7 +13593,7 @@
           </w:p>
         </w:tc>
       </w:tr>
-      <w:tr>
+      <w:tr ns2:paraId="21F0A47E">
         <w:trPr>
           <w:trHeight w:val="737" w:hRule="atLeast"/>
           <w:jc w:val="center"/>
@@ -13657,7 +13609,7 @@
             </w:tcMar>
             <w:vAlign w:val="center"/>
           </w:tcPr>
-          <w:p>
+          <w:p ns2:paraId="57C90697">
             <w:pPr>
               <w:keepNext w:val="0"/>
               <w:keepLines w:val="0"/>
@@ -13690,7 +13642,7 @@
             </w:tcMar>
             <w:vAlign w:val="center"/>
           </w:tcPr>
-          <w:p>
+          <w:p ns2:paraId="68F94A26">
             <w:pPr>
               <w:keepNext w:val="0"/>
               <w:keepLines w:val="0"/>
@@ -13716,7 +13668,7 @@
             </w:tcMar>
             <w:vAlign w:val="center"/>
           </w:tcPr>
-          <w:p>
+          <w:p ns2:paraId="03DC280D">
             <w:pPr>
               <w:keepNext w:val="0"/>
               <w:keepLines w:val="0"/>
@@ -13741,7 +13693,7 @@
             </w:tcMar>
             <w:vAlign w:val="center"/>
           </w:tcPr>
-          <w:p>
+          <w:p ns2:paraId="4BF99422">
             <w:pPr>
               <w:keepNext w:val="0"/>
               <w:keepLines w:val="0"/>
@@ -13766,7 +13718,7 @@
             </w:tcMar>
             <w:vAlign w:val="center"/>
           </w:tcPr>
-          <w:p>
+          <w:p ns2:paraId="2CA50E20">
             <w:pPr>
               <w:keepNext w:val="0"/>
               <w:keepLines w:val="0"/>
@@ -13781,7 +13733,7 @@
           </w:p>
         </w:tc>
       </w:tr>
-      <w:tr>
+      <w:tr ns2:paraId="45FD62CA">
         <w:trPr>
           <w:trHeight w:val="737" w:hRule="atLeast"/>
           <w:jc w:val="center"/>
@@ -13797,7 +13749,7 @@
             </w:tcMar>
             <w:vAlign w:val="center"/>
           </w:tcPr>
-          <w:p>
+          <w:p ns2:paraId="3C0B431A">
             <w:pPr>
               <w:keepNext w:val="0"/>
               <w:keepLines w:val="0"/>
@@ -13830,7 +13782,7 @@
             </w:tcMar>
             <w:vAlign w:val="center"/>
           </w:tcPr>
-          <w:p>
+          <w:p ns2:paraId="1610F35A">
             <w:pPr>
               <w:keepNext w:val="0"/>
               <w:keepLines w:val="0"/>
@@ -13856,7 +13808,7 @@
             </w:tcMar>
             <w:vAlign w:val="center"/>
           </w:tcPr>
-          <w:p>
+          <w:p ns2:paraId="21941F2F">
             <w:pPr>
               <w:keepNext w:val="0"/>
               <w:keepLines w:val="0"/>
@@ -13881,7 +13833,7 @@
             </w:tcMar>
             <w:vAlign w:val="center"/>
           </w:tcPr>
-          <w:p>
+          <w:p ns2:paraId="0AE2124E">
             <w:pPr>
               <w:keepNext w:val="0"/>
               <w:keepLines w:val="0"/>
@@ -13906,7 +13858,7 @@
             </w:tcMar>
             <w:vAlign w:val="center"/>
           </w:tcPr>
-          <w:p>
+          <w:p ns2:paraId="1ECFDCC4">
             <w:pPr>
               <w:keepNext w:val="0"/>
               <w:keepLines w:val="0"/>
@@ -13921,7 +13873,7 @@
           </w:p>
         </w:tc>
       </w:tr>
-      <w:tr>
+      <w:tr ns2:paraId="1112DB20">
         <w:trPr>
           <w:trHeight w:val="737" w:hRule="atLeast"/>
           <w:jc w:val="center"/>
@@ -13937,7 +13889,7 @@
             </w:tcMar>
             <w:vAlign w:val="center"/>
           </w:tcPr>
-          <w:p>
+          <w:p ns2:paraId="5B4832E8">
             <w:pPr>
               <w:keepNext w:val="0"/>
               <w:keepLines w:val="0"/>
@@ -13970,7 +13922,7 @@
             </w:tcMar>
             <w:vAlign w:val="center"/>
           </w:tcPr>
-          <w:p>
+          <w:p ns2:paraId="376BFAC5">
             <w:pPr>
               <w:keepNext w:val="0"/>
               <w:keepLines w:val="0"/>
@@ -13996,7 +13948,7 @@
             </w:tcMar>
             <w:vAlign w:val="center"/>
           </w:tcPr>
-          <w:p>
+          <w:p ns2:paraId="1B586389">
             <w:pPr>
               <w:keepNext w:val="0"/>
               <w:keepLines w:val="0"/>
@@ -14021,7 +13973,7 @@
             </w:tcMar>
             <w:vAlign w:val="center"/>
           </w:tcPr>
-          <w:p>
+          <w:p ns2:paraId="29F91ABA">
             <w:pPr>
               <w:keepNext w:val="0"/>
               <w:keepLines w:val="0"/>
@@ -14046,7 +13998,7 @@
             </w:tcMar>
             <w:vAlign w:val="center"/>
           </w:tcPr>
-          <w:p>
+          <w:p ns2:paraId="5A6385A5">
             <w:pPr>
               <w:keepNext w:val="0"/>
               <w:keepLines w:val="0"/>
@@ -14061,7 +14013,7 @@
           </w:p>
         </w:tc>
       </w:tr>
-      <w:tr>
+      <w:tr ns2:paraId="264677AF">
         <w:trPr>
           <w:trHeight w:val="765" w:hRule="atLeast"/>
           <w:jc w:val="center"/>
@@ -14077,7 +14029,7 @@
             </w:tcMar>
             <w:vAlign w:val="center"/>
           </w:tcPr>
-          <w:p>
+          <w:p ns2:paraId="4F2EBAE9">
             <w:pPr>
               <w:keepNext w:val="0"/>
               <w:keepLines w:val="0"/>
@@ -14110,7 +14062,7 @@
             </w:tcMar>
             <w:vAlign w:val="center"/>
           </w:tcPr>
-          <w:p>
+          <w:p ns2:paraId="372C3676">
             <w:pPr>
               <w:keepNext w:val="0"/>
               <w:keepLines w:val="0"/>
@@ -14136,7 +14088,7 @@
             </w:tcMar>
             <w:vAlign w:val="center"/>
           </w:tcPr>
-          <w:p>
+          <w:p ns2:paraId="7C79368C">
             <w:pPr>
               <w:keepNext w:val="0"/>
               <w:keepLines w:val="0"/>
@@ -14161,7 +14113,7 @@
             </w:tcMar>
             <w:vAlign w:val="center"/>
           </w:tcPr>
-          <w:p>
+          <w:p ns2:paraId="773A1FF0">
             <w:pPr>
               <w:keepNext w:val="0"/>
               <w:keepLines w:val="0"/>
@@ -14186,7 +14138,7 @@
             </w:tcMar>
             <w:vAlign w:val="center"/>
           </w:tcPr>
-          <w:p>
+          <w:p ns2:paraId="6468BCBD">
             <w:pPr>
               <w:keepNext w:val="0"/>
               <w:keepLines w:val="0"/>
@@ -14201,7 +14153,7 @@
           </w:p>
         </w:tc>
       </w:tr>
-      <w:tr>
+      <w:tr ns2:paraId="246A003B">
         <w:trPr>
           <w:trHeight w:val="765" w:hRule="atLeast"/>
           <w:jc w:val="center"/>
@@ -14217,7 +14169,7 @@
             </w:tcMar>
             <w:vAlign w:val="center"/>
           </w:tcPr>
-          <w:p>
+          <w:p ns2:paraId="02F2FC99">
             <w:pPr>
               <w:keepNext w:val="0"/>
               <w:keepLines w:val="0"/>
@@ -14250,7 +14202,7 @@
             </w:tcMar>
             <w:vAlign w:val="center"/>
           </w:tcPr>
-          <w:p>
+          <w:p ns2:paraId="5353D3DF">
             <w:pPr>
               <w:keepNext w:val="0"/>
               <w:keepLines w:val="0"/>
@@ -14276,7 +14228,7 @@
             </w:tcMar>
             <w:vAlign w:val="center"/>
           </w:tcPr>
-          <w:p>
+          <w:p ns2:paraId="2898FBBE">
             <w:pPr>
               <w:keepNext w:val="0"/>
               <w:keepLines w:val="0"/>
@@ -14301,7 +14253,7 @@
             </w:tcMar>
             <w:vAlign w:val="center"/>
           </w:tcPr>
-          <w:p>
+          <w:p ns2:paraId="542A3518">
             <w:pPr>
               <w:keepNext w:val="0"/>
               <w:keepLines w:val="0"/>
@@ -14326,7 +14278,7 @@
             </w:tcMar>
             <w:vAlign w:val="center"/>
           </w:tcPr>
-          <w:p>
+          <w:p ns2:paraId="5CBA4E93">
             <w:pPr>
               <w:keepNext w:val="0"/>
               <w:keepLines w:val="0"/>
@@ -14341,7 +14293,7 @@
           </w:p>
         </w:tc>
       </w:tr>
-      <w:tr>
+      <w:tr ns2:paraId="37974D49">
         <w:trPr>
           <w:trHeight w:val="765" w:hRule="atLeast"/>
           <w:jc w:val="center"/>
@@ -14357,7 +14309,7 @@
             </w:tcMar>
             <w:vAlign w:val="center"/>
           </w:tcPr>
-          <w:p>
+          <w:p ns2:paraId="558E20E7">
             <w:pPr>
               <w:keepNext w:val="0"/>
               <w:keepLines w:val="0"/>
@@ -14390,7 +14342,7 @@
             </w:tcMar>
             <w:vAlign w:val="center"/>
           </w:tcPr>
-          <w:p>
+          <w:p ns2:paraId="26EC5153">
             <w:pPr>
               <w:keepNext w:val="0"/>
               <w:keepLines w:val="0"/>
@@ -14416,7 +14368,7 @@
             </w:tcMar>
             <w:vAlign w:val="center"/>
           </w:tcPr>
-          <w:p>
+          <w:p ns2:paraId="13D69F0D">
             <w:pPr>
               <w:keepNext w:val="0"/>
               <w:keepLines w:val="0"/>
@@ -14441,7 +14393,7 @@
             </w:tcMar>
             <w:vAlign w:val="center"/>
           </w:tcPr>
-          <w:p>
+          <w:p ns2:paraId="5A63E045">
             <w:pPr>
               <w:keepNext w:val="0"/>
               <w:keepLines w:val="0"/>
@@ -14466,7 +14418,7 @@
             </w:tcMar>
             <w:vAlign w:val="center"/>
           </w:tcPr>
-          <w:p>
+          <w:p ns2:paraId="0D7D30B8">
             <w:pPr>
               <w:keepNext w:val="0"/>
               <w:keepLines w:val="0"/>
@@ -14481,7 +14433,7 @@
           </w:p>
         </w:tc>
       </w:tr>
-      <w:tr>
+      <w:tr ns2:paraId="3A1C3DA8">
         <w:trPr>
           <w:trHeight w:val="765" w:hRule="atLeast"/>
           <w:jc w:val="center"/>
@@ -14497,7 +14449,7 @@
             </w:tcMar>
             <w:vAlign w:val="center"/>
           </w:tcPr>
-          <w:p>
+          <w:p ns2:paraId="63E943FD">
             <w:pPr>
               <w:keepNext w:val="0"/>
               <w:keepLines w:val="0"/>
@@ -14530,7 +14482,7 @@
             </w:tcMar>
             <w:vAlign w:val="center"/>
           </w:tcPr>
-          <w:p>
+          <w:p ns2:paraId="60BC46F4">
             <w:pPr>
               <w:keepNext w:val="0"/>
               <w:keepLines w:val="0"/>
@@ -14556,7 +14508,7 @@
             </w:tcMar>
             <w:vAlign w:val="center"/>
           </w:tcPr>
-          <w:p>
+          <w:p ns2:paraId="6DC71BAE">
             <w:pPr>
               <w:keepNext w:val="0"/>
               <w:keepLines w:val="0"/>
@@ -14581,7 +14533,7 @@
             </w:tcMar>
             <w:vAlign w:val="center"/>
           </w:tcPr>
-          <w:p>
+          <w:p ns2:paraId="34050284">
             <w:pPr>
               <w:keepNext w:val="0"/>
               <w:keepLines w:val="0"/>
@@ -14606,7 +14558,7 @@
             </w:tcMar>
             <w:vAlign w:val="center"/>
           </w:tcPr>
-          <w:p>
+          <w:p ns2:paraId="3574066C">
             <w:pPr>
               <w:keepNext w:val="0"/>
               <w:keepLines w:val="0"/>
@@ -14621,7 +14573,7 @@
           </w:p>
         </w:tc>
       </w:tr>
-      <w:tr>
+      <w:tr ns2:paraId="4C9C3028">
         <w:trPr>
           <w:trHeight w:val="1077" w:hRule="atLeast"/>
           <w:jc w:val="center"/>
@@ -14637,7 +14589,7 @@
             </w:tcMar>
             <w:vAlign w:val="center"/>
           </w:tcPr>
-          <w:p>
+          <w:p ns2:paraId="461382E2">
             <w:pPr>
               <w:keepNext w:val="0"/>
               <w:keepLines w:val="0"/>
@@ -14685,7 +14637,7 @@
             </w:tcMar>
             <w:vAlign w:val="center"/>
           </w:tcPr>
-          <w:p>
+          <w:p ns2:paraId="40514239">
             <w:pPr>
               <w:pStyle w:val="44"/>
               <w:keepNext w:val="0"/>
@@ -14729,7 +14681,7 @@
           </w:p>
         </w:tc>
       </w:tr>
-      <w:tr>
+      <w:tr ns2:paraId="646C307D">
         <w:trPr>
           <w:trHeight w:val="1077" w:hRule="atLeast"/>
           <w:jc w:val="center"/>
@@ -14746,7 +14698,7 @@
             </w:tcMar>
             <w:vAlign w:val="top"/>
           </w:tcPr>
-          <w:p>
+          <w:p ns2:paraId="65145D2B">
             <w:pPr>
               <w:pStyle w:val="44"/>
               <w:keepNext w:val="0"/>
@@ -14783,7 +14735,7 @@
               <w:t>（章）：</w:t>
             </w:r>
           </w:p>
-          <w:p>
+          <w:p ns2:paraId="2A8A1424">
             <w:pPr>
               <w:keepNext w:val="0"/>
               <w:keepLines w:val="0"/>
@@ -14809,7 +14761,7 @@
               <w:t>代表：</w:t>
             </w:r>
           </w:p>
-          <w:p>
+          <w:p ns2:paraId="24656640">
             <w:pPr>
               <w:keepNext w:val="0"/>
               <w:keepLines w:val="0"/>
@@ -14848,7 +14800,7 @@
             </w:tcMar>
             <w:vAlign w:val="top"/>
           </w:tcPr>
-          <w:p>
+          <w:p ns2:paraId="6931FC51">
             <w:pPr>
               <w:pStyle w:val="44"/>
               <w:keepNext w:val="0"/>
@@ -14885,7 +14837,7 @@
               <w:t>（章）：</w:t>
             </w:r>
           </w:p>
-          <w:p>
+          <w:p ns2:paraId="6E5F59C9">
             <w:pPr>
               <w:pStyle w:val="44"/>
               <w:keepNext w:val="0"/>
@@ -14912,7 +14864,7 @@
               <w:t>代表：</w:t>
             </w:r>
           </w:p>
-          <w:p>
+          <w:p ns2:paraId="59767ABE">
             <w:pPr>
               <w:pStyle w:val="44"/>
               <w:keepNext w:val="0"/>
@@ -14998,7 +14950,7 @@
         </w:tc>
       </w:tr>
     </w:tbl>
-    <w:p>
+    <w:p ns2:paraId="34BE7268">
       <w:pPr>
         <w:rPr>
           <w:rFonts w:hint="default"/>
@@ -15006,7 +14958,7 @@
         </w:rPr>
       </w:pPr>
     </w:p>
-    <w:p>
+    <w:p ns2:paraId="3C384081">
       <w:pPr>
         <w:spacing w:line="440" w:lineRule="exact"/>
         <w:ind w:left="0" w:leftChars="0" w:firstLine="0" w:firstLineChars="0"/>
@@ -15019,7 +14971,7 @@
       </w:pPr>
     </w:p>
     <w:sectPr>
-      <w:footerReference r:id="rId8" w:type="default"/>
+      <w:footerReference ns3:id="rId8" w:type="default"/>
       <w:pgSz w:w="11906" w:h="16838"/>
       <w:pgMar w:top="851" w:right="1247" w:bottom="851" w:left="1418" w:header="851" w:footer="992" w:gutter="0"/>
       <w:pgBorders>

</xml_diff>

<commit_message>
feat: sync Devbox sales workspace updates (#1)
Co-authored-by: Dennis Yang <dennisyang0611@gmail.com>
</commit_message>
<xml_diff>
--- a/contract-assets/FastGPT合同模版-v1.2.docx
+++ b/contract-assets/FastGPT合同模版-v1.2.docx
@@ -1,8 +1,8 @@
 
 <file path=word/document.xml><?xml version="1.0" encoding="utf-8"?>
-<w:document xmlns:wpc="http://schemas.microsoft.com/office/word/2010/wordprocessingCanvas" xmlns:cx="http://schemas.microsoft.com/office/drawing/2014/chartex" xmlns:cx1="http://schemas.microsoft.com/office/drawing/2015/9/8/chartex" xmlns:cx2="http://schemas.microsoft.com/office/drawing/2015/10/21/chartex" xmlns:cx3="http://schemas.microsoft.com/office/drawing/2016/5/9/chartex" xmlns:cx4="http://schemas.microsoft.com/office/drawing/2016/5/10/chartex" xmlns:cx5="http://schemas.microsoft.com/office/drawing/2016/5/11/chartex" xmlns:cx6="http://schemas.microsoft.com/office/drawing/2016/5/12/chartex" xmlns:cx7="http://schemas.microsoft.com/office/drawing/2016/5/13/chartex" xmlns:cx8="http://schemas.microsoft.com/office/drawing/2016/5/14/chartex" xmlns:mc="http://schemas.openxmlformats.org/markup-compatibility/2006" xmlns:o="urn:schemas-microsoft-com:office:office" xmlns:r="http://schemas.openxmlformats.org/officeDocument/2006/relationships" xmlns:m="http://schemas.openxmlformats.org/officeDocument/2006/math" xmlns:v="urn:schemas-microsoft-com:vml" xmlns:wp14="http://schemas.microsoft.com/office/word/2010/wordprocessingDrawing" xmlns:wp="http://schemas.openxmlformats.org/drawingml/2006/wordprocessingDrawing" xmlns:w="http://schemas.openxmlformats.org/wordprocessingml/2006/main" xmlns:w14="http://schemas.microsoft.com/office/word/2010/wordml" xmlns:w10="urn:schemas-microsoft-com:office:word" xmlns:w15="http://schemas.microsoft.com/office/word/2012/wordml" xmlns:wpg="http://schemas.microsoft.com/office/word/2010/wordprocessingGroup" xmlns:wpi="http://schemas.microsoft.com/office/word/2010/wordprocessingInk" xmlns:wne="http://schemas.microsoft.com/office/word/2006/wordml" xmlns:wps="http://schemas.microsoft.com/office/word/2010/wordprocessingShape" xmlns:wpsCustomData="http://www.wps.cn/officeDocument/2013/wpsCustomData" mc:Ignorable="w14 w15 wp14">
+<w:document xmlns:ns1="http://schemas.openxmlformats.org/markup-compatibility/2006" xmlns:ns2="http://schemas.microsoft.com/office/word/2010/wordml" xmlns:ns3="http://schemas.openxmlformats.org/officeDocument/2006/relationships" xmlns:w="http://schemas.openxmlformats.org/wordprocessingml/2006/main" ns1:Ignorable="w14 w15 wp14">
   <w:body>
-    <w:p>
+    <w:p ns2:paraId="66F88E03">
       <w:pPr>
         <w:keepNext w:val="0"/>
         <w:keepLines w:val="0"/>
@@ -54,7 +54,7 @@
         <w:t xml:space="preserve">                   </w:t>
       </w:r>
     </w:p>
-    <w:p>
+    <w:p ns2:paraId="20FB51D8">
       <w:pPr>
         <w:spacing w:line="480" w:lineRule="auto"/>
         <w:ind w:left="0" w:leftChars="0" w:right="-153" w:firstLine="0" w:firstLineChars="0"/>
@@ -67,7 +67,7 @@
         </w:rPr>
       </w:pPr>
     </w:p>
-    <w:p>
+    <w:p ns2:paraId="502E793B">
       <w:pPr>
         <w:keepNext w:val="0"/>
         <w:keepLines w:val="0"/>
@@ -137,7 +137,7 @@
         <w:t>合同</w:t>
       </w:r>
     </w:p>
-    <w:p>
+    <w:p ns2:paraId="23EA43BC">
       <w:pPr>
         <w:keepNext w:val="0"/>
         <w:keepLines w:val="0"/>
@@ -171,7 +171,7 @@
         <w:t>（通用模板）</w:t>
       </w:r>
     </w:p>
-    <w:p>
+    <w:p ns2:paraId="00D50BCE">
       <w:pPr>
         <w:keepNext w:val="0"/>
         <w:keepLines w:val="0"/>
@@ -222,7 +222,7 @@
         <w:t>服务</w:t>
       </w:r>
     </w:p>
-    <w:p>
+    <w:p ns2:paraId="50FFF7F1">
       <w:pPr>
         <w:shd w:val="clear" w:color="auto" w:fill="FFFFFF"/>
         <w:adjustRightInd w:val="0"/>
@@ -240,7 +240,7 @@
         </w:rPr>
       </w:pPr>
     </w:p>
-    <w:p>
+    <w:p ns2:paraId="20F9AE29">
       <w:pPr>
         <w:shd w:val="clear" w:color="auto" w:fill="FFFFFF"/>
         <w:adjustRightInd w:val="0"/>
@@ -258,7 +258,7 @@
         </w:rPr>
       </w:pPr>
     </w:p>
-    <w:p>
+    <w:p ns2:paraId="43F9A5F8">
       <w:pPr>
         <w:shd w:val="clear" w:color="auto" w:fill="FFFFFF"/>
         <w:adjustRightInd w:val="0"/>
@@ -276,7 +276,7 @@
         </w:rPr>
       </w:pPr>
     </w:p>
-    <w:p>
+    <w:p ns2:paraId="0B29D1E4">
       <w:pPr>
         <w:shd w:val="clear" w:color="auto" w:fill="FFFFFF"/>
         <w:adjustRightInd w:val="0"/>
@@ -294,7 +294,7 @@
         </w:rPr>
       </w:pPr>
     </w:p>
-    <w:p>
+    <w:p ns2:paraId="2CE12696">
       <w:pPr>
         <w:shd w:val="clear" w:color="auto" w:fill="FFFFFF"/>
         <w:adjustRightInd w:val="0"/>
@@ -311,7 +311,7 @@
         </w:rPr>
       </w:pPr>
     </w:p>
-    <w:p>
+    <w:p ns2:paraId="33282187">
       <w:pPr>
         <w:keepNext w:val="0"/>
         <w:keepLines w:val="0"/>
@@ -340,7 +340,7 @@
       </w:pPr>
       <w:bookmarkStart w:id="0" w:name="_Toc9052"/>
     </w:p>
-    <w:p>
+    <w:p ns2:paraId="2A8861F6">
       <w:pPr>
         <w:keepNext w:val="0"/>
         <w:keepLines w:val="0"/>
@@ -368,7 +368,7 @@
         </w:rPr>
       </w:pPr>
     </w:p>
-    <w:p>
+    <w:p ns2:paraId="633C53F6">
       <w:pPr>
         <w:keepNext w:val="0"/>
         <w:keepLines w:val="0"/>
@@ -396,7 +396,7 @@
         </w:rPr>
       </w:pPr>
     </w:p>
-    <w:p>
+    <w:p ns2:paraId="54147F4D">
       <w:pPr>
         <w:keepNext w:val="0"/>
         <w:keepLines w:val="0"/>
@@ -425,7 +425,7 @@
       </w:pPr>
     </w:p>
     <w:bookmarkEnd w:id="0"/>
-    <w:p>
+    <w:p ns2:paraId="0FE6BA64">
       <w:pPr>
         <w:keepNext w:val="0"/>
         <w:keepLines w:val="0"/>
@@ -490,7 +490,7 @@
       </w:r>
       <w:bookmarkEnd w:id="1"/>
     </w:p>
-    <w:p>
+    <w:p ns2:paraId="1815A809">
       <w:pPr>
         <w:keepNext w:val="0"/>
         <w:keepLines w:val="0"/>
@@ -557,7 +557,7 @@
       <w:bookmarkEnd w:id="2"/>
       <w:bookmarkStart w:id="3" w:name="_Toc28121"/>
     </w:p>
-    <w:p>
+    <w:p ns2:paraId="0E8CCAC0">
       <w:pPr>
         <w:keepNext w:val="0"/>
         <w:keepLines w:val="0"/>
@@ -587,7 +587,7 @@
         </w:rPr>
       </w:pPr>
     </w:p>
-    <w:p>
+    <w:p ns2:paraId="5E679DDB">
       <w:pPr>
         <w:adjustRightInd w:val="0"/>
         <w:ind w:left="0" w:leftChars="0" w:firstLine="0" w:firstLineChars="0"/>
@@ -614,7 +614,7 @@
         <w:t>签约地点：</w:t>
       </w:r>
     </w:p>
-    <w:p>
+    <w:p ns2:paraId="03E92BF5">
       <w:pPr>
         <w:adjustRightInd w:val="0"/>
         <w:jc w:val="center"/>
@@ -686,7 +686,7 @@
         <w:t xml:space="preserve"> 日</w:t>
       </w:r>
     </w:p>
-    <w:p>
+    <w:p ns2:paraId="5452DA38">
       <w:pPr>
         <w:adjustRightInd w:val="0"/>
         <w:ind w:left="0" w:leftChars="0" w:firstLine="0" w:firstLineChars="0"/>
@@ -700,7 +700,7 @@
           <w:szCs w:val="28"/>
         </w:rPr>
         <w:sectPr>
-          <w:footerReference r:id="rId7" w:type="first"/>
+          <w:footerReference ns3:id="rId7" w:type="first"/>
           <w:pgSz w:w="11906" w:h="16838"/>
           <w:pgMar w:top="1418" w:right="1418" w:bottom="1418" w:left="1418" w:header="851" w:footer="964" w:gutter="0"/>
           <w:pgBorders>
@@ -715,7 +715,7 @@
       </w:pPr>
     </w:p>
     <w:bookmarkEnd w:id="3"/>
-    <w:p>
+    <w:p ns2:paraId="5C9B7954">
       <w:pPr>
         <w:keepNext w:val="0"/>
         <w:keepLines w:val="0"/>
@@ -823,7 +823,7 @@
         <w:t xml:space="preserve">                        </w:t>
       </w:r>
     </w:p>
-    <w:p>
+    <w:p ns2:paraId="4AF11ABE">
       <w:pPr>
         <w:keepNext w:val="0"/>
         <w:keepLines w:val="0"/>
@@ -931,7 +931,7 @@
         <w:t xml:space="preserve">    </w:t>
       </w:r>
     </w:p>
-    <w:p>
+    <w:p ns2:paraId="23899C41">
       <w:pPr>
         <w:keepNext w:val="0"/>
         <w:keepLines w:val="0"/>
@@ -1015,7 +1015,7 @@
         <w:t xml:space="preserve">                    </w:t>
       </w:r>
     </w:p>
-    <w:p>
+    <w:p ns2:paraId="75233384">
       <w:pPr>
         <w:keepNext w:val="0"/>
         <w:keepLines w:val="0"/>
@@ -1120,7 +1120,7 @@
         <w:t xml:space="preserve"> </w:t>
       </w:r>
     </w:p>
-    <w:p>
+    <w:p ns2:paraId="78695259">
       <w:pPr>
         <w:keepNext w:val="0"/>
         <w:keepLines w:val="0"/>
@@ -1243,7 +1243,7 @@
         <w:t xml:space="preserve">           </w:t>
       </w:r>
     </w:p>
-    <w:p>
+    <w:p ns2:paraId="3E95F902">
       <w:pPr>
         <w:keepNext w:val="0"/>
         <w:keepLines w:val="0"/>
@@ -1269,7 +1269,7 @@
         </w:rPr>
       </w:pPr>
     </w:p>
-    <w:p>
+    <w:p ns2:paraId="7F119716">
       <w:pPr>
         <w:keepNext w:val="0"/>
         <w:keepLines w:val="0"/>
@@ -1368,7 +1368,7 @@
         <w:t xml:space="preserve">  </w:t>
       </w:r>
     </w:p>
-    <w:p>
+    <w:p ns2:paraId="5421A159">
       <w:pPr>
         <w:keepNext w:val="0"/>
         <w:keepLines w:val="0"/>
@@ -1450,7 +1450,7 @@
         <w:t xml:space="preserve">        </w:t>
       </w:r>
     </w:p>
-    <w:p>
+    <w:p ns2:paraId="0B923B36">
       <w:pPr>
         <w:keepNext w:val="0"/>
         <w:keepLines w:val="0"/>
@@ -1523,7 +1523,7 @@
         <w:t xml:space="preserve">  </w:t>
       </w:r>
     </w:p>
-    <w:p>
+    <w:p ns2:paraId="2EBA9940">
       <w:pPr>
         <w:keepNext w:val="0"/>
         <w:keepLines w:val="0"/>
@@ -1619,7 +1619,7 @@
         <w:t xml:space="preserve"> </w:t>
       </w:r>
     </w:p>
-    <w:p>
+    <w:p ns2:paraId="49BF999B">
       <w:pPr>
         <w:keepNext w:val="0"/>
         <w:keepLines w:val="0"/>
@@ -1739,7 +1739,7 @@
         <w:t xml:space="preserve">  </w:t>
       </w:r>
     </w:p>
-    <w:p>
+    <w:p ns2:paraId="3CCA9363">
       <w:pPr>
         <w:keepNext w:val="0"/>
         <w:keepLines w:val="0"/>
@@ -1779,7 +1779,7 @@
         <w:t xml:space="preserve"> </w:t>
       </w:r>
     </w:p>
-    <w:p>
+    <w:p ns2:paraId="2C4E6FDB">
       <w:pPr>
         <w:pStyle w:val="5"/>
         <w:bidi w:val="0"/>
@@ -1797,7 +1797,6 @@
       <w:r>
         <w:rPr>
           <w:rFonts w:hint="eastAsia"/>
-          <w:highlight w:val="none"/>
           <w:u w:val="single"/>
           <w:lang w:val="en-US" w:eastAsia="zh-CN"/>
         </w:rPr>
@@ -1837,7 +1836,7 @@
         <w:t>：</w:t>
       </w:r>
     </w:p>
-    <w:p>
+    <w:p ns2:paraId="0AD4D80C">
       <w:pPr>
         <w:pStyle w:val="2"/>
         <w:numPr>
@@ -1858,7 +1857,7 @@
         <w:t>定义与合同文件</w:t>
       </w:r>
     </w:p>
-    <w:p>
+    <w:p ns2:paraId="602768A7">
       <w:pPr>
         <w:pStyle w:val="5"/>
         <w:bidi w:val="0"/>
@@ -1875,7 +1874,7 @@
         <w:t>除⾮另有特别解释或说明，在本合同及与本合同相关的，双⽅另⾏签署的其他⽂件（包括但不限于本合同的附件）中，下述词语均依如下定义进⾏解释：</w:t>
       </w:r>
     </w:p>
-    <w:p>
+    <w:p ns2:paraId="133F74B2">
       <w:pPr>
         <w:pStyle w:val="28"/>
         <w:keepNext w:val="0"/>
@@ -1920,7 +1919,7 @@
         <w:t>双方授权代表签署的补充协议及变更单组成。前述文件约定不一致的，以签署时间较晚且明确替代原约定的文件为准。</w:t>
       </w:r>
     </w:p>
-    <w:p>
+    <w:p ns2:paraId="0CD54626">
       <w:pPr>
         <w:pStyle w:val="28"/>
         <w:keepNext w:val="0"/>
@@ -1955,7 +1954,7 @@
         <w:t>“附件”是指与本合同的订⽴、履⾏有关的，经甲⼄双⽅认可的，对本合同约定的内容进⾏细化、补充、修改、变更的⽂件等资料。</w:t>
       </w:r>
     </w:p>
-    <w:p>
+    <w:p ns2:paraId="63906179">
       <w:pPr>
         <w:pStyle w:val="28"/>
         <w:keepNext w:val="0"/>
@@ -1990,7 +1989,7 @@
         <w:t>“交付”指⼄⽅在双⽅规定的⽇期内交付合同软件产品的⾏为。</w:t>
       </w:r>
     </w:p>
-    <w:p>
+    <w:p ns2:paraId="3533C1A8">
       <w:pPr>
         <w:pStyle w:val="28"/>
         <w:keepNext w:val="0"/>
@@ -2082,7 +2081,7 @@
         <w:t>。</w:t>
       </w:r>
     </w:p>
-    <w:p>
+    <w:p ns2:paraId="6441356F">
       <w:pPr>
         <w:pStyle w:val="28"/>
         <w:keepNext w:val="0"/>
@@ -2120,7 +2119,7 @@
         <w:t>“法律、法规”是指由中国有关部⻔制定的法律、⾏政法规、地⽅性法规、规章及其他规范性⽂件以及经全国⼈⺠代表⼤会常务委员会批准的中国缔结、参加的国际条（公）约的有关规定</w:t>
       </w:r>
     </w:p>
-    <w:p>
+    <w:p ns2:paraId="0492E945">
       <w:pPr>
         <w:pStyle w:val="28"/>
         <w:keepNext w:val="0"/>
@@ -2144,17 +2143,15 @@
         <w:textAlignment w:val="auto"/>
         <w:rPr>
           <w:rFonts w:hint="eastAsia"/>
-          <w:highlight w:val="lightGray"/>
-          <w:lang w:val="en-US" w:eastAsia="zh-CN"/>
-        </w:rPr>
-      </w:pPr>
-      <w:r>
-        <w:rPr>
-          <w:rFonts w:hint="eastAsia" w:ascii="Times New Roman" w:hAnsi="Times New Roman" w:eastAsia="宋体" w:cs="Times New Roman"/>
-          <w:kern w:val="2"/>
-          <w:sz w:val="21"/>
-          <w:szCs w:val="20"/>
-          <w:highlight w:val="lightGray"/>
+          <w:lang w:val="en-US" w:eastAsia="zh-CN"/>
+        </w:rPr>
+      </w:pPr>
+      <w:r>
+        <w:rPr>
+          <w:rFonts w:hint="eastAsia" w:ascii="Times New Roman" w:hAnsi="Times New Roman" w:eastAsia="宋体" w:cs="Times New Roman"/>
+          <w:kern w:val="2"/>
+          <w:sz w:val="21"/>
+          <w:szCs w:val="20"/>
           <w:lang w:val="en-US" w:eastAsia="zh-CN" w:bidi="ar-SA"/>
         </w:rPr>
         <w:t>“FastGP</w:t>
@@ -2162,7 +2159,6 @@
       <w:r>
         <w:rPr>
           <w:rFonts w:hint="eastAsia"/>
-          <w:highlight w:val="lightGray"/>
           <w:lang w:val="en-US" w:eastAsia="zh-CN"/>
         </w:rPr>
         <w:t>T”是乙方自主研发的具有独立知识产权的产品，</w:t>
@@ -2173,15 +2169,12 @@
           <w:kern w:val="2"/>
           <w:sz w:val="21"/>
           <w:szCs w:val="24"/>
-          <w:highlight w:val="lightGray"/>
           <w:lang w:val="en-US" w:eastAsia="zh-CN" w:bidi="ar-SA"/>
         </w:rPr>
         <w:t>是一个基于大语言模型的 AI Agent 应用开发平台，集知识库问答、可视化工作流、Agent 编排、工具调用和技能扩展于一体，让开发者</w:t>
       </w:r>
       <w:r>
-        <w:rPr>
-          <w:highlight w:val="lightGray"/>
-        </w:rPr>
+        <w:rPr/>
         <w:commentReference w:id="0"/>
       </w:r>
       <w:r>
@@ -2190,13 +2183,12 @@
           <w:kern w:val="2"/>
           <w:sz w:val="21"/>
           <w:szCs w:val="24"/>
-          <w:highlight w:val="lightGray"/>
           <w:lang w:val="en-US" w:eastAsia="zh-CN" w:bidi="ar-SA"/>
         </w:rPr>
         <w:t>和业务人员都能快速构建专属 AI 应用。</w:t>
       </w:r>
     </w:p>
-    <w:p>
+    <w:p ns2:paraId="51A30ED3">
       <w:pPr>
         <w:pStyle w:val="2"/>
         <w:numPr>
@@ -2218,7 +2210,7 @@
         <w:t>软件产品及服务内容</w:t>
       </w:r>
     </w:p>
-    <w:p>
+    <w:p ns2:paraId="15395A57">
       <w:pPr>
         <w:pStyle w:val="28"/>
         <w:keepNext w:val="0"/>
@@ -2253,7 +2245,7 @@
         <w:t>本次乙方提供的交付产品包含下列几种（请勾选）：</w:t>
       </w:r>
     </w:p>
-    <w:p>
+    <w:p ns2:paraId="19790F3E">
       <w:pPr>
         <w:keepNext w:val="0"/>
         <w:keepLines w:val="0"/>
@@ -2295,7 +2287,7 @@
         <w:t>□标准版FastGPT-买断；</w:t>
       </w:r>
     </w:p>
-    <w:p>
+    <w:p ns2:paraId="2C72D1D3">
       <w:pPr>
         <w:keepNext w:val="0"/>
         <w:keepLines w:val="0"/>
@@ -2357,7 +2349,7 @@
         <w:t>；</w:t>
       </w:r>
     </w:p>
-    <w:p>
+    <w:p ns2:paraId="2BBE3D6B">
       <w:pPr>
         <w:keepNext w:val="0"/>
         <w:keepLines w:val="0"/>
@@ -2419,7 +2411,7 @@
         <w:t>版FastGPT-买断；</w:t>
       </w:r>
     </w:p>
-    <w:p>
+    <w:p ns2:paraId="37173567">
       <w:pPr>
         <w:keepNext w:val="0"/>
         <w:keepLines w:val="0"/>
@@ -2501,7 +2493,7 @@
         <w:t>；</w:t>
       </w:r>
     </w:p>
-    <w:p>
+    <w:p ns2:paraId="2C1A675D">
       <w:pPr>
         <w:keepNext w:val="0"/>
         <w:keepLines w:val="0"/>
@@ -2563,7 +2555,7 @@
         <w:t>版FastGPT-买断；</w:t>
       </w:r>
     </w:p>
-    <w:p>
+    <w:p ns2:paraId="4C27946E">
       <w:pPr>
         <w:keepNext w:val="0"/>
         <w:keepLines w:val="0"/>
@@ -2645,7 +2637,7 @@
         <w:t>；</w:t>
       </w:r>
     </w:p>
-    <w:p>
+    <w:p ns2:paraId="3D66A07E">
       <w:pPr>
         <w:keepNext w:val="0"/>
         <w:keepLines w:val="0"/>
@@ -2715,7 +2707,7 @@
         <w:t>；</w:t>
       </w:r>
     </w:p>
-    <w:p>
+    <w:p ns2:paraId="76457E96">
       <w:pPr>
         <w:pStyle w:val="28"/>
         <w:keepNext w:val="0"/>
@@ -2774,7 +2766,7 @@
         <w:t>：</w:t>
       </w:r>
     </w:p>
-    <w:p>
+    <w:p ns2:paraId="30DE35BC">
       <w:pPr>
         <w:keepNext w:val="0"/>
         <w:keepLines w:val="0"/>
@@ -2802,7 +2794,6 @@
           <w:kern w:val="2"/>
           <w:sz w:val="21"/>
           <w:szCs w:val="20"/>
-          <w:highlight w:val="lightGray"/>
           <w:lang w:val="en-US" w:eastAsia="zh-CN" w:bidi="ar-SA"/>
         </w:rPr>
       </w:pPr>
@@ -2822,19 +2813,16 @@
           <w:kern w:val="2"/>
           <w:sz w:val="21"/>
           <w:szCs w:val="20"/>
-          <w:highlight w:val="lightGray"/>
           <w:lang w:val="en-US" w:eastAsia="zh-CN" w:bidi="ar-SA"/>
         </w:rPr>
         <w:t>技术支持服务-基础版本；</w:t>
       </w:r>
       <w:r>
-        <w:rPr>
-          <w:highlight w:val="lightGray"/>
-        </w:rPr>
+        <w:rPr/>
         <w:commentReference w:id="1"/>
       </w:r>
     </w:p>
-    <w:p>
+    <w:p ns2:paraId="11E79AF3">
       <w:pPr>
         <w:keepNext w:val="0"/>
         <w:keepLines w:val="0"/>
@@ -2862,17 +2850,15 @@
           <w:kern w:val="2"/>
           <w:sz w:val="21"/>
           <w:szCs w:val="20"/>
-          <w:highlight w:val="lightGray"/>
-          <w:lang w:val="en-US" w:eastAsia="zh-CN" w:bidi="ar-SA"/>
-        </w:rPr>
-      </w:pPr>
-      <w:r>
-        <w:rPr>
-          <w:rFonts w:hint="eastAsia" w:ascii="Times New Roman" w:hAnsi="Times New Roman" w:eastAsia="宋体" w:cs="Times New Roman"/>
-          <w:kern w:val="2"/>
-          <w:sz w:val="21"/>
-          <w:szCs w:val="20"/>
-          <w:highlight w:val="lightGray"/>
+          <w:lang w:val="en-US" w:eastAsia="zh-CN" w:bidi="ar-SA"/>
+        </w:rPr>
+      </w:pPr>
+      <w:r>
+        <w:rPr>
+          <w:rFonts w:hint="eastAsia" w:ascii="Times New Roman" w:hAnsi="Times New Roman" w:eastAsia="宋体" w:cs="Times New Roman"/>
+          <w:kern w:val="2"/>
+          <w:sz w:val="21"/>
+          <w:szCs w:val="20"/>
           <w:lang w:val="en-US" w:eastAsia="zh-CN" w:bidi="ar-SA"/>
         </w:rPr>
         <w:t>□技术支持服务-</w:t>
@@ -2883,7 +2869,6 @@
           <w:kern w:val="2"/>
           <w:sz w:val="21"/>
           <w:szCs w:val="20"/>
-          <w:highlight w:val="lightGray"/>
           <w:lang w:val="en-US" w:eastAsia="zh-CN" w:bidi="ar-SA"/>
         </w:rPr>
         <w:t>进阶</w:t>
@@ -2894,13 +2879,12 @@
           <w:kern w:val="2"/>
           <w:sz w:val="21"/>
           <w:szCs w:val="20"/>
-          <w:highlight w:val="lightGray"/>
           <w:lang w:val="en-US" w:eastAsia="zh-CN" w:bidi="ar-SA"/>
         </w:rPr>
         <w:t>版本；</w:t>
       </w:r>
     </w:p>
-    <w:p>
+    <w:p ns2:paraId="79D62308">
       <w:pPr>
         <w:keepNext w:val="0"/>
         <w:keepLines w:val="0"/>
@@ -2928,17 +2912,15 @@
           <w:kern w:val="2"/>
           <w:sz w:val="21"/>
           <w:szCs w:val="20"/>
-          <w:highlight w:val="lightGray"/>
-          <w:lang w:val="en-US" w:eastAsia="zh-CN" w:bidi="ar-SA"/>
-        </w:rPr>
-      </w:pPr>
-      <w:r>
-        <w:rPr>
-          <w:rFonts w:hint="eastAsia" w:ascii="Times New Roman" w:hAnsi="Times New Roman" w:eastAsia="宋体" w:cs="Times New Roman"/>
-          <w:kern w:val="2"/>
-          <w:sz w:val="21"/>
-          <w:szCs w:val="20"/>
-          <w:highlight w:val="lightGray"/>
+          <w:lang w:val="en-US" w:eastAsia="zh-CN" w:bidi="ar-SA"/>
+        </w:rPr>
+      </w:pPr>
+      <w:r>
+        <w:rPr>
+          <w:rFonts w:hint="eastAsia" w:ascii="Times New Roman" w:hAnsi="Times New Roman" w:eastAsia="宋体" w:cs="Times New Roman"/>
+          <w:kern w:val="2"/>
+          <w:sz w:val="21"/>
+          <w:szCs w:val="20"/>
           <w:lang w:val="en-US" w:eastAsia="zh-CN" w:bidi="ar-SA"/>
         </w:rPr>
         <w:t>□技术支持服务-</w:t>
@@ -2949,7 +2931,6 @@
           <w:kern w:val="2"/>
           <w:sz w:val="21"/>
           <w:szCs w:val="20"/>
-          <w:highlight w:val="lightGray"/>
           <w:lang w:val="en-US" w:eastAsia="zh-CN" w:bidi="ar-SA"/>
         </w:rPr>
         <w:t>高级</w:t>
@@ -2960,13 +2941,12 @@
           <w:kern w:val="2"/>
           <w:sz w:val="21"/>
           <w:szCs w:val="20"/>
-          <w:highlight w:val="lightGray"/>
           <w:lang w:val="en-US" w:eastAsia="zh-CN" w:bidi="ar-SA"/>
         </w:rPr>
         <w:t>版本；</w:t>
       </w:r>
     </w:p>
-    <w:p>
+    <w:p ns2:paraId="79736B6C">
       <w:pPr>
         <w:keepNext w:val="0"/>
         <w:keepLines w:val="0"/>
@@ -3028,7 +3008,7 @@
         <w:t>定制开发；</w:t>
       </w:r>
     </w:p>
-    <w:p>
+    <w:p ns2:paraId="653B6355">
       <w:pPr>
         <w:keepNext w:val="0"/>
         <w:keepLines w:val="0"/>
@@ -3110,7 +3090,7 @@
         <w:t>；</w:t>
       </w:r>
     </w:p>
-    <w:p>
+    <w:p ns2:paraId="74B770A9">
       <w:pPr>
         <w:keepNext w:val="0"/>
         <w:keepLines w:val="0"/>
@@ -3172,7 +3152,7 @@
         <w:t>；</w:t>
       </w:r>
     </w:p>
-    <w:p>
+    <w:p ns2:paraId="027B9344">
       <w:pPr>
         <w:keepNext w:val="0"/>
         <w:keepLines w:val="0"/>
@@ -3245,7 +3225,7 @@
         <w:t>；</w:t>
       </w:r>
     </w:p>
-    <w:p>
+    <w:p ns2:paraId="3CBCEA3A">
       <w:pPr>
         <w:pStyle w:val="28"/>
         <w:keepNext w:val="0"/>
@@ -3364,7 +3344,7 @@
         <w:t>》</w:t>
       </w:r>
     </w:p>
-    <w:p>
+    <w:p ns2:paraId="6BF3C0A5">
       <w:pPr>
         <w:pStyle w:val="28"/>
         <w:keepNext w:val="0"/>
@@ -3402,7 +3382,7 @@
         <w:t>涉及第三方模型、云服务、网络、硬件、操作系统、浏览器、数据库、开源组件或甲方系统接口的，相关许可、账号、费用、合规责任及可用性风险由相应权利人或甲方承担，双方另有书面约定的除外。</w:t>
       </w:r>
     </w:p>
-    <w:p>
+    <w:p ns2:paraId="6E824E9A">
       <w:pPr>
         <w:pStyle w:val="2"/>
         <w:numPr>
@@ -3424,7 +3404,7 @@
         <w:t>合同服务期限、地点</w:t>
       </w:r>
     </w:p>
-    <w:p>
+    <w:p ns2:paraId="3113E1DB">
       <w:pPr>
         <w:pStyle w:val="28"/>
         <w:keepNext w:val="0"/>
@@ -3459,7 +3439,7 @@
         <w:t>服务期限：</w:t>
       </w:r>
     </w:p>
-    <w:p>
+    <w:p ns2:paraId="6BAA49AC">
       <w:pPr>
         <w:keepNext w:val="0"/>
         <w:keepLines w:val="0"/>
@@ -3703,7 +3683,7 @@
         <w:t>日；</w:t>
       </w:r>
     </w:p>
-    <w:p>
+    <w:p ns2:paraId="72791AF0">
       <w:pPr>
         <w:keepNext w:val="0"/>
         <w:keepLines w:val="0"/>
@@ -3848,7 +3828,7 @@
         <w:t>；</w:t>
       </w:r>
     </w:p>
-    <w:p>
+    <w:p ns2:paraId="2C43E66A">
       <w:pPr>
         <w:keepNext w:val="0"/>
         <w:keepLines w:val="0"/>
@@ -3953,7 +3933,7 @@
         <w:t>日）；</w:t>
       </w:r>
     </w:p>
-    <w:p>
+    <w:p ns2:paraId="21E308B2">
       <w:pPr>
         <w:keepNext w:val="0"/>
         <w:keepLines w:val="0"/>
@@ -4016,7 +3996,7 @@
         <w:t>；</w:t>
       </w:r>
     </w:p>
-    <w:p>
+    <w:p ns2:paraId="13FE3672">
       <w:pPr>
         <w:pStyle w:val="28"/>
         <w:keepNext w:val="0"/>
@@ -4051,7 +4031,7 @@
         <w:t>服务地点：</w:t>
       </w:r>
     </w:p>
-    <w:p>
+    <w:p ns2:paraId="52FDF056">
       <w:pPr>
         <w:keepNext w:val="0"/>
         <w:keepLines w:val="0"/>
@@ -4081,11 +4061,11 @@
           <w:sz w:val="21"/>
           <w:szCs w:val="20"/>
           <w:lang w:val="en-US" w:eastAsia="zh-CN" w:bidi="ar-SA"/>
-          <w14:textFill>
-            <w14:solidFill>
-              <w14:schemeClr w14:val="tx1"/>
-            </w14:solidFill>
-          </w14:textFill>
+          <ns2:textFill>
+            <ns2:solidFill>
+              <ns2:schemeClr ns2:val="tx1"/>
+            </ns2:solidFill>
+          </ns2:textFill>
         </w:rPr>
       </w:pPr>
       <w:r>
@@ -4120,7 +4100,7 @@
         <w:t>；</w:t>
       </w:r>
     </w:p>
-    <w:p>
+    <w:p ns2:paraId="1FE7F915">
       <w:pPr>
         <w:keepNext w:val="0"/>
         <w:keepLines w:val="0"/>
@@ -4162,7 +4142,7 @@
         <w:t>□远程交付服务；</w:t>
       </w:r>
     </w:p>
-    <w:p>
+    <w:p ns2:paraId="357E5D4D">
       <w:pPr>
         <w:keepNext w:val="0"/>
         <w:keepLines w:val="0"/>
@@ -4214,7 +4194,7 @@
         <w:t>；</w:t>
       </w:r>
     </w:p>
-    <w:p>
+    <w:p ns2:paraId="00AC6CA4">
       <w:pPr>
         <w:pStyle w:val="2"/>
         <w:numPr>
@@ -4236,7 +4216,7 @@
         <w:t>验收标准和方法</w:t>
       </w:r>
     </w:p>
-    <w:p>
+    <w:p ns2:paraId="5E8EE857">
       <w:pPr>
         <w:pStyle w:val="28"/>
         <w:keepNext w:val="0"/>
@@ -4293,7 +4273,7 @@
         <w:t>。</w:t>
       </w:r>
     </w:p>
-    <w:p>
+    <w:p ns2:paraId="64018896">
       <w:pPr>
         <w:pStyle w:val="28"/>
         <w:keepNext w:val="0"/>
@@ -4420,7 +4400,7 @@
         <w:t>。</w:t>
       </w:r>
     </w:p>
-    <w:p>
+    <w:p ns2:paraId="091B1BD5">
       <w:pPr>
         <w:pStyle w:val="28"/>
         <w:keepNext w:val="0"/>
@@ -4470,7 +4450,7 @@
         <w:t>。</w:t>
       </w:r>
     </w:p>
-    <w:p>
+    <w:p ns2:paraId="3F1A1474">
       <w:pPr>
         <w:pStyle w:val="28"/>
         <w:keepNext w:val="0"/>
@@ -4501,7 +4481,7 @@
         <w:t>验收时间和方式</w:t>
       </w:r>
     </w:p>
-    <w:p>
+    <w:p ns2:paraId="155B3DF1">
       <w:pPr>
         <w:pStyle w:val="28"/>
         <w:keepNext w:val="0"/>
@@ -4622,7 +4602,7 @@
         <w:t>日内书面提出，否则视为对验收结论无异议。</w:t>
       </w:r>
     </w:p>
-    <w:p>
+    <w:p ns2:paraId="4518AB8B">
       <w:pPr>
         <w:pStyle w:val="28"/>
         <w:keepNext w:val="0"/>
@@ -4674,7 +4654,6 @@
       <w:r>
         <w:rPr>
           <w:rFonts w:hint="eastAsia" w:ascii="Times New Roman" w:hAnsi="Times New Roman" w:eastAsia="宋体" w:cs="Times New Roman"/>
-          <w:highlight w:val="none"/>
           <w:lang w:val="en-US" w:eastAsia="zh-CN"/>
         </w:rPr>
         <w:t>根据第九条第二款的约定承担违约责任</w:t>
@@ -4687,7 +4666,7 @@
         <w:t>。</w:t>
       </w:r>
     </w:p>
-    <w:p>
+    <w:p ns2:paraId="52F8CBA2">
       <w:pPr>
         <w:pStyle w:val="28"/>
         <w:keepNext w:val="0"/>
@@ -4722,7 +4701,7 @@
         <w:t>因验收不合格造成乙方不能按时履行义务的，视为乙方履行迟延。</w:t>
       </w:r>
     </w:p>
-    <w:p>
+    <w:p ns2:paraId="0E4272F2">
       <w:pPr>
         <w:pStyle w:val="2"/>
         <w:numPr>
@@ -4744,7 +4723,7 @@
         <w:t>售后质保服务</w:t>
       </w:r>
     </w:p>
-    <w:p>
+    <w:p ns2:paraId="76C1054B">
       <w:pPr>
         <w:pStyle w:val="28"/>
         <w:keepNext w:val="0"/>
@@ -4832,7 +4811,6 @@
           <w:kern w:val="2"/>
           <w:sz w:val="21"/>
           <w:szCs w:val="20"/>
-          <w:highlight w:val="none"/>
           <w:u w:val="none"/>
           <w:lang w:val="en-US" w:eastAsia="zh-CN" w:bidi="ar-SA"/>
         </w:rPr>
@@ -4844,7 +4822,6 @@
           <w:kern w:val="2"/>
           <w:sz w:val="21"/>
           <w:szCs w:val="20"/>
-          <w:highlight w:val="none"/>
           <w:u w:val="none"/>
           <w:lang w:val="en-US" w:eastAsia="zh-CN" w:bidi="ar-SA"/>
         </w:rPr>
@@ -4856,7 +4833,6 @@
           <w:kern w:val="2"/>
           <w:sz w:val="21"/>
           <w:szCs w:val="20"/>
-          <w:highlight w:val="none"/>
           <w:u w:val="none"/>
           <w:lang w:val="en-US" w:eastAsia="zh-CN" w:bidi="ar-SA"/>
         </w:rPr>
@@ -4868,7 +4844,6 @@
           <w:kern w:val="2"/>
           <w:sz w:val="21"/>
           <w:szCs w:val="20"/>
-          <w:highlight w:val="none"/>
           <w:u w:val="none"/>
           <w:lang w:val="en-US" w:eastAsia="zh-CN" w:bidi="ar-SA"/>
         </w:rPr>
@@ -4880,7 +4855,6 @@
           <w:kern w:val="2"/>
           <w:sz w:val="21"/>
           <w:szCs w:val="20"/>
-          <w:highlight w:val="none"/>
           <w:u w:val="none"/>
           <w:lang w:val="en-US" w:eastAsia="zh-CN" w:bidi="ar-SA"/>
         </w:rPr>
@@ -4892,7 +4866,6 @@
           <w:kern w:val="2"/>
           <w:sz w:val="21"/>
           <w:szCs w:val="20"/>
-          <w:highlight w:val="none"/>
           <w:u w:val="none"/>
           <w:lang w:val="en-US" w:eastAsia="zh-CN" w:bidi="ar-SA"/>
         </w:rPr>
@@ -4904,7 +4877,6 @@
           <w:kern w:val="2"/>
           <w:sz w:val="21"/>
           <w:szCs w:val="20"/>
-          <w:highlight w:val="none"/>
           <w:u w:val="none"/>
           <w:lang w:val="en-US" w:eastAsia="zh-CN" w:bidi="ar-SA"/>
         </w:rPr>
@@ -4916,14 +4888,13 @@
           <w:kern w:val="2"/>
           <w:sz w:val="21"/>
           <w:szCs w:val="20"/>
-          <w:highlight w:val="none"/>
           <w:u w:val="none"/>
           <w:lang w:val="en-US" w:eastAsia="zh-CN" w:bidi="ar-SA"/>
         </w:rPr>
         <w:t>。</w:t>
       </w:r>
     </w:p>
-    <w:p>
+    <w:p ns2:paraId="71D92794">
       <w:pPr>
         <w:pStyle w:val="28"/>
         <w:keepNext w:val="0"/>
@@ -4972,7 +4943,7 @@
         <w:t>，价格由双方届时另行确定，乙方可以给予甲方一定优惠。</w:t>
       </w:r>
     </w:p>
-    <w:p>
+    <w:p ns2:paraId="369852B3">
       <w:pPr>
         <w:pStyle w:val="28"/>
         <w:keepNext w:val="0"/>
@@ -5052,7 +5023,7 @@
         <w:t>，具体费用及服务内容由双方届时协商确定。</w:t>
       </w:r>
     </w:p>
-    <w:p>
+    <w:p ns2:paraId="2BCC3644">
       <w:pPr>
         <w:pStyle w:val="28"/>
         <w:keepNext w:val="0"/>
@@ -5115,7 +5086,7 @@
         <w:t>。</w:t>
       </w:r>
     </w:p>
-    <w:p>
+    <w:p ns2:paraId="562AD578">
       <w:pPr>
         <w:pStyle w:val="28"/>
         <w:keepNext w:val="0"/>
@@ -5139,7 +5110,6 @@
         <w:textAlignment w:val="auto"/>
         <w:rPr>
           <w:rFonts w:hint="eastAsia" w:ascii="Times New Roman" w:hAnsi="Times New Roman" w:eastAsia="宋体" w:cs="Times New Roman"/>
-          <w:highlight w:val="lightGray"/>
           <w:lang w:val="en-US" w:eastAsia="zh-CN"/>
         </w:rPr>
       </w:pPr>
@@ -5159,13 +5129,12 @@
           <w:kern w:val="2"/>
           <w:sz w:val="21"/>
           <w:szCs w:val="24"/>
-          <w:highlight w:val="lightGray"/>
           <w:lang w:val="en-US" w:eastAsia="zh-CN" w:bidi="ar-SA"/>
         </w:rPr>
         <w:t>产生额外费用，需另行约定。</w:t>
       </w:r>
     </w:p>
-    <w:p>
+    <w:p ns2:paraId="43D19573">
       <w:pPr>
         <w:pStyle w:val="28"/>
         <w:keepNext w:val="0"/>
@@ -5235,7 +5204,7 @@
         <w:t>。统筹故障响应、BUG修复、技术支持。</w:t>
       </w:r>
     </w:p>
-    <w:p>
+    <w:p ns2:paraId="412F87E9">
       <w:pPr>
         <w:pStyle w:val="2"/>
         <w:numPr>
@@ -5257,7 +5226,7 @@
         <w:t>合同价格及支付</w:t>
       </w:r>
     </w:p>
-    <w:p>
+    <w:p ns2:paraId="7716D919">
       <w:pPr>
         <w:pStyle w:val="28"/>
         <w:keepNext w:val="0"/>
@@ -5388,7 +5357,7 @@
         <w:t>。</w:t>
       </w:r>
     </w:p>
-    <w:p>
+    <w:p ns2:paraId="61A6CAD8">
       <w:pPr>
         <w:pStyle w:val="28"/>
         <w:keepNext w:val="0"/>
@@ -5431,7 +5400,7 @@
         <w:t xml:space="preserve">支付条件及方式: </w:t>
       </w:r>
     </w:p>
-    <w:p>
+    <w:p ns2:paraId="5CD13274">
       <w:pPr>
         <w:pStyle w:val="28"/>
         <w:keepNext w:val="0"/>
@@ -5456,7 +5425,6 @@
         <w:rPr>
           <w:rFonts w:hint="default" w:ascii="Times New Roman" w:hAnsi="Times New Roman" w:eastAsia="宋体" w:cs="Times New Roman"/>
           <w:color w:val="C00000"/>
-          <w:highlight w:val="none"/>
           <w:u w:val="single"/>
           <w:lang w:val="en-US" w:eastAsia="zh-CN"/>
         </w:rPr>
@@ -5485,7 +5453,7 @@
         <w:t>。</w:t>
       </w:r>
     </w:p>
-    <w:p>
+    <w:p ns2:paraId="3D076DE3">
       <w:pPr>
         <w:pStyle w:val="28"/>
         <w:keepNext w:val="0"/>
@@ -5560,7 +5528,7 @@
         <w:t>。</w:t>
       </w:r>
     </w:p>
-    <w:p>
+    <w:p ns2:paraId="444C9A35">
       <w:pPr>
         <w:pStyle w:val="28"/>
         <w:keepNext w:val="0"/>
@@ -5595,7 +5563,7 @@
         <w:t xml:space="preserve">结算方式:  转账/电汇 </w:t>
       </w:r>
     </w:p>
-    <w:p>
+    <w:p ns2:paraId="29777BFF">
       <w:pPr>
         <w:pStyle w:val="28"/>
         <w:keepNext w:val="0"/>
@@ -5630,7 +5598,7 @@
         <w:t>发票类型:</w:t>
       </w:r>
     </w:p>
-    <w:p>
+    <w:p ns2:paraId="3DAB832F">
       <w:pPr>
         <w:pStyle w:val="28"/>
         <w:keepNext w:val="0"/>
@@ -5665,7 +5633,7 @@
         <w:t xml:space="preserve">□增值税专用发票  </w:t>
       </w:r>
     </w:p>
-    <w:p>
+    <w:p ns2:paraId="22C5EA2D">
       <w:pPr>
         <w:pStyle w:val="28"/>
         <w:keepNext w:val="0"/>
@@ -5700,7 +5668,7 @@
         <w:t xml:space="preserve">□增值税普通发票                         </w:t>
       </w:r>
     </w:p>
-    <w:p>
+    <w:p ns2:paraId="58B2BC88">
       <w:pPr>
         <w:pStyle w:val="28"/>
         <w:keepNext w:val="0"/>
@@ -5735,7 +5703,7 @@
         <w:t>乙方银行账户信息</w:t>
       </w:r>
     </w:p>
-    <w:p>
+    <w:p ns2:paraId="2F79D67D">
       <w:pPr>
         <w:pStyle w:val="28"/>
         <w:keepNext w:val="0"/>
@@ -5779,7 +5747,7 @@
         <w:t xml:space="preserve">                         </w:t>
       </w:r>
     </w:p>
-    <w:p>
+    <w:p ns2:paraId="2BDBAB2D">
       <w:pPr>
         <w:pStyle w:val="28"/>
         <w:keepNext w:val="0"/>
@@ -5829,7 +5797,7 @@
         <w:t xml:space="preserve">                         </w:t>
       </w:r>
     </w:p>
-    <w:p>
+    <w:p ns2:paraId="1A833BD6">
       <w:pPr>
         <w:pStyle w:val="28"/>
         <w:keepNext w:val="0"/>
@@ -5879,7 +5847,7 @@
         <w:t xml:space="preserve">                         </w:t>
       </w:r>
     </w:p>
-    <w:p>
+    <w:p ns2:paraId="3C183731">
       <w:pPr>
         <w:pStyle w:val="28"/>
         <w:keepNext w:val="0"/>
@@ -5929,7 +5897,7 @@
         <w:t xml:space="preserve">                         </w:t>
       </w:r>
     </w:p>
-    <w:p>
+    <w:p ns2:paraId="412374B8">
       <w:pPr>
         <w:pStyle w:val="28"/>
         <w:keepNext w:val="0"/>
@@ -5964,7 +5932,7 @@
         <w:t>甲方开票信息</w:t>
       </w:r>
     </w:p>
-    <w:p>
+    <w:p ns2:paraId="0835FE84">
       <w:pPr>
         <w:pStyle w:val="28"/>
         <w:keepNext w:val="0"/>
@@ -6014,7 +5982,7 @@
         <w:t xml:space="preserve">                         </w:t>
       </w:r>
     </w:p>
-    <w:p>
+    <w:p ns2:paraId="03644B73">
       <w:pPr>
         <w:pStyle w:val="28"/>
         <w:keepNext w:val="0"/>
@@ -6064,7 +6032,7 @@
         <w:t xml:space="preserve">                         </w:t>
       </w:r>
     </w:p>
-    <w:p>
+    <w:p ns2:paraId="5FD3CEC2">
       <w:pPr>
         <w:pStyle w:val="28"/>
         <w:keepNext w:val="0"/>
@@ -6114,7 +6082,7 @@
         <w:t xml:space="preserve">                         </w:t>
       </w:r>
     </w:p>
-    <w:p>
+    <w:p ns2:paraId="6196C9AB">
       <w:pPr>
         <w:pStyle w:val="28"/>
         <w:keepNext w:val="0"/>
@@ -6164,7 +6132,7 @@
         <w:t xml:space="preserve">                         </w:t>
       </w:r>
     </w:p>
-    <w:p>
+    <w:p ns2:paraId="755FB4BA">
       <w:pPr>
         <w:pStyle w:val="28"/>
         <w:keepNext w:val="0"/>
@@ -6214,7 +6182,7 @@
         <w:t xml:space="preserve">                         </w:t>
       </w:r>
     </w:p>
-    <w:p>
+    <w:p ns2:paraId="4048D67D">
       <w:pPr>
         <w:pStyle w:val="28"/>
         <w:keepNext w:val="0"/>
@@ -6265,7 +6233,7 @@
         <w:t xml:space="preserve">         </w:t>
       </w:r>
     </w:p>
-    <w:p>
+    <w:p ns2:paraId="545D548F">
       <w:pPr>
         <w:pStyle w:val="2"/>
         <w:numPr>
@@ -6290,7 +6258,7 @@
         <w:t>双方权利与义务</w:t>
       </w:r>
     </w:p>
-    <w:p>
+    <w:p ns2:paraId="3B02A1C7">
       <w:pPr>
         <w:pStyle w:val="28"/>
         <w:keepNext w:val="0"/>
@@ -6333,7 +6301,7 @@
         <w:t>甲方权利与义务</w:t>
       </w:r>
     </w:p>
-    <w:p>
+    <w:p ns2:paraId="23146F24">
       <w:pPr>
         <w:pStyle w:val="28"/>
         <w:keepNext w:val="0"/>
@@ -6376,7 +6344,7 @@
         <w:t>甲方有义务按合同约定向乙方支付合同款。</w:t>
       </w:r>
     </w:p>
-    <w:p>
+    <w:p ns2:paraId="0A0D6E35">
       <w:pPr>
         <w:pStyle w:val="28"/>
         <w:keepNext w:val="0"/>
@@ -6465,7 +6433,7 @@
         <w:t>因甲方未及时提供资料、账号、网络、服务器、域名、SSL证书、模型API、测试数据、业务确认、第三方系统接口或其他必要配合，导致乙方无法按期交付的，交付期限相应顺延，乙方不承担逾期责任；因此产生的额外工作量或费用，由双方另行确认。</w:t>
       </w:r>
     </w:p>
-    <w:p>
+    <w:p ns2:paraId="1284F08F">
       <w:pPr>
         <w:pStyle w:val="28"/>
         <w:keepNext w:val="0"/>
@@ -6534,7 +6502,7 @@
         <w:t>软件的使用授权。</w:t>
       </w:r>
     </w:p>
-    <w:p>
+    <w:p ns2:paraId="68DD7363">
       <w:pPr>
         <w:pStyle w:val="28"/>
         <w:keepNext w:val="0"/>
@@ -6578,7 +6546,7 @@
         <w:t>甲方应指派一名代表，与乙方进行及时联络，并按双方商定的时间，定期与乙方代表举行会议。</w:t>
       </w:r>
     </w:p>
-    <w:p>
+    <w:p ns2:paraId="3BC10ADB">
       <w:pPr>
         <w:pStyle w:val="28"/>
         <w:keepNext w:val="0"/>
@@ -6692,7 +6660,7 @@
         <w:t>。</w:t>
       </w:r>
     </w:p>
-    <w:p>
+    <w:p ns2:paraId="2D2DCAFA">
       <w:pPr>
         <w:pStyle w:val="28"/>
         <w:keepNext w:val="0"/>
@@ -6778,7 +6746,7 @@
         <w:t>。</w:t>
       </w:r>
     </w:p>
-    <w:p>
+    <w:p ns2:paraId="3BCEED63">
       <w:pPr>
         <w:keepNext/>
         <w:keepLines w:val="0"/>
@@ -6822,7 +6790,7 @@
         <w:t>其他本合同约定的权利和义务。</w:t>
       </w:r>
     </w:p>
-    <w:p>
+    <w:p ns2:paraId="32BE6A20">
       <w:pPr>
         <w:pStyle w:val="28"/>
         <w:keepNext w:val="0"/>
@@ -6865,7 +6833,7 @@
         <w:t>乙方权利与义务</w:t>
       </w:r>
     </w:p>
-    <w:p>
+    <w:p ns2:paraId="772639AF">
       <w:pPr>
         <w:pStyle w:val="28"/>
         <w:keepNext w:val="0"/>
@@ -6908,7 +6876,7 @@
         <w:t>乙方有权依据本合同约定获取相应的报酬。</w:t>
       </w:r>
     </w:p>
-    <w:p>
+    <w:p ns2:paraId="5B18CAAE">
       <w:pPr>
         <w:pStyle w:val="28"/>
         <w:keepNext w:val="0"/>
@@ -6971,7 +6939,7 @@
         <w:t>监督、协调技术服务的执行情况。</w:t>
       </w:r>
     </w:p>
-    <w:p>
+    <w:p ns2:paraId="0833343E">
       <w:pPr>
         <w:pStyle w:val="28"/>
         <w:keepNext w:val="0"/>
@@ -7096,7 +7064,7 @@
         <w:t>。</w:t>
       </w:r>
     </w:p>
-    <w:p>
+    <w:p ns2:paraId="155D18D0">
       <w:pPr>
         <w:pStyle w:val="28"/>
         <w:keepNext w:val="0"/>
@@ -7172,7 +7140,7 @@
         <w:t>。</w:t>
       </w:r>
     </w:p>
-    <w:p>
+    <w:p ns2:paraId="7BC2E78B">
       <w:pPr>
         <w:pStyle w:val="28"/>
         <w:keepNext w:val="0"/>
@@ -7259,7 +7227,7 @@
         <w:t>验收。</w:t>
       </w:r>
     </w:p>
-    <w:p>
+    <w:p ns2:paraId="6557C93D">
       <w:pPr>
         <w:pStyle w:val="28"/>
         <w:keepNext w:val="0"/>
@@ -7302,7 +7270,7 @@
         <w:t>乙方应妥善保管和使用甲方提供或为本项目服务设置的相关账户和密码。本合同履行完毕后，乙方应当销毁所有与甲方或甲方项目有关的账户与密码。非经甲方同意，乙方及乙方人员不得再次登录相关系统、软件、程序等。</w:t>
       </w:r>
     </w:p>
-    <w:p>
+    <w:p ns2:paraId="51BB45AC">
       <w:pPr>
         <w:pStyle w:val="28"/>
         <w:keepNext w:val="0"/>
@@ -7345,7 +7313,7 @@
         <w:t>其他本合同约定的权利和义务。</w:t>
       </w:r>
     </w:p>
-    <w:p>
+    <w:p ns2:paraId="512D2CF8">
       <w:pPr>
         <w:pStyle w:val="2"/>
         <w:numPr>
@@ -7369,7 +7337,7 @@
         <w:t>知识产权及保密</w:t>
       </w:r>
     </w:p>
-    <w:p>
+    <w:p ns2:paraId="3A8CC7D8">
       <w:pPr>
         <w:pStyle w:val="28"/>
         <w:keepNext w:val="0"/>
@@ -7412,7 +7380,7 @@
         <w:t>知识产权</w:t>
       </w:r>
     </w:p>
-    <w:p>
+    <w:p ns2:paraId="425A2FA5">
       <w:pPr>
         <w:pStyle w:val="28"/>
         <w:keepNext w:val="0"/>
@@ -7455,7 +7423,7 @@
         <w:t>平台及相关软件、程序、页面、文档、技术方案、接口、商标、标识、算法、架构及其他知识产权归乙方或相关权利人所有。</w:t>
       </w:r>
     </w:p>
-    <w:p>
+    <w:p ns2:paraId="0A3B4E5A">
       <w:pPr>
         <w:pStyle w:val="28"/>
         <w:keepNext w:val="0"/>
@@ -7498,7 +7466,7 @@
         <w:t>甲方因本合同取得的是在约定范围内使用服务的权利,不取得平台或相关技术成果的所有权、源代码、复制权、转授权权利或其他未明确授予的权利。</w:t>
       </w:r>
     </w:p>
-    <w:p>
+    <w:p ns2:paraId="572A6AEB">
       <w:pPr>
         <w:keepNext/>
         <w:keepLines w:val="0"/>
@@ -7547,7 +7515,7 @@
         <w:t>行为,但法律法规另有强制性规定的除外。</w:t>
       </w:r>
     </w:p>
-    <w:p>
+    <w:p ns2:paraId="3810C919">
       <w:pPr>
         <w:keepNext/>
         <w:keepLines w:val="0"/>
@@ -7577,7 +7545,6 @@
           <w:bCs w:val="0"/>
           <w:sz w:val="21"/>
           <w:szCs w:val="21"/>
-          <w:highlight w:val="lightGray"/>
           <w:lang w:val="en-US" w:eastAsia="zh-CN"/>
         </w:rPr>
       </w:pPr>
@@ -7589,15 +7556,12 @@
           <w:kern w:val="2"/>
           <w:sz w:val="21"/>
           <w:szCs w:val="21"/>
-          <w:highlight w:val="lightGray"/>
           <w:lang w:val="en-US" w:eastAsia="zh-CN" w:bidi="ar-SA"/>
         </w:rPr>
         <w:t>甲方基于 FastGPT 平台自行创建并实际用于其业务场景的具体业务应用及其中由甲方提供或形成的业务数据、知识库内容、提示词配置、业务流程和应用配置方案，其合法权益归甲方所有。但除双方另有书面约定外，甲方不因创建、配置或使用该等业务应用而取得 FastGPT 平台、底层软件、算法模型、通用组件、接口能力、系统架构、技术文档、产品名称、商标及乙方既有技术成果的所有权、知识产权或其他未明确授予的权利</w:t>
       </w:r>
       <w:r>
-        <w:rPr>
-          <w:highlight w:val="lightGray"/>
-        </w:rPr>
+        <w:rPr/>
         <w:commentReference w:id="2"/>
       </w:r>
       <w:r>
@@ -7608,13 +7572,12 @@
           <w:kern w:val="2"/>
           <w:sz w:val="21"/>
           <w:szCs w:val="21"/>
-          <w:highlight w:val="lightGray"/>
           <w:lang w:val="en-US" w:eastAsia="zh-CN" w:bidi="ar-SA"/>
         </w:rPr>
         <w:t>。</w:t>
       </w:r>
     </w:p>
-    <w:p>
+    <w:p ns2:paraId="74501E17">
       <w:pPr>
         <w:pStyle w:val="28"/>
         <w:keepNext w:val="0"/>
@@ -7657,7 +7620,7 @@
         <w:t>保密义务</w:t>
       </w:r>
     </w:p>
-    <w:p>
+    <w:p ns2:paraId="2064D6BF">
       <w:pPr>
         <w:keepLines w:val="0"/>
         <w:pageBreakBefore w:val="0"/>
@@ -7686,7 +7649,7 @@
         <w:t>双方应对在合同履行过程中知悉的对方保密信息予以保密。本协议项下的“保密信息”包括但不限于本合同价款及商务条款、与本项目相关的所有技术、经营、财务信息、商业秘密、技术秘密等信息，包括但不限于：源代码、设计图纸、工艺流程、客户名单、采购价格、合同价款。但不包括：（1）根据乙方的文件和记录所示，甲方披露前，乙方即已掌握的；（2）已为公众所知悉或将会知悉的任何信息或非因乙方不当行为而成为公众所知悉的信息。尽管有前述规定，在以下情况下，乙方可披露相关保密信息：（1）取得甲方事先书面同意；（2）根据法院、政府部门或其他有权机关的合法要求而必须披露的。</w:t>
       </w:r>
     </w:p>
-    <w:p>
+    <w:p ns2:paraId="7360ED17">
       <w:pPr>
         <w:keepNext w:val="0"/>
         <w:keepLines w:val="0"/>
@@ -7722,7 +7685,7 @@
         <w:t>除上述限制规定外，本协议项下的条款本身亦属于双方的保密信息。</w:t>
       </w:r>
     </w:p>
-    <w:p>
+    <w:p ns2:paraId="23E2EAD8">
       <w:pPr>
         <w:keepNext w:val="0"/>
         <w:keepLines w:val="0"/>
@@ -7762,7 +7725,7 @@
         <w:t>对于所涉保密信息，未经对方书面同意，不得向任何第三方泄露、传播或转让，不得擅自复制、修改、传播或进行反向工程、反向编译、反向汇编等。</w:t>
       </w:r>
     </w:p>
-    <w:p>
+    <w:p ns2:paraId="627C4A76">
       <w:pPr>
         <w:keepNext w:val="0"/>
         <w:keepLines w:val="0"/>
@@ -7799,7 +7762,7 @@
         <w:t>本协议项下的保密义务为持续性义务，不因本协议的终止而解除；但如相关保密信息经合法途径成为公开信息，则对该部分信息的保密义务自动终止。</w:t>
       </w:r>
     </w:p>
-    <w:p>
+    <w:p ns2:paraId="60DC6E00">
       <w:pPr>
         <w:pStyle w:val="2"/>
         <w:numPr>
@@ -7821,7 +7784,7 @@
         <w:t>违约责任</w:t>
       </w:r>
     </w:p>
-    <w:p>
+    <w:p ns2:paraId="74DC9936">
       <w:pPr>
         <w:keepNext/>
         <w:keepLines w:val="0"/>
@@ -7870,14 +7833,13 @@
         <w:rPr>
           <w:rFonts w:hint="eastAsia" w:cs="Times New Roman"/>
           <w:color w:val="000000" w:themeColor="text1"/>
-          <w:highlight w:val="none"/>
           <w:u w:val="none"/>
           <w:lang w:val="en-US" w:eastAsia="zh-CN"/>
-          <w14:textFill>
-            <w14:solidFill>
-              <w14:schemeClr w14:val="tx1"/>
-            </w14:solidFill>
-          </w14:textFill>
+          <ns2:textFill>
+            <ns2:solidFill>
+              <ns2:schemeClr ns2:val="tx1"/>
+            </ns2:solidFill>
+          </ns2:textFill>
         </w:rPr>
         <w:t>工作</w:t>
       </w:r>
@@ -7901,7 +7863,6 @@
           <w:kern w:val="2"/>
           <w:sz w:val="21"/>
           <w:szCs w:val="20"/>
-          <w:highlight w:val="yellow"/>
           <w:u w:val="single"/>
           <w:lang w:val="en-US" w:eastAsia="zh-CN" w:bidi="ar-SA"/>
         </w:rPr>
@@ -7915,7 +7876,6 @@
           <w:kern w:val="2"/>
           <w:sz w:val="21"/>
           <w:szCs w:val="20"/>
-          <w:highlight w:val="yellow"/>
           <w:u w:val="single"/>
           <w:lang w:val="en-US" w:eastAsia="zh-CN" w:bidi="ar-SA"/>
         </w:rPr>
@@ -7929,7 +7889,6 @@
           <w:kern w:val="2"/>
           <w:sz w:val="21"/>
           <w:szCs w:val="20"/>
-          <w:highlight w:val="yellow"/>
           <w:u w:val="single"/>
           <w:lang w:val="en-US" w:eastAsia="zh-CN" w:bidi="ar-SA"/>
         </w:rPr>
@@ -7964,14 +7923,13 @@
         <w:rPr>
           <w:rFonts w:hint="eastAsia" w:cs="Times New Roman"/>
           <w:color w:val="000000" w:themeColor="text1"/>
-          <w:highlight w:val="none"/>
           <w:u w:val="none"/>
           <w:lang w:val="en-US" w:eastAsia="zh-CN"/>
-          <w14:textFill>
-            <w14:solidFill>
-              <w14:schemeClr w14:val="tx1"/>
-            </w14:solidFill>
-          </w14:textFill>
+          <ns2:textFill>
+            <ns2:solidFill>
+              <ns2:schemeClr ns2:val="tx1"/>
+            </ns2:solidFill>
+          </ns2:textFill>
         </w:rPr>
         <w:t>工作</w:t>
       </w:r>
@@ -8008,7 +7966,6 @@
           <w:kern w:val="2"/>
           <w:sz w:val="21"/>
           <w:szCs w:val="20"/>
-          <w:highlight w:val="yellow"/>
           <w:u w:val="single"/>
           <w:lang w:val="en-US" w:eastAsia="zh-CN" w:bidi="ar-SA"/>
         </w:rPr>
@@ -8027,7 +7984,7 @@
         <w:t>向乙方支付违约金。</w:t>
       </w:r>
     </w:p>
-    <w:p>
+    <w:p ns2:paraId="67B8D238">
       <w:pPr>
         <w:keepNext/>
         <w:keepLines w:val="0"/>
@@ -8094,14 +8051,13 @@
         <w:rPr>
           <w:rFonts w:hint="eastAsia" w:cs="Times New Roman"/>
           <w:color w:val="000000" w:themeColor="text1"/>
-          <w:highlight w:val="none"/>
           <w:u w:val="none"/>
           <w:lang w:val="en-US" w:eastAsia="zh-CN"/>
-          <w14:textFill>
-            <w14:solidFill>
-              <w14:schemeClr w14:val="tx1"/>
-            </w14:solidFill>
-          </w14:textFill>
+          <ns2:textFill>
+            <ns2:solidFill>
+              <ns2:schemeClr ns2:val="tx1"/>
+            </ns2:solidFill>
+          </ns2:textFill>
         </w:rPr>
         <w:t>工作</w:t>
       </w:r>
@@ -8147,7 +8103,6 @@
           <w:kern w:val="2"/>
           <w:sz w:val="21"/>
           <w:szCs w:val="20"/>
-          <w:highlight w:val="yellow"/>
           <w:u w:val="single"/>
           <w:lang w:val="en-US" w:eastAsia="zh-CN" w:bidi="ar-SA"/>
         </w:rPr>
@@ -8180,7 +8135,6 @@
           <w:kern w:val="2"/>
           <w:sz w:val="21"/>
           <w:szCs w:val="21"/>
-          <w:highlight w:val="yellow"/>
           <w:u w:val="single"/>
           <w:lang w:val="en-US" w:eastAsia="zh-CN" w:bidi="ar"/>
         </w:rPr>
@@ -8198,7 +8152,7 @@
         <w:t>。</w:t>
       </w:r>
     </w:p>
-    <w:p>
+    <w:p ns2:paraId="332436E8">
       <w:pPr>
         <w:keepNext/>
         <w:keepLines w:val="0"/>
@@ -8274,7 +8228,6 @@
           <w:kern w:val="2"/>
           <w:sz w:val="21"/>
           <w:szCs w:val="21"/>
-          <w:highlight w:val="yellow"/>
           <w:lang w:val="en-US" w:eastAsia="zh-CN" w:bidi="ar"/>
         </w:rPr>
         <w:t>%</w:t>
@@ -8295,7 +8248,6 @@
           <w:kern w:val="2"/>
           <w:sz w:val="21"/>
           <w:szCs w:val="21"/>
-          <w:highlight w:val="lightGray"/>
           <w:lang w:val="en-US" w:eastAsia="zh-CN" w:bidi="ar"/>
         </w:rPr>
         <w:commentReference w:id="3"/>
@@ -8306,13 +8258,12 @@
           <w:kern w:val="2"/>
           <w:sz w:val="21"/>
           <w:szCs w:val="21"/>
-          <w:highlight w:val="lightGray"/>
           <w:lang w:val="en-US" w:eastAsia="zh-CN" w:bidi="ar"/>
         </w:rPr>
         <w:t>合同提前终止的，双方应按实际履行情况进行结算，非乙方原因造成合同终止的，乙方有权就已履约部分收取对应的合同款项。</w:t>
       </w:r>
     </w:p>
-    <w:p>
+    <w:p ns2:paraId="66C24DB1">
       <w:pPr>
         <w:keepNext/>
         <w:keepLines w:val="0"/>
@@ -8426,7 +8377,7 @@
         <w:t>。</w:t>
       </w:r>
     </w:p>
-    <w:p>
+    <w:p ns2:paraId="7FDF7D0D">
       <w:pPr>
         <w:keepNext/>
         <w:keepLines w:val="0"/>
@@ -8471,7 +8422,7 @@
         <w:t>因第三方大模型、云服务、网络、硬件、操作系统、浏览器、数据库、开源组件、甲方系统接口或甲方数据质量等非乙方可控原因导致的服务不可用、输出异常、性能下降或安全问题，不视为乙方违约；但乙方应在其合理能力范围内提供排查、说明和替代方案建议。</w:t>
       </w:r>
     </w:p>
-    <w:p>
+    <w:p ns2:paraId="599DCA52">
       <w:pPr>
         <w:pStyle w:val="2"/>
         <w:numPr>
@@ -8493,7 +8444,7 @@
         <w:t>不可抗力</w:t>
       </w:r>
     </w:p>
-    <w:p>
+    <w:p ns2:paraId="602CF34B">
       <w:pPr>
         <w:keepNext/>
         <w:keepLines w:val="0"/>
@@ -8537,7 +8488,7 @@
         <w:t>如果任何一方在全部执行或部分执行过程中，因为“不可抗力”而受阻或延迟，即被视为发生了“不可抗力”事件。“不可抗力”指超出双方控制能力的原因、环境或事件，包括洪水、火灾、台风、地震、战争或其它类似性质的超出该方控制能力的原因，其程度为即使该方经过努力仍然受阻或延迟。只要不可抗力事件阻止或延迟合同的执行，合同规定的原责任方应在事件发生后的五个工作日内，应向另一方解释不能执行或延迟该合同的全部或部分之原因，以及出示合法机构签发的证明材料。</w:t>
       </w:r>
     </w:p>
-    <w:p>
+    <w:p ns2:paraId="467D6C25">
       <w:pPr>
         <w:keepNext/>
         <w:keepLines w:val="0"/>
@@ -8592,7 +8543,7 @@
         <w:t>因不可抗力不能履行合同的，根据不可抗力的影响，部分或者全部免除责任，但法律另有规定的除外。当事人迟延履行后发生不可抗力的，不能免除责任。如以上情况发生，双方应及时协商并尽力争取挽救措施，并就本合同的执行达成谅解备忘录，以避免双方的更大损失。</w:t>
       </w:r>
     </w:p>
-    <w:p>
+    <w:p ns2:paraId="25EA7876">
       <w:pPr>
         <w:pStyle w:val="2"/>
         <w:numPr>
@@ -8614,7 +8565,7 @@
         <w:t>法律适用和争议解决</w:t>
       </w:r>
     </w:p>
-    <w:p>
+    <w:p ns2:paraId="25D1F0C3">
       <w:pPr>
         <w:bidi w:val="0"/>
         <w:rPr>
@@ -8629,7 +8580,7 @@
         <w:t>本合同适用中华人民共和国法律（不包括中国香港、中国澳门、中国台湾地区法律）。</w:t>
       </w:r>
     </w:p>
-    <w:p>
+    <w:p ns2:paraId="32CAE8C5">
       <w:pPr>
         <w:bidi w:val="0"/>
         <w:rPr>
@@ -8644,7 +8595,7 @@
         <w:t>在本合同履行过程中发生争议，双方应当友好协商解决，双方友好协商未成，双方同意将争议提交至甲方所在地法院裁决。诉讼进行过程中，双方应继续履行本合同未涉及诉讼的其他部分。</w:t>
       </w:r>
     </w:p>
-    <w:p>
+    <w:p ns2:paraId="5673FB01">
       <w:pPr>
         <w:pStyle w:val="2"/>
         <w:numPr>
@@ -8666,7 +8617,7 @@
         <w:t>通知与送达</w:t>
       </w:r>
     </w:p>
-    <w:p>
+    <w:p ns2:paraId="4BA20689">
       <w:pPr>
         <w:keepNext w:val="0"/>
         <w:keepLines w:val="0"/>
@@ -8697,7 +8648,7 @@
         <w:t>合同首页双方联系地址、双方联系人、联系电话、电子邮箱为双方有效通讯信息，本合同项下及与本合同有关的所有的通知及联络应以书面形式作出，并按照本合同中的首页约定的通讯信息向对方送达。本合同中的首页约定的通讯信息适用范围包括双方协议履行时各类通知、协议等文件以及就协议发生纠纷时相关文件和法律文书（包括但不限于在争议进入仲裁、民事诉讼程序后的一审、二审、再审和执行程序的司法文书）的送达、接收。</w:t>
       </w:r>
     </w:p>
-    <w:p>
+    <w:p ns2:paraId="51202476">
       <w:pPr>
         <w:keepNext w:val="0"/>
         <w:keepLines w:val="0"/>
@@ -8732,7 +8683,7 @@
         <w:t>对于任何通知或联络，如直接交付，在交付时视为收讫；如用电子邮箱，在发信服务器上所记录的发出时间视为送达时间；如用挂号信邮寄，在寄出五天后视为收讫；如以特快专递方式邮寄，则在寄出后第三天后即视为送达。</w:t>
       </w:r>
     </w:p>
-    <w:p>
+    <w:p ns2:paraId="1E299778">
       <w:pPr>
         <w:keepNext w:val="0"/>
         <w:keepLines w:val="0"/>
@@ -8767,7 +8718,7 @@
         <w:t>本合同执行期限内，任何一方有权改变相关通讯信息，变更应及时书面通知另一方，在变更通知送达另一方前，变更前的通讯信息仍视为有效联系方式。 因提供或者确认的送达方式不准确、送达方式变更后未及时依程序告知对方或指定的接收人拒绝签收等原因，导致协议相关文件、法律文书未能被实际接收的，双方同意仍视为已有效送达且以文书被退回之日视为送达之日。</w:t>
       </w:r>
     </w:p>
-    <w:p>
+    <w:p ns2:paraId="20037888">
       <w:pPr>
         <w:keepNext w:val="0"/>
         <w:keepLines w:val="0"/>
@@ -8800,7 +8751,7 @@
         <w:t>本合同中送达条款为独立条款，不受协议无效、变更或撤销的影响。</w:t>
       </w:r>
     </w:p>
-    <w:p>
+    <w:p ns2:paraId="11379DB9">
       <w:pPr>
         <w:pStyle w:val="2"/>
         <w:numPr>
@@ -8822,7 +8773,7 @@
         <w:t>合同生效</w:t>
       </w:r>
     </w:p>
-    <w:p>
+    <w:p ns2:paraId="20EBDD6C">
       <w:pPr>
         <w:keepNext/>
         <w:keepLines w:val="0"/>
@@ -8866,7 +8817,7 @@
         <w:t>双方同意采取以下第 1种合同生效方式</w:t>
       </w:r>
     </w:p>
-    <w:p>
+    <w:p ns2:paraId="659105AE">
       <w:pPr>
         <w:keepNext w:val="0"/>
         <w:keepLines w:val="0"/>
@@ -8912,7 +8863,6 @@
           <w:kern w:val="2"/>
           <w:sz w:val="21"/>
           <w:szCs w:val="21"/>
-          <w:highlight w:val="yellow"/>
           <w:u w:val="single"/>
           <w:lang w:val="en-US" w:eastAsia="zh-CN" w:bidi="ar"/>
         </w:rPr>
@@ -8934,7 +8884,6 @@
           <w:kern w:val="2"/>
           <w:sz w:val="21"/>
           <w:szCs w:val="21"/>
-          <w:highlight w:val="yellow"/>
           <w:u w:val="single"/>
           <w:lang w:val="en-US" w:eastAsia="zh-CN" w:bidi="ar"/>
         </w:rPr>
@@ -8951,7 +8900,7 @@
         <w:t>份，均具同等的法律效力；</w:t>
       </w:r>
     </w:p>
-    <w:p>
+    <w:p ns2:paraId="60015117">
       <w:pPr>
         <w:keepNext w:val="0"/>
         <w:keepLines w:val="0"/>
@@ -8992,7 +8941,7 @@
         <w:t>2、电子签章方式：本合同由双方采取电子签章方式签署，自双方盖章后生效，经签署的电子文档为原件，打印件或其他纸件与原件有冲突时，以原件为准。为免歧义，经电子签署的电子文档，属于书面形式的文档。</w:t>
       </w:r>
     </w:p>
-    <w:p>
+    <w:p ns2:paraId="143F139E">
       <w:pPr>
         <w:keepNext/>
         <w:keepLines w:val="0"/>
@@ -9036,7 +8985,7 @@
         <w:t>在履行合同过程中对于具体内容需要变更的，由签约双方另行协商并书面约定，作为本合同的变更文本，与本合同具有同等法律效力。</w:t>
       </w:r>
     </w:p>
-    <w:p>
+    <w:p ns2:paraId="0C83FCEC">
       <w:pPr>
         <w:keepNext/>
         <w:keepLines w:val="0"/>
@@ -9124,7 +9073,7 @@
         <w:t>日内结清，否则按逾期付款处理。如乙方未在规定时间结清，乙方同意甲方有权直接从应付货款中扣除。</w:t>
       </w:r>
     </w:p>
-    <w:p>
+    <w:p ns2:paraId="1AB48963">
       <w:pPr>
         <w:keepNext/>
         <w:keepLines w:val="0"/>
@@ -9164,7 +9113,7 @@
         <w:t>甲方致力于保障风清气正的商业环境，严厉打击任何有违良好合作氛围的行为，甲方统一举报投诉受理渠道：</w:t>
       </w:r>
     </w:p>
-    <w:p>
+    <w:p ns2:paraId="3DD0DE7D">
       <w:pPr>
         <w:spacing w:line="440" w:lineRule="exact"/>
         <w:ind w:left="0" w:leftChars="0" w:firstLine="0" w:firstLineChars="0"/>
@@ -9224,7 +9173,7 @@
         <w:gridCol w:w="4728"/>
         <w:gridCol w:w="4729"/>
       </w:tblGrid>
-      <w:tr>
+      <w:tr ns2:paraId="7DEB450B">
         <w:trPr>
           <w:trHeight w:val="3530" w:hRule="atLeast"/>
         </w:trPr>
@@ -9238,7 +9187,7 @@
               <w:right w:val="nil"/>
             </w:tcBorders>
           </w:tcPr>
-          <w:p>
+          <w:p ns2:paraId="57F110A3">
             <w:pPr>
               <w:keepNext w:val="0"/>
               <w:keepLines w:val="0"/>
@@ -9257,7 +9206,7 @@
               </w:rPr>
             </w:pPr>
           </w:p>
-          <w:p>
+          <w:p ns2:paraId="6AB82CF9">
             <w:pPr>
               <w:keepNext w:val="0"/>
               <w:keepLines w:val="0"/>
@@ -9276,7 +9225,7 @@
               </w:rPr>
             </w:pPr>
           </w:p>
-          <w:p>
+          <w:p ns2:paraId="5393DDC3">
             <w:pPr>
               <w:keepNext w:val="0"/>
               <w:keepLines w:val="0"/>
@@ -9353,7 +9302,7 @@
               <w:t xml:space="preserve">                        </w:t>
             </w:r>
           </w:p>
-          <w:p>
+          <w:p ns2:paraId="6A4637A2">
             <w:pPr>
               <w:keepNext w:val="0"/>
               <w:keepLines w:val="0"/>
@@ -9390,7 +9339,7 @@
               <w:t>：</w:t>
             </w:r>
           </w:p>
-          <w:p>
+          <w:p ns2:paraId="0C8C4B55">
             <w:pPr>
               <w:keepNext w:val="0"/>
               <w:keepLines w:val="0"/>
@@ -9425,7 +9374,7 @@
               <w:right w:val="nil"/>
             </w:tcBorders>
           </w:tcPr>
-          <w:p>
+          <w:p ns2:paraId="14A14261">
             <w:pPr>
               <w:keepNext w:val="0"/>
               <w:keepLines w:val="0"/>
@@ -9445,7 +9394,7 @@
               </w:rPr>
             </w:pPr>
           </w:p>
-          <w:p>
+          <w:p ns2:paraId="725EC3C9">
             <w:pPr>
               <w:keepNext w:val="0"/>
               <w:keepLines w:val="0"/>
@@ -9465,7 +9414,7 @@
               </w:rPr>
             </w:pPr>
           </w:p>
-          <w:p>
+          <w:p ns2:paraId="4B9DD5B0">
             <w:pPr>
               <w:keepNext w:val="0"/>
               <w:keepLines w:val="0"/>
@@ -9526,7 +9475,7 @@
               <w:t xml:space="preserve">   </w:t>
             </w:r>
           </w:p>
-          <w:p>
+          <w:p ns2:paraId="3ABC414C">
             <w:pPr>
               <w:keepNext w:val="0"/>
               <w:keepLines w:val="0"/>
@@ -9563,7 +9512,7 @@
               <w:t>：</w:t>
             </w:r>
           </w:p>
-          <w:p>
+          <w:p ns2:paraId="08FA40C1">
             <w:pPr>
               <w:keepNext w:val="0"/>
               <w:keepLines w:val="0"/>
@@ -9590,13 +9539,14 @@
         </w:tc>
       </w:tr>
     </w:tbl>
-    <w:p>
+    <w:p ns2:paraId="6D580B98">
       <w:pPr>
         <w:pStyle w:val="18"/>
         <w:rPr>
           <w:rFonts w:hint="default" w:ascii="黑体" w:eastAsia="黑体"/>
           <w:lang w:val="en-US"/>
         </w:rPr>
+        <w:pageBreakBefore w:val="1"/>
       </w:pPr>
       <w:r>
         <w:rPr>
@@ -9634,7 +9584,7 @@
         <w:t>产品/服务及报价清单</w:t>
       </w:r>
     </w:p>
-    <w:p>
+    <w:p ns2:paraId="26A219B9">
       <w:pPr>
         <w:spacing w:line="440" w:lineRule="exact"/>
         <w:rPr>
@@ -9673,12 +9623,12 @@
         <w:gridCol w:w="672"/>
         <w:gridCol w:w="1527"/>
       </w:tblGrid>
-      <w:tr>
+      <w:tr ns2:paraId="6BC51B20">
         <w:tc>
           <w:tcPr>
             <w:tcW w:w="641" w:type="dxa"/>
           </w:tcPr>
-          <w:p>
+          <w:p ns2:paraId="04C62E1E">
             <w:pPr>
               <w:keepNext w:val="0"/>
               <w:keepLines w:val="0"/>
@@ -9706,7 +9656,7 @@
           <w:tcPr>
             <w:tcW w:w="1756" w:type="dxa"/>
           </w:tcPr>
-          <w:p>
+          <w:p ns2:paraId="2EF68071">
             <w:pPr>
               <w:keepNext w:val="0"/>
               <w:keepLines w:val="0"/>
@@ -9734,7 +9684,7 @@
           <w:tcPr>
             <w:tcW w:w="2626" w:type="dxa"/>
           </w:tcPr>
-          <w:p>
+          <w:p ns2:paraId="2A4B7716">
             <w:pPr>
               <w:keepNext w:val="0"/>
               <w:keepLines w:val="0"/>
@@ -9767,7 +9717,7 @@
           <w:tcPr>
             <w:tcW w:w="657" w:type="dxa"/>
           </w:tcPr>
-          <w:p>
+          <w:p ns2:paraId="5FEFA809">
             <w:pPr>
               <w:keepNext w:val="0"/>
               <w:keepLines w:val="0"/>
@@ -9795,7 +9745,7 @@
           <w:tcPr>
             <w:tcW w:w="778" w:type="dxa"/>
           </w:tcPr>
-          <w:p>
+          <w:p ns2:paraId="6C97447F">
             <w:pPr>
               <w:keepNext w:val="0"/>
               <w:keepLines w:val="0"/>
@@ -9825,7 +9775,7 @@
             <w:shd w:val="clear" w:color="auto" w:fill="auto"/>
             <w:vAlign w:val="top"/>
           </w:tcPr>
-          <w:p>
+          <w:p ns2:paraId="13D3A8F7">
             <w:pPr>
               <w:keepNext w:val="0"/>
               <w:keepLines w:val="0"/>
@@ -9856,7 +9806,7 @@
           <w:tcPr>
             <w:tcW w:w="1527" w:type="dxa"/>
           </w:tcPr>
-          <w:p>
+          <w:p ns2:paraId="21131F59">
             <w:pPr>
               <w:keepNext w:val="0"/>
               <w:keepLines w:val="0"/>
@@ -9890,13 +9840,13 @@
           </w:p>
         </w:tc>
       </w:tr>
-      <w:tr>
+      <w:tr ns2:paraId="32A57F5A">
         <w:tc>
           <w:tcPr>
             <w:tcW w:w="641" w:type="dxa"/>
             <w:vAlign w:val="center"/>
           </w:tcPr>
-          <w:p>
+          <w:p ns2:paraId="25218B7E">
             <w:pPr>
               <w:keepNext w:val="0"/>
               <w:keepLines w:val="0"/>
@@ -9925,7 +9875,7 @@
             <w:tcW w:w="1756" w:type="dxa"/>
             <w:vAlign w:val="center"/>
           </w:tcPr>
-          <w:p>
+          <w:p ns2:paraId="0648E79E">
             <w:pPr>
               <w:keepNext w:val="0"/>
               <w:keepLines w:val="0"/>
@@ -9956,7 +9906,7 @@
             <w:tcW w:w="2626" w:type="dxa"/>
             <w:vAlign w:val="center"/>
           </w:tcPr>
-          <w:p>
+          <w:p ns2:paraId="4B809C41">
             <w:pPr>
               <w:keepNext w:val="0"/>
               <w:keepLines w:val="0"/>
@@ -9981,7 +9931,7 @@
               <w:t>私有化部署：</w:t>
             </w:r>
           </w:p>
-          <w:p>
+          <w:p ns2:paraId="265906D2">
             <w:pPr>
               <w:keepNext w:val="0"/>
               <w:keepLines w:val="0"/>
@@ -10006,7 +9956,7 @@
               <w:t>一次性买断税率13%</w:t>
             </w:r>
           </w:p>
-          <w:p>
+          <w:p ns2:paraId="4591B14B">
             <w:pPr>
               <w:keepNext w:val="0"/>
               <w:keepLines w:val="0"/>
@@ -10037,7 +9987,7 @@
             <w:tcW w:w="657" w:type="dxa"/>
             <w:vAlign w:val="center"/>
           </w:tcPr>
-          <w:p>
+          <w:p ns2:paraId="524E72AA">
             <w:pPr>
               <w:keepNext w:val="0"/>
               <w:keepLines w:val="0"/>
@@ -10066,7 +10016,7 @@
             <w:tcW w:w="778" w:type="dxa"/>
             <w:vAlign w:val="center"/>
           </w:tcPr>
-          <w:p>
+          <w:p ns2:paraId="62525DFE">
             <w:pPr>
               <w:keepNext w:val="0"/>
               <w:keepLines w:val="0"/>
@@ -10096,7 +10046,7 @@
             <w:shd w:val="clear" w:color="auto" w:fill="auto"/>
             <w:vAlign w:val="center"/>
           </w:tcPr>
-          <w:p>
+          <w:p ns2:paraId="457CBFFC">
             <w:pPr>
               <w:keepNext w:val="0"/>
               <w:keepLines w:val="0"/>
@@ -10119,7 +10069,7 @@
             <w:tcW w:w="1527" w:type="dxa"/>
             <w:vAlign w:val="center"/>
           </w:tcPr>
-          <w:p>
+          <w:p ns2:paraId="48E9A3CA">
             <w:pPr>
               <w:keepNext w:val="0"/>
               <w:keepLines w:val="0"/>
@@ -10136,13 +10086,13 @@
           </w:p>
         </w:tc>
       </w:tr>
-      <w:tr>
+      <w:tr ns2:paraId="66BEDED7">
         <w:tc>
           <w:tcPr>
             <w:tcW w:w="641" w:type="dxa"/>
             <w:vAlign w:val="center"/>
           </w:tcPr>
-          <w:p>
+          <w:p ns2:paraId="2053FB9E">
             <w:pPr>
               <w:keepNext w:val="0"/>
               <w:keepLines w:val="0"/>
@@ -10171,7 +10121,7 @@
             <w:tcW w:w="1756" w:type="dxa"/>
             <w:vAlign w:val="center"/>
           </w:tcPr>
-          <w:p>
+          <w:p ns2:paraId="3111ED89">
             <w:pPr>
               <w:keepNext w:val="0"/>
               <w:keepLines w:val="0"/>
@@ -10202,7 +10152,7 @@
             <w:tcW w:w="2626" w:type="dxa"/>
             <w:vAlign w:val="center"/>
           </w:tcPr>
-          <w:p>
+          <w:p ns2:paraId="3B57EAD8">
             <w:pPr>
               <w:keepNext w:val="0"/>
               <w:keepLines w:val="0"/>
@@ -10281,7 +10231,7 @@
             <w:tcW w:w="657" w:type="dxa"/>
             <w:vAlign w:val="center"/>
           </w:tcPr>
-          <w:p>
+          <w:p ns2:paraId="70BB06C9">
             <w:pPr>
               <w:keepNext w:val="0"/>
               <w:keepLines w:val="0"/>
@@ -10312,7 +10262,7 @@
             <w:tcW w:w="778" w:type="dxa"/>
             <w:vAlign w:val="center"/>
           </w:tcPr>
-          <w:p>
+          <w:p ns2:paraId="6CC94DCC">
             <w:pPr>
               <w:keepNext w:val="0"/>
               <w:keepLines w:val="0"/>
@@ -10344,7 +10294,7 @@
             <w:shd w:val="clear" w:color="auto" w:fill="auto"/>
             <w:vAlign w:val="center"/>
           </w:tcPr>
-          <w:p>
+          <w:p ns2:paraId="303B123E">
             <w:pPr>
               <w:keepNext w:val="0"/>
               <w:keepLines w:val="0"/>
@@ -10377,7 +10327,7 @@
             <w:tcW w:w="1527" w:type="dxa"/>
             <w:vAlign w:val="center"/>
           </w:tcPr>
-          <w:p>
+          <w:p ns2:paraId="1AB66F0C">
             <w:pPr>
               <w:keepNext w:val="0"/>
               <w:keepLines w:val="0"/>
@@ -10395,13 +10345,13 @@
           </w:p>
         </w:tc>
       </w:tr>
-      <w:tr>
+      <w:tr ns2:paraId="52E6AAD8">
         <w:tc>
           <w:tcPr>
             <w:tcW w:w="641" w:type="dxa"/>
             <w:vAlign w:val="center"/>
           </w:tcPr>
-          <w:p>
+          <w:p ns2:paraId="05C49BD4">
             <w:pPr>
               <w:keepNext w:val="0"/>
               <w:keepLines w:val="0"/>
@@ -10430,7 +10380,7 @@
             <w:tcW w:w="1756" w:type="dxa"/>
             <w:vAlign w:val="center"/>
           </w:tcPr>
-          <w:p>
+          <w:p ns2:paraId="339468EF">
             <w:pPr>
               <w:keepNext w:val="0"/>
               <w:keepLines w:val="0"/>
@@ -10461,7 +10411,7 @@
             <w:tcW w:w="2626" w:type="dxa"/>
             <w:vAlign w:val="center"/>
           </w:tcPr>
-          <w:p>
+          <w:p ns2:paraId="60C276EB">
             <w:pPr>
               <w:keepNext w:val="0"/>
               <w:keepLines w:val="0"/>
@@ -10509,7 +10459,7 @@
               <w:t>1、系统部署：平台部署至客户现有生产环境并完成验证；</w:t>
             </w:r>
           </w:p>
-          <w:p>
+          <w:p ns2:paraId="704F2572">
             <w:pPr>
               <w:keepNext w:val="0"/>
               <w:keepLines w:val="0"/>
@@ -10587,7 +10537,7 @@
             <w:tcW w:w="657" w:type="dxa"/>
             <w:vAlign w:val="center"/>
           </w:tcPr>
-          <w:p>
+          <w:p ns2:paraId="53E1E4AA">
             <w:pPr>
               <w:keepNext w:val="0"/>
               <w:keepLines w:val="0"/>
@@ -10616,7 +10566,7 @@
             <w:tcW w:w="778" w:type="dxa"/>
             <w:vAlign w:val="center"/>
           </w:tcPr>
-          <w:p>
+          <w:p ns2:paraId="1CDC6A3D">
             <w:pPr>
               <w:keepNext w:val="0"/>
               <w:keepLines w:val="0"/>
@@ -10646,7 +10596,7 @@
             <w:shd w:val="clear" w:color="auto" w:fill="auto"/>
             <w:vAlign w:val="center"/>
           </w:tcPr>
-          <w:p>
+          <w:p ns2:paraId="6FCF53B0">
             <w:pPr>
               <w:keepNext w:val="0"/>
               <w:keepLines w:val="0"/>
@@ -10679,7 +10629,7 @@
             <w:tcW w:w="1527" w:type="dxa"/>
             <w:vAlign w:val="center"/>
           </w:tcPr>
-          <w:p>
+          <w:p ns2:paraId="7CF9E743">
             <w:pPr>
               <w:keepNext w:val="0"/>
               <w:keepLines w:val="0"/>
@@ -10696,13 +10646,13 @@
           </w:p>
         </w:tc>
       </w:tr>
-      <w:tr>
+      <w:tr ns2:paraId="3FF37575">
         <w:tc>
           <w:tcPr>
             <w:tcW w:w="641" w:type="dxa"/>
             <w:vAlign w:val="center"/>
           </w:tcPr>
-          <w:p>
+          <w:p ns2:paraId="3E369179">
             <w:pPr>
               <w:keepNext w:val="0"/>
               <w:keepLines w:val="0"/>
@@ -10733,7 +10683,7 @@
             <w:tcW w:w="1756" w:type="dxa"/>
             <w:vAlign w:val="center"/>
           </w:tcPr>
-          <w:p>
+          <w:p ns2:paraId="2A13C7F3">
             <w:pPr>
               <w:keepNext w:val="0"/>
               <w:keepLines w:val="0"/>
@@ -10764,7 +10714,7 @@
             <w:tcW w:w="2626" w:type="dxa"/>
             <w:vAlign w:val="center"/>
           </w:tcPr>
-          <w:p>
+          <w:p ns2:paraId="0F127B11">
             <w:pPr>
               <w:keepNext w:val="0"/>
               <w:keepLines w:val="0"/>
@@ -10795,7 +10745,7 @@
             <w:tcW w:w="657" w:type="dxa"/>
             <w:vAlign w:val="center"/>
           </w:tcPr>
-          <w:p>
+          <w:p ns2:paraId="76BF4CA2">
             <w:pPr>
               <w:keepNext w:val="0"/>
               <w:keepLines w:val="0"/>
@@ -10826,7 +10776,7 @@
             <w:tcW w:w="778" w:type="dxa"/>
             <w:vAlign w:val="center"/>
           </w:tcPr>
-          <w:p>
+          <w:p ns2:paraId="3FC6F623">
             <w:pPr>
               <w:keepNext w:val="0"/>
               <w:keepLines w:val="0"/>
@@ -10858,7 +10808,7 @@
             <w:shd w:val="clear" w:color="auto" w:fill="auto"/>
             <w:vAlign w:val="center"/>
           </w:tcPr>
-          <w:p>
+          <w:p ns2:paraId="75D86F18">
             <w:pPr>
               <w:keepNext w:val="0"/>
               <w:keepLines w:val="0"/>
@@ -10891,7 +10841,7 @@
             <w:tcW w:w="1527" w:type="dxa"/>
             <w:vAlign w:val="center"/>
           </w:tcPr>
-          <w:p>
+          <w:p ns2:paraId="78E0C210">
             <w:pPr>
               <w:keepNext w:val="0"/>
               <w:keepLines w:val="0"/>
@@ -10908,13 +10858,13 @@
           </w:p>
         </w:tc>
       </w:tr>
-      <w:tr>
+      <w:tr ns2:paraId="12BD2579">
         <w:tc>
           <w:tcPr>
             <w:tcW w:w="641" w:type="dxa"/>
             <w:vAlign w:val="center"/>
           </w:tcPr>
-          <w:p>
+          <w:p ns2:paraId="04252A60">
             <w:pPr>
               <w:keepNext w:val="0"/>
               <w:keepLines w:val="0"/>
@@ -10945,7 +10895,7 @@
             <w:tcW w:w="1756" w:type="dxa"/>
             <w:vAlign w:val="center"/>
           </w:tcPr>
-          <w:p>
+          <w:p ns2:paraId="1D00714E">
             <w:pPr>
               <w:keepNext w:val="0"/>
               <w:keepLines w:val="0"/>
@@ -10976,7 +10926,7 @@
             <w:tcW w:w="2626" w:type="dxa"/>
             <w:vAlign w:val="center"/>
           </w:tcPr>
-          <w:p>
+          <w:p ns2:paraId="4306A168">
             <w:pPr>
               <w:keepNext w:val="0"/>
               <w:keepLines w:val="0"/>
@@ -11007,7 +10957,7 @@
             <w:tcW w:w="657" w:type="dxa"/>
             <w:vAlign w:val="center"/>
           </w:tcPr>
-          <w:p>
+          <w:p ns2:paraId="2EF9A84D">
             <w:pPr>
               <w:keepNext w:val="0"/>
               <w:keepLines w:val="0"/>
@@ -11038,7 +10988,7 @@
             <w:tcW w:w="778" w:type="dxa"/>
             <w:vAlign w:val="center"/>
           </w:tcPr>
-          <w:p>
+          <w:p ns2:paraId="4FC5C1D0">
             <w:pPr>
               <w:keepNext w:val="0"/>
               <w:keepLines w:val="0"/>
@@ -11070,7 +11020,7 @@
             <w:shd w:val="clear" w:color="auto" w:fill="auto"/>
             <w:vAlign w:val="center"/>
           </w:tcPr>
-          <w:p>
+          <w:p ns2:paraId="5C8C5224">
             <w:pPr>
               <w:keepNext w:val="0"/>
               <w:keepLines w:val="0"/>
@@ -11103,7 +11053,7 @@
             <w:tcW w:w="1527" w:type="dxa"/>
             <w:vAlign w:val="center"/>
           </w:tcPr>
-          <w:p>
+          <w:p ns2:paraId="0B00F43C">
             <w:pPr>
               <w:keepNext w:val="0"/>
               <w:keepLines w:val="0"/>
@@ -11120,13 +11070,13 @@
           </w:p>
         </w:tc>
       </w:tr>
-      <w:tr>
+      <w:tr ns2:paraId="33258705">
         <w:tc>
           <w:tcPr>
             <w:tcW w:w="641" w:type="dxa"/>
             <w:vAlign w:val="center"/>
           </w:tcPr>
-          <w:p>
+          <w:p ns2:paraId="26735B9D">
             <w:pPr>
               <w:keepNext w:val="0"/>
               <w:keepLines w:val="0"/>
@@ -11157,7 +11107,7 @@
             <w:tcW w:w="1756" w:type="dxa"/>
             <w:vAlign w:val="center"/>
           </w:tcPr>
-          <w:p>
+          <w:p ns2:paraId="18E5DF62">
             <w:pPr>
               <w:keepNext w:val="0"/>
               <w:keepLines w:val="0"/>
@@ -11188,7 +11138,7 @@
             <w:tcW w:w="2626" w:type="dxa"/>
             <w:vAlign w:val="center"/>
           </w:tcPr>
-          <w:p>
+          <w:p ns2:paraId="2EB151C4">
             <w:pPr>
               <w:keepNext w:val="0"/>
               <w:keepLines w:val="0"/>
@@ -11219,7 +11169,7 @@
             <w:tcW w:w="657" w:type="dxa"/>
             <w:vAlign w:val="center"/>
           </w:tcPr>
-          <w:p>
+          <w:p ns2:paraId="0F3D9E59">
             <w:pPr>
               <w:keepNext w:val="0"/>
               <w:keepLines w:val="0"/>
@@ -11250,7 +11200,7 @@
             <w:tcW w:w="778" w:type="dxa"/>
             <w:vAlign w:val="center"/>
           </w:tcPr>
-          <w:p>
+          <w:p ns2:paraId="14123EC1">
             <w:pPr>
               <w:keepNext w:val="0"/>
               <w:keepLines w:val="0"/>
@@ -11280,7 +11230,7 @@
             <w:shd w:val="clear" w:color="auto" w:fill="auto"/>
             <w:vAlign w:val="center"/>
           </w:tcPr>
-          <w:p>
+          <w:p ns2:paraId="78526A6C">
             <w:pPr>
               <w:keepNext w:val="0"/>
               <w:keepLines w:val="0"/>
@@ -11313,7 +11263,7 @@
             <w:tcW w:w="1527" w:type="dxa"/>
             <w:vAlign w:val="center"/>
           </w:tcPr>
-          <w:p>
+          <w:p ns2:paraId="75DCAABE">
             <w:pPr>
               <w:keepNext w:val="0"/>
               <w:keepLines w:val="0"/>
@@ -11330,14 +11280,14 @@
           </w:p>
         </w:tc>
       </w:tr>
-      <w:tr>
+      <w:tr ns2:paraId="75AA574E">
         <w:tc>
           <w:tcPr>
             <w:tcW w:w="8657" w:type="dxa"/>
             <w:gridSpan w:val="7"/>
             <w:vAlign w:val="center"/>
           </w:tcPr>
-          <w:p>
+          <w:p ns2:paraId="7469EF6E">
             <w:pPr>
               <w:keepNext w:val="0"/>
               <w:keepLines w:val="0"/>
@@ -11448,7 +11398,7 @@
         </w:tc>
       </w:tr>
     </w:tbl>
-    <w:p>
+    <w:p ns2:paraId="602562AE">
       <w:pPr>
         <w:pStyle w:val="43"/>
         <w:spacing w:before="0" w:after="120" w:line="360" w:lineRule="auto"/>
@@ -11474,19 +11424,20 @@
         <w:t>备注：1. 金额应明确是否含税；2. 现场服务、第三方资源及超出范围的工作须在备注中说明；3. 本表与正文约定不一致时，以双方最后签署的变更单为准。</w:t>
       </w:r>
     </w:p>
-    <w:p>
+    <w:p ns2:paraId="275EA441">
       <w:pPr>
         <w:rPr>
           <w:rFonts w:hint="eastAsia"/>
         </w:rPr>
       </w:pPr>
     </w:p>
-    <w:p>
+    <w:p ns2:paraId="576EEE52">
       <w:pPr>
         <w:pStyle w:val="18"/>
         <w:rPr>
           <w:rFonts w:hint="eastAsia" w:ascii="黑体" w:eastAsia="黑体"/>
         </w:rPr>
+        <w:pageBreakBefore w:val="1"/>
       </w:pPr>
       <w:r>
         <w:rPr>
@@ -11534,7 +11485,7 @@
         <w:t>清单</w:t>
       </w:r>
     </w:p>
-    <w:p/>
+    <w:p ns2:paraId="58A903DE"/>
     <w:tbl>
       <w:tblPr>
         <w:tblStyle w:val="20"/>
@@ -11562,12 +11513,12 @@
         <w:gridCol w:w="1741"/>
         <w:gridCol w:w="1801"/>
       </w:tblGrid>
-      <w:tr>
+      <w:tr ns2:paraId="1928E77B">
         <w:tc>
           <w:tcPr>
             <w:tcW w:w="1771" w:type="dxa"/>
           </w:tcPr>
-          <w:p>
+          <w:p ns2:paraId="02AA3A57">
             <w:pPr>
               <w:keepNext w:val="0"/>
               <w:keepLines w:val="0"/>
@@ -11606,7 +11557,7 @@
           <w:tcPr>
             <w:tcW w:w="3946" w:type="dxa"/>
           </w:tcPr>
-          <w:p>
+          <w:p ns2:paraId="0203DB11">
             <w:pPr>
               <w:keepNext w:val="0"/>
               <w:keepLines w:val="0"/>
@@ -11637,7 +11588,7 @@
             <w:tcW w:w="1741" w:type="dxa"/>
             <w:vAlign w:val="center"/>
           </w:tcPr>
-          <w:p>
+          <w:p ns2:paraId="37360F60">
             <w:pPr>
               <w:keepNext w:val="0"/>
               <w:keepLines w:val="0"/>
@@ -11668,7 +11619,7 @@
             <w:tcW w:w="1801" w:type="dxa"/>
             <w:vAlign w:val="center"/>
           </w:tcPr>
-          <w:p>
+          <w:p ns2:paraId="20DE4751">
             <w:pPr>
               <w:keepNext w:val="0"/>
               <w:keepLines w:val="0"/>
@@ -11695,13 +11646,13 @@
           </w:p>
         </w:tc>
       </w:tr>
-      <w:tr>
+      <w:tr ns2:paraId="6C7093E7">
         <w:tc>
           <w:tcPr>
             <w:tcW w:w="1771" w:type="dxa"/>
             <w:vAlign w:val="center"/>
           </w:tcPr>
-          <w:p>
+          <w:p ns2:paraId="47F12BEA">
             <w:pPr>
               <w:keepNext w:val="0"/>
               <w:keepLines w:val="0"/>
@@ -11723,7 +11674,7 @@
             <w:tcW w:w="3946" w:type="dxa"/>
             <w:vAlign w:val="center"/>
           </w:tcPr>
-          <w:p>
+          <w:p ns2:paraId="1B543EF1">
             <w:pPr>
               <w:keepNext w:val="0"/>
               <w:keepLines w:val="0"/>
@@ -11744,7 +11695,7 @@
             <w:tcW w:w="1741" w:type="dxa"/>
             <w:vAlign w:val="center"/>
           </w:tcPr>
-          <w:p>
+          <w:p ns2:paraId="74B0DB61">
             <w:pPr>
               <w:keepNext w:val="0"/>
               <w:keepLines w:val="0"/>
@@ -11765,7 +11716,7 @@
             <w:tcW w:w="1801" w:type="dxa"/>
             <w:vAlign w:val="center"/>
           </w:tcPr>
-          <w:p>
+          <w:p ns2:paraId="55705075">
             <w:pPr>
               <w:keepNext w:val="0"/>
               <w:keepLines w:val="0"/>
@@ -11782,13 +11733,13 @@
           </w:p>
         </w:tc>
       </w:tr>
-      <w:tr>
+      <w:tr ns2:paraId="02AD565E">
         <w:tc>
           <w:tcPr>
             <w:tcW w:w="1771" w:type="dxa"/>
             <w:vAlign w:val="center"/>
           </w:tcPr>
-          <w:p>
+          <w:p ns2:paraId="13B31DE7">
             <w:pPr>
               <w:keepNext w:val="0"/>
               <w:keepLines w:val="0"/>
@@ -11810,7 +11761,7 @@
             <w:tcW w:w="3946" w:type="dxa"/>
             <w:vAlign w:val="center"/>
           </w:tcPr>
-          <w:p>
+          <w:p ns2:paraId="20E89686">
             <w:pPr>
               <w:keepNext w:val="0"/>
               <w:keepLines w:val="0"/>
@@ -11832,7 +11783,7 @@
             <w:tcW w:w="1741" w:type="dxa"/>
             <w:vAlign w:val="center"/>
           </w:tcPr>
-          <w:p>
+          <w:p ns2:paraId="53D64EDA">
             <w:pPr>
               <w:keepNext w:val="0"/>
               <w:keepLines w:val="0"/>
@@ -11853,7 +11804,7 @@
             <w:tcW w:w="1801" w:type="dxa"/>
             <w:vAlign w:val="center"/>
           </w:tcPr>
-          <w:p>
+          <w:p ns2:paraId="3ADB937E">
             <w:pPr>
               <w:keepNext w:val="0"/>
               <w:keepLines w:val="0"/>
@@ -11870,13 +11821,13 @@
           </w:p>
         </w:tc>
       </w:tr>
-      <w:tr>
+      <w:tr ns2:paraId="0D279830">
         <w:tc>
           <w:tcPr>
             <w:tcW w:w="1771" w:type="dxa"/>
             <w:vAlign w:val="center"/>
           </w:tcPr>
-          <w:p>
+          <w:p ns2:paraId="040E4FFB">
             <w:pPr>
               <w:keepNext w:val="0"/>
               <w:keepLines w:val="0"/>
@@ -11898,7 +11849,7 @@
             <w:tcW w:w="3946" w:type="dxa"/>
             <w:vAlign w:val="center"/>
           </w:tcPr>
-          <w:p>
+          <w:p ns2:paraId="01EB3A3B">
             <w:pPr>
               <w:keepNext w:val="0"/>
               <w:keepLines w:val="0"/>
@@ -11919,7 +11870,7 @@
             <w:tcW w:w="1741" w:type="dxa"/>
             <w:vAlign w:val="center"/>
           </w:tcPr>
-          <w:p>
+          <w:p ns2:paraId="3F18B465">
             <w:pPr>
               <w:keepNext w:val="0"/>
               <w:keepLines w:val="0"/>
@@ -11940,7 +11891,7 @@
             <w:tcW w:w="1801" w:type="dxa"/>
             <w:vAlign w:val="center"/>
           </w:tcPr>
-          <w:p>
+          <w:p ns2:paraId="428C4431">
             <w:pPr>
               <w:keepNext w:val="0"/>
               <w:keepLines w:val="0"/>
@@ -11957,20 +11908,20 @@
           </w:p>
         </w:tc>
       </w:tr>
-      <w:tr>
+      <w:tr ns2:paraId="1BDF03D5">
         <w:tc>
           <w:tcPr>
             <w:tcW w:w="1771" w:type="dxa"/>
             <w:vAlign w:val="center"/>
           </w:tcPr>
-          <w:p>
+          <w:p ns2:paraId="3F25A9ED">
             <w:pPr>
               <w:keepNext w:val="0"/>
               <w:keepLines w:val="0"/>
               <w:suppressLineNumbers w:val="0"/>
               <w:spacing w:before="0" w:beforeAutospacing="0" w:after="0" w:afterAutospacing="0" w:line="440" w:lineRule="exact"/>
               <w:ind w:left="0" w:leftChars="0" w:right="0" w:firstLine="0" w:firstLineChars="0"/>
-              <w:jc w:val="left"/>
+              <w:jc w:val="center"/>
               <w:rPr>
                 <w:rFonts w:hint="eastAsia" w:ascii="宋体" w:hAnsi="宋体" w:eastAsia="宋体" w:cs="宋体"/>
                 <w:sz w:val="21"/>
@@ -11984,7 +11935,7 @@
             <w:tcW w:w="3946" w:type="dxa"/>
             <w:vAlign w:val="center"/>
           </w:tcPr>
-          <w:p>
+          <w:p ns2:paraId="0B90A4B1">
             <w:pPr>
               <w:keepNext w:val="0"/>
               <w:keepLines w:val="0"/>
@@ -12005,14 +11956,14 @@
             <w:tcW w:w="1741" w:type="dxa"/>
             <w:vAlign w:val="center"/>
           </w:tcPr>
-          <w:p>
+          <w:p ns2:paraId="29D64C2B">
             <w:pPr>
               <w:keepNext w:val="0"/>
               <w:keepLines w:val="0"/>
               <w:suppressLineNumbers w:val="0"/>
               <w:spacing w:before="0" w:beforeAutospacing="0" w:after="0" w:afterAutospacing="0" w:line="440" w:lineRule="exact"/>
               <w:ind w:left="0" w:leftChars="0" w:right="0" w:firstLine="0" w:firstLineChars="0"/>
-              <w:jc w:val="right"/>
+              <w:jc w:val="center"/>
               <w:rPr>
                 <w:rFonts w:hint="eastAsia" w:ascii="宋体" w:hAnsi="宋体" w:eastAsia="宋体" w:cs="宋体"/>
                 <w:sz w:val="21"/>
@@ -12026,14 +11977,14 @@
             <w:tcW w:w="1801" w:type="dxa"/>
             <w:vAlign w:val="center"/>
           </w:tcPr>
-          <w:p>
+          <w:p ns2:paraId="06BFD738">
             <w:pPr>
               <w:keepNext w:val="0"/>
               <w:keepLines w:val="0"/>
               <w:suppressLineNumbers w:val="0"/>
               <w:spacing w:before="0" w:beforeAutospacing="0" w:after="0" w:afterAutospacing="0" w:line="440" w:lineRule="exact"/>
               <w:ind w:left="0" w:leftChars="0" w:right="0" w:firstLine="0" w:firstLineChars="0"/>
-              <w:jc w:val="right"/>
+              <w:jc w:val="center"/>
               <w:rPr>
                 <w:rFonts w:hint="eastAsia" w:ascii="宋体" w:hAnsi="宋体" w:eastAsia="宋体" w:cs="宋体"/>
                 <w:sz w:val="21"/>
@@ -12044,7 +11995,7 @@
         </w:tc>
       </w:tr>
     </w:tbl>
-    <w:p>
+    <w:p ns2:paraId="7DFED8F2">
       <w:pPr>
         <w:pStyle w:val="43"/>
         <w:keepNext w:val="0"/>
@@ -12087,7 +12038,7 @@
         <w:t>项目负责人及确认方式：甲方负责人______________；乙方负责人______________；日常确认渠道：□邮件  □工单  □项目管理工具  □其他：________________。</w:t>
       </w:r>
     </w:p>
-    <w:p>
+    <w:p ns2:paraId="030D83EB">
       <w:pPr>
         <w:pStyle w:val="43"/>
         <w:keepNext w:val="0"/>
@@ -12130,9 +12081,10 @@
         <w:t>本附件经双方授权代表签署后生效，与本合同正文具有同等法律效力。</w:t>
       </w:r>
     </w:p>
-    <w:p>
+    <w:p ns2:paraId="48D41C35">
       <w:pPr>
         <w:pStyle w:val="18"/>
+        <w:pageBreakBefore w:val="1"/>
       </w:pPr>
       <w:r>
         <w:rPr>
@@ -12174,7 +12126,7 @@
         <w:gridCol w:w="1434"/>
         <w:gridCol w:w="1434"/>
       </w:tblGrid>
-      <w:tr>
+      <w:tr ns2:paraId="5E58FA3A">
         <w:trPr>
           <w:trHeight w:val="482" w:hRule="atLeast"/>
           <w:jc w:val="center"/>
@@ -12190,7 +12142,7 @@
             </w:tcMar>
             <w:vAlign w:val="center"/>
           </w:tcPr>
-          <w:p>
+          <w:p ns2:paraId="12298C80">
             <w:pPr>
               <w:keepNext w:val="0"/>
               <w:keepLines w:val="0"/>
@@ -12201,11 +12153,11 @@
               <w:rPr>
                 <w:rFonts w:hint="eastAsia" w:ascii="宋体" w:hAnsi="宋体" w:eastAsia="宋体" w:cs="宋体"/>
                 <w:color w:val="000000" w:themeColor="text1"/>
-                <w14:textFill>
-                  <w14:solidFill>
-                    <w14:schemeClr w14:val="tx1"/>
-                  </w14:solidFill>
-                </w14:textFill>
+                <ns2:textFill>
+                  <ns2:solidFill>
+                    <ns2:schemeClr ns2:val="tx1"/>
+                  </ns2:solidFill>
+                </ns2:textFill>
               </w:rPr>
             </w:pPr>
             <w:r>
@@ -12214,11 +12166,11 @@
                 <w:b w:val="0"/>
                 <w:color w:val="000000" w:themeColor="text1"/>
                 <w:sz w:val="24"/>
-                <w14:textFill>
-                  <w14:solidFill>
-                    <w14:schemeClr w14:val="tx1"/>
-                  </w14:solidFill>
-                </w14:textFill>
+                <ns2:textFill>
+                  <ns2:solidFill>
+                    <ns2:schemeClr ns2:val="tx1"/>
+                  </ns2:solidFill>
+                </ns2:textFill>
               </w:rPr>
               <w:t>软件名称</w:t>
             </w:r>
@@ -12235,7 +12187,7 @@
             </w:tcMar>
             <w:vAlign w:val="center"/>
           </w:tcPr>
-          <w:p>
+          <w:p ns2:paraId="65044C7C">
             <w:pPr>
               <w:keepNext w:val="0"/>
               <w:keepLines w:val="0"/>
@@ -12247,11 +12199,11 @@
                 <w:rFonts w:hint="eastAsia" w:ascii="宋体" w:hAnsi="宋体" w:eastAsia="宋体" w:cs="宋体"/>
                 <w:color w:val="000000" w:themeColor="text1"/>
                 <w:lang w:eastAsia="zh-CN"/>
-                <w14:textFill>
-                  <w14:solidFill>
-                    <w14:schemeClr w14:val="tx1"/>
-                  </w14:solidFill>
-                </w14:textFill>
+                <ns2:textFill>
+                  <ns2:solidFill>
+                    <ns2:schemeClr ns2:val="tx1"/>
+                  </ns2:solidFill>
+                </ns2:textFill>
               </w:rPr>
             </w:pPr>
             <w:r>
@@ -12261,11 +12213,11 @@
                 <w:color w:val="000000" w:themeColor="text1"/>
                 <w:sz w:val="22"/>
                 <w:lang w:val="en-US" w:eastAsia="zh-CN"/>
-                <w14:textFill>
-                  <w14:solidFill>
-                    <w14:schemeClr w14:val="tx1"/>
-                  </w14:solidFill>
-                </w14:textFill>
+                <ns2:textFill>
+                  <ns2:solidFill>
+                    <ns2:schemeClr ns2:val="tx1"/>
+                  </ns2:solidFill>
+                </ns2:textFill>
               </w:rPr>
               <w:t>FastGPT</w:t>
             </w:r>
@@ -12283,7 +12235,7 @@
             </w:tcMar>
             <w:vAlign w:val="center"/>
           </w:tcPr>
-          <w:p>
+          <w:p ns2:paraId="691C3D0F">
             <w:pPr>
               <w:keepNext w:val="0"/>
               <w:keepLines w:val="0"/>
@@ -12294,11 +12246,11 @@
               <w:rPr>
                 <w:rFonts w:hint="eastAsia" w:ascii="宋体" w:hAnsi="宋体" w:eastAsia="宋体" w:cs="宋体"/>
                 <w:color w:val="000000" w:themeColor="text1"/>
-                <w14:textFill>
-                  <w14:solidFill>
-                    <w14:schemeClr w14:val="tx1"/>
-                  </w14:solidFill>
-                </w14:textFill>
+                <ns2:textFill>
+                  <ns2:solidFill>
+                    <ns2:schemeClr ns2:val="tx1"/>
+                  </ns2:solidFill>
+                </ns2:textFill>
               </w:rPr>
             </w:pPr>
             <w:r>
@@ -12307,11 +12259,11 @@
                 <w:b w:val="0"/>
                 <w:color w:val="000000" w:themeColor="text1"/>
                 <w:sz w:val="24"/>
-                <w14:textFill>
-                  <w14:solidFill>
-                    <w14:schemeClr w14:val="tx1"/>
-                  </w14:solidFill>
-                </w14:textFill>
+                <ns2:textFill>
+                  <ns2:solidFill>
+                    <ns2:schemeClr ns2:val="tx1"/>
+                  </ns2:solidFill>
+                </ns2:textFill>
               </w:rPr>
               <w:t>合同编号</w:t>
             </w:r>
@@ -12329,7 +12281,7 @@
             </w:tcMar>
             <w:vAlign w:val="center"/>
           </w:tcPr>
-          <w:p>
+          <w:p ns2:paraId="04A13D75">
             <w:pPr>
               <w:keepNext w:val="0"/>
               <w:keepLines w:val="0"/>
@@ -12340,11 +12292,11 @@
               <w:rPr>
                 <w:rFonts w:hint="eastAsia" w:ascii="宋体" w:hAnsi="宋体" w:eastAsia="宋体" w:cs="宋体"/>
                 <w:color w:val="000000" w:themeColor="text1"/>
-                <w14:textFill>
-                  <w14:solidFill>
-                    <w14:schemeClr w14:val="tx1"/>
-                  </w14:solidFill>
-                </w14:textFill>
+                <ns2:textFill>
+                  <ns2:solidFill>
+                    <ns2:schemeClr ns2:val="tx1"/>
+                  </ns2:solidFill>
+                </ns2:textFill>
               </w:rPr>
             </w:pPr>
             <w:r>
@@ -12353,18 +12305,18 @@
                 <w:b w:val="0"/>
                 <w:color w:val="000000" w:themeColor="text1"/>
                 <w:sz w:val="22"/>
-                <w14:textFill>
-                  <w14:solidFill>
-                    <w14:schemeClr w14:val="tx1"/>
-                  </w14:solidFill>
-                </w14:textFill>
+                <ns2:textFill>
+                  <ns2:solidFill>
+                    <ns2:schemeClr ns2:val="tx1"/>
+                  </ns2:solidFill>
+                </ns2:textFill>
               </w:rPr>
               <w:t>【填写合同编号】</w:t>
             </w:r>
           </w:p>
         </w:tc>
       </w:tr>
-      <w:tr>
+      <w:tr ns2:paraId="565FFC6E">
         <w:trPr>
           <w:trHeight w:val="482" w:hRule="atLeast"/>
           <w:jc w:val="center"/>
@@ -12380,7 +12332,7 @@
             </w:tcMar>
             <w:vAlign w:val="center"/>
           </w:tcPr>
-          <w:p>
+          <w:p ns2:paraId="55FB4561">
             <w:pPr>
               <w:keepNext w:val="0"/>
               <w:keepLines w:val="0"/>
@@ -12392,11 +12344,11 @@
                 <w:rFonts w:hint="eastAsia" w:ascii="宋体" w:hAnsi="宋体" w:eastAsia="宋体" w:cs="宋体"/>
                 <w:color w:val="000000" w:themeColor="text1"/>
                 <w:lang w:val="en-US" w:eastAsia="zh-CN"/>
-                <w14:textFill>
-                  <w14:solidFill>
-                    <w14:schemeClr w14:val="tx1"/>
-                  </w14:solidFill>
-                </w14:textFill>
+                <ns2:textFill>
+                  <ns2:solidFill>
+                    <ns2:schemeClr ns2:val="tx1"/>
+                  </ns2:solidFill>
+                </ns2:textFill>
               </w:rPr>
             </w:pPr>
             <w:r>
@@ -12406,11 +12358,11 @@
                 <w:color w:val="000000" w:themeColor="text1"/>
                 <w:sz w:val="24"/>
                 <w:lang w:val="en-US" w:eastAsia="zh-CN"/>
-                <w14:textFill>
-                  <w14:solidFill>
-                    <w14:schemeClr w14:val="tx1"/>
-                  </w14:solidFill>
-                </w14:textFill>
+                <ns2:textFill>
+                  <ns2:solidFill>
+                    <ns2:schemeClr ns2:val="tx1"/>
+                  </ns2:solidFill>
+                </ns2:textFill>
               </w:rPr>
               <w:t>委托方</w:t>
             </w:r>
@@ -12427,7 +12379,7 @@
             </w:tcMar>
             <w:vAlign w:val="center"/>
           </w:tcPr>
-          <w:p>
+          <w:p ns2:paraId="522B6195">
             <w:pPr>
               <w:keepNext w:val="0"/>
               <w:keepLines w:val="0"/>
@@ -12438,11 +12390,11 @@
               <w:rPr>
                 <w:rFonts w:hint="eastAsia" w:ascii="宋体" w:hAnsi="宋体" w:eastAsia="宋体" w:cs="宋体"/>
                 <w:color w:val="000000" w:themeColor="text1"/>
-                <w14:textFill>
-                  <w14:solidFill>
-                    <w14:schemeClr w14:val="tx1"/>
-                  </w14:solidFill>
-                </w14:textFill>
+                <ns2:textFill>
+                  <ns2:solidFill>
+                    <ns2:schemeClr ns2:val="tx1"/>
+                  </ns2:solidFill>
+                </ns2:textFill>
               </w:rPr>
             </w:pPr>
             <w:r>
@@ -12451,11 +12403,11 @@
                 <w:b w:val="0"/>
                 <w:color w:val="000000" w:themeColor="text1"/>
                 <w:sz w:val="22"/>
-                <w14:textFill>
-                  <w14:solidFill>
-                    <w14:schemeClr w14:val="tx1"/>
-                  </w14:solidFill>
-                </w14:textFill>
+                <ns2:textFill>
+                  <ns2:solidFill>
+                    <ns2:schemeClr ns2:val="tx1"/>
+                  </ns2:solidFill>
+                </ns2:textFill>
               </w:rPr>
               <w:t>【填写</w:t>
             </w:r>
@@ -12466,11 +12418,11 @@
                 <w:color w:val="000000" w:themeColor="text1"/>
                 <w:sz w:val="22"/>
                 <w:lang w:val="en-US" w:eastAsia="zh-CN"/>
-                <w14:textFill>
-                  <w14:solidFill>
-                    <w14:schemeClr w14:val="tx1"/>
-                  </w14:solidFill>
-                </w14:textFill>
+                <ns2:textFill>
+                  <ns2:solidFill>
+                    <ns2:schemeClr ns2:val="tx1"/>
+                  </ns2:solidFill>
+                </ns2:textFill>
               </w:rPr>
               <w:t>甲方公司</w:t>
             </w:r>
@@ -12480,11 +12432,11 @@
                 <w:b w:val="0"/>
                 <w:color w:val="000000" w:themeColor="text1"/>
                 <w:sz w:val="22"/>
-                <w14:textFill>
-                  <w14:solidFill>
-                    <w14:schemeClr w14:val="tx1"/>
-                  </w14:solidFill>
-                </w14:textFill>
+                <ns2:textFill>
+                  <ns2:solidFill>
+                    <ns2:schemeClr ns2:val="tx1"/>
+                  </ns2:solidFill>
+                </ns2:textFill>
               </w:rPr>
               <w:t>】</w:t>
             </w:r>
@@ -12502,7 +12454,7 @@
             </w:tcMar>
             <w:vAlign w:val="center"/>
           </w:tcPr>
-          <w:p>
+          <w:p ns2:paraId="4A060432">
             <w:pPr>
               <w:keepNext w:val="0"/>
               <w:keepLines w:val="0"/>
@@ -12513,11 +12465,11 @@
               <w:rPr>
                 <w:rFonts w:hint="eastAsia" w:ascii="宋体" w:hAnsi="宋体" w:eastAsia="宋体" w:cs="宋体"/>
                 <w:color w:val="000000" w:themeColor="text1"/>
-                <w14:textFill>
-                  <w14:solidFill>
-                    <w14:schemeClr w14:val="tx1"/>
-                  </w14:solidFill>
-                </w14:textFill>
+                <ns2:textFill>
+                  <ns2:solidFill>
+                    <ns2:schemeClr ns2:val="tx1"/>
+                  </ns2:solidFill>
+                </ns2:textFill>
               </w:rPr>
             </w:pPr>
             <w:r>
@@ -12526,11 +12478,11 @@
                 <w:b w:val="0"/>
                 <w:color w:val="000000" w:themeColor="text1"/>
                 <w:sz w:val="24"/>
-                <w14:textFill>
-                  <w14:solidFill>
-                    <w14:schemeClr w14:val="tx1"/>
-                  </w14:solidFill>
-                </w14:textFill>
+                <ns2:textFill>
+                  <ns2:solidFill>
+                    <ns2:schemeClr ns2:val="tx1"/>
+                  </ns2:solidFill>
+                </ns2:textFill>
               </w:rPr>
               <w:t>项目负责人</w:t>
             </w:r>
@@ -12548,7 +12500,7 @@
             </w:tcMar>
             <w:vAlign w:val="center"/>
           </w:tcPr>
-          <w:p>
+          <w:p ns2:paraId="4273F718">
             <w:pPr>
               <w:keepNext w:val="0"/>
               <w:keepLines w:val="0"/>
@@ -12559,11 +12511,11 @@
               <w:rPr>
                 <w:rFonts w:hint="eastAsia" w:ascii="宋体" w:hAnsi="宋体" w:eastAsia="宋体" w:cs="宋体"/>
                 <w:color w:val="000000" w:themeColor="text1"/>
-                <w14:textFill>
-                  <w14:solidFill>
-                    <w14:schemeClr w14:val="tx1"/>
-                  </w14:solidFill>
-                </w14:textFill>
+                <ns2:textFill>
+                  <ns2:solidFill>
+                    <ns2:schemeClr ns2:val="tx1"/>
+                  </ns2:solidFill>
+                </ns2:textFill>
               </w:rPr>
             </w:pPr>
             <w:r>
@@ -12572,18 +12524,18 @@
                 <w:b w:val="0"/>
                 <w:color w:val="000000" w:themeColor="text1"/>
                 <w:sz w:val="22"/>
-                <w14:textFill>
-                  <w14:solidFill>
-                    <w14:schemeClr w14:val="tx1"/>
-                  </w14:solidFill>
-                </w14:textFill>
+                <ns2:textFill>
+                  <ns2:solidFill>
+                    <ns2:schemeClr ns2:val="tx1"/>
+                  </ns2:solidFill>
+                </ns2:textFill>
               </w:rPr>
               <w:t>【填写负责人】</w:t>
             </w:r>
           </w:p>
         </w:tc>
       </w:tr>
-      <w:tr>
+      <w:tr ns2:paraId="79C64218">
         <w:trPr>
           <w:trHeight w:val="482" w:hRule="atLeast"/>
           <w:jc w:val="center"/>
@@ -12599,7 +12551,7 @@
             </w:tcMar>
             <w:vAlign w:val="center"/>
           </w:tcPr>
-          <w:p>
+          <w:p ns2:paraId="01E90749">
             <w:pPr>
               <w:keepNext w:val="0"/>
               <w:keepLines w:val="0"/>
@@ -12610,11 +12562,11 @@
               <w:rPr>
                 <w:rFonts w:hint="eastAsia" w:ascii="宋体" w:hAnsi="宋体" w:eastAsia="宋体" w:cs="宋体"/>
                 <w:color w:val="000000" w:themeColor="text1"/>
-                <w14:textFill>
-                  <w14:solidFill>
-                    <w14:schemeClr w14:val="tx1"/>
-                  </w14:solidFill>
-                </w14:textFill>
+                <ns2:textFill>
+                  <ns2:solidFill>
+                    <ns2:schemeClr ns2:val="tx1"/>
+                  </ns2:solidFill>
+                </ns2:textFill>
               </w:rPr>
             </w:pPr>
             <w:r>
@@ -12623,11 +12575,11 @@
                 <w:b w:val="0"/>
                 <w:color w:val="000000" w:themeColor="text1"/>
                 <w:sz w:val="24"/>
-                <w14:textFill>
-                  <w14:solidFill>
-                    <w14:schemeClr w14:val="tx1"/>
-                  </w14:solidFill>
-                </w14:textFill>
+                <ns2:textFill>
+                  <ns2:solidFill>
+                    <ns2:schemeClr ns2:val="tx1"/>
+                  </ns2:solidFill>
+                </ns2:textFill>
               </w:rPr>
               <w:t>数量（单位）</w:t>
             </w:r>
@@ -12644,7 +12596,7 @@
             </w:tcMar>
             <w:vAlign w:val="center"/>
           </w:tcPr>
-          <w:p>
+          <w:p ns2:paraId="6AEF02F9">
             <w:pPr>
               <w:keepNext w:val="0"/>
               <w:keepLines w:val="0"/>
@@ -12655,11 +12607,11 @@
               <w:rPr>
                 <w:rFonts w:hint="eastAsia" w:ascii="宋体" w:hAnsi="宋体" w:eastAsia="宋体" w:cs="宋体"/>
                 <w:color w:val="000000" w:themeColor="text1"/>
-                <w14:textFill>
-                  <w14:solidFill>
-                    <w14:schemeClr w14:val="tx1"/>
-                  </w14:solidFill>
-                </w14:textFill>
+                <ns2:textFill>
+                  <ns2:solidFill>
+                    <ns2:schemeClr ns2:val="tx1"/>
+                  </ns2:solidFill>
+                </ns2:textFill>
               </w:rPr>
             </w:pPr>
             <w:r>
@@ -12668,11 +12620,11 @@
                 <w:b w:val="0"/>
                 <w:color w:val="000000" w:themeColor="text1"/>
                 <w:sz w:val="22"/>
-                <w14:textFill>
-                  <w14:solidFill>
-                    <w14:schemeClr w14:val="tx1"/>
-                  </w14:solidFill>
-                </w14:textFill>
+                <ns2:textFill>
+                  <ns2:solidFill>
+                    <ns2:schemeClr ns2:val="tx1"/>
+                  </ns2:solidFill>
+                </ns2:textFill>
               </w:rPr>
               <w:t>【填写数量】</w:t>
             </w:r>
@@ -12690,7 +12642,7 @@
             </w:tcMar>
             <w:vAlign w:val="center"/>
           </w:tcPr>
-          <w:p>
+          <w:p ns2:paraId="67F5503C">
             <w:pPr>
               <w:keepNext w:val="0"/>
               <w:keepLines w:val="0"/>
@@ -12701,11 +12653,11 @@
               <w:rPr>
                 <w:rFonts w:hint="eastAsia" w:ascii="宋体" w:hAnsi="宋体" w:eastAsia="宋体" w:cs="宋体"/>
                 <w:color w:val="000000" w:themeColor="text1"/>
-                <w14:textFill>
-                  <w14:solidFill>
-                    <w14:schemeClr w14:val="tx1"/>
-                  </w14:solidFill>
-                </w14:textFill>
+                <ns2:textFill>
+                  <ns2:solidFill>
+                    <ns2:schemeClr ns2:val="tx1"/>
+                  </ns2:solidFill>
+                </ns2:textFill>
               </w:rPr>
             </w:pPr>
             <w:r>
@@ -12714,11 +12666,11 @@
                 <w:b w:val="0"/>
                 <w:color w:val="000000" w:themeColor="text1"/>
                 <w:sz w:val="22"/>
-                <w14:textFill>
-                  <w14:solidFill>
-                    <w14:schemeClr w14:val="tx1"/>
-                  </w14:solidFill>
-                </w14:textFill>
+                <ns2:textFill>
+                  <ns2:solidFill>
+                    <ns2:schemeClr ns2:val="tx1"/>
+                  </ns2:solidFill>
+                </ns2:textFill>
               </w:rPr>
               <w:t>合同签订日期</w:t>
             </w:r>
@@ -12736,7 +12688,7 @@
             </w:tcMar>
             <w:vAlign w:val="center"/>
           </w:tcPr>
-          <w:p>
+          <w:p ns2:paraId="738E450C">
             <w:pPr>
               <w:keepNext w:val="0"/>
               <w:keepLines w:val="0"/>
@@ -12747,11 +12699,11 @@
               <w:rPr>
                 <w:rFonts w:hint="eastAsia" w:ascii="宋体" w:hAnsi="宋体" w:eastAsia="宋体" w:cs="宋体"/>
                 <w:color w:val="000000" w:themeColor="text1"/>
-                <w14:textFill>
-                  <w14:solidFill>
-                    <w14:schemeClr w14:val="tx1"/>
-                  </w14:solidFill>
-                </w14:textFill>
+                <ns2:textFill>
+                  <ns2:solidFill>
+                    <ns2:schemeClr ns2:val="tx1"/>
+                  </ns2:solidFill>
+                </ns2:textFill>
               </w:rPr>
             </w:pPr>
             <w:r>
@@ -12760,18 +12712,18 @@
                 <w:b w:val="0"/>
                 <w:color w:val="000000" w:themeColor="text1"/>
                 <w:sz w:val="22"/>
-                <w14:textFill>
-                  <w14:solidFill>
-                    <w14:schemeClr w14:val="tx1"/>
-                  </w14:solidFill>
-                </w14:textFill>
+                <ns2:textFill>
+                  <ns2:solidFill>
+                    <ns2:schemeClr ns2:val="tx1"/>
+                  </ns2:solidFill>
+                </ns2:textFill>
               </w:rPr>
               <w:t>【填写日期】</w:t>
             </w:r>
           </w:p>
         </w:tc>
       </w:tr>
-      <w:tr>
+      <w:tr ns2:paraId="3D9ADD71">
         <w:trPr>
           <w:trHeight w:val="482" w:hRule="atLeast"/>
           <w:jc w:val="center"/>
@@ -12787,7 +12739,7 @@
             </w:tcMar>
             <w:vAlign w:val="center"/>
           </w:tcPr>
-          <w:p>
+          <w:p ns2:paraId="0FD59C85">
             <w:pPr>
               <w:keepNext w:val="0"/>
               <w:keepLines w:val="0"/>
@@ -12798,11 +12750,11 @@
               <w:rPr>
                 <w:rFonts w:hint="eastAsia" w:ascii="宋体" w:hAnsi="宋体" w:eastAsia="宋体" w:cs="宋体"/>
                 <w:color w:val="000000" w:themeColor="text1"/>
-                <w14:textFill>
-                  <w14:solidFill>
-                    <w14:schemeClr w14:val="tx1"/>
-                  </w14:solidFill>
-                </w14:textFill>
+                <ns2:textFill>
+                  <ns2:solidFill>
+                    <ns2:schemeClr ns2:val="tx1"/>
+                  </ns2:solidFill>
+                </ns2:textFill>
               </w:rPr>
             </w:pPr>
             <w:r>
@@ -12811,11 +12763,11 @@
                 <w:b w:val="0"/>
                 <w:color w:val="000000" w:themeColor="text1"/>
                 <w:sz w:val="24"/>
-                <w14:textFill>
-                  <w14:solidFill>
-                    <w14:schemeClr w14:val="tx1"/>
-                  </w14:solidFill>
-                </w14:textFill>
+                <ns2:textFill>
+                  <ns2:solidFill>
+                    <ns2:schemeClr ns2:val="tx1"/>
+                  </ns2:solidFill>
+                </ns2:textFill>
               </w:rPr>
               <w:t>安装日期</w:t>
             </w:r>
@@ -12832,7 +12784,7 @@
             </w:tcMar>
             <w:vAlign w:val="center"/>
           </w:tcPr>
-          <w:p>
+          <w:p ns2:paraId="67C5A7D8">
             <w:pPr>
               <w:keepNext w:val="0"/>
               <w:keepLines w:val="0"/>
@@ -12843,11 +12795,11 @@
               <w:rPr>
                 <w:rFonts w:hint="eastAsia" w:ascii="宋体" w:hAnsi="宋体" w:eastAsia="宋体" w:cs="宋体"/>
                 <w:color w:val="000000" w:themeColor="text1"/>
-                <w14:textFill>
-                  <w14:solidFill>
-                    <w14:schemeClr w14:val="tx1"/>
-                  </w14:solidFill>
-                </w14:textFill>
+                <ns2:textFill>
+                  <ns2:solidFill>
+                    <ns2:schemeClr ns2:val="tx1"/>
+                  </ns2:solidFill>
+                </ns2:textFill>
               </w:rPr>
             </w:pPr>
             <w:r>
@@ -12856,11 +12808,11 @@
                 <w:b w:val="0"/>
                 <w:color w:val="000000" w:themeColor="text1"/>
                 <w:sz w:val="22"/>
-                <w14:textFill>
-                  <w14:solidFill>
-                    <w14:schemeClr w14:val="tx1"/>
-                  </w14:solidFill>
-                </w14:textFill>
+                <ns2:textFill>
+                  <ns2:solidFill>
+                    <ns2:schemeClr ns2:val="tx1"/>
+                  </ns2:solidFill>
+                </ns2:textFill>
               </w:rPr>
               <w:t>【填写日期】</w:t>
             </w:r>
@@ -12878,7 +12830,7 @@
             </w:tcMar>
             <w:vAlign w:val="center"/>
           </w:tcPr>
-          <w:p>
+          <w:p ns2:paraId="77EC9D1C">
             <w:pPr>
               <w:keepNext w:val="0"/>
               <w:keepLines w:val="0"/>
@@ -12889,11 +12841,11 @@
               <w:rPr>
                 <w:rFonts w:hint="eastAsia" w:ascii="宋体" w:hAnsi="宋体" w:eastAsia="宋体" w:cs="宋体"/>
                 <w:color w:val="000000" w:themeColor="text1"/>
-                <w14:textFill>
-                  <w14:solidFill>
-                    <w14:schemeClr w14:val="tx1"/>
-                  </w14:solidFill>
-                </w14:textFill>
+                <ns2:textFill>
+                  <ns2:solidFill>
+                    <ns2:schemeClr ns2:val="tx1"/>
+                  </ns2:solidFill>
+                </ns2:textFill>
               </w:rPr>
             </w:pPr>
             <w:r>
@@ -12902,11 +12854,11 @@
                 <w:b w:val="0"/>
                 <w:color w:val="000000" w:themeColor="text1"/>
                 <w:sz w:val="24"/>
-                <w14:textFill>
-                  <w14:solidFill>
-                    <w14:schemeClr w14:val="tx1"/>
-                  </w14:solidFill>
-                </w14:textFill>
+                <ns2:textFill>
+                  <ns2:solidFill>
+                    <ns2:schemeClr ns2:val="tx1"/>
+                  </ns2:solidFill>
+                </ns2:textFill>
               </w:rPr>
               <w:t>验收日期</w:t>
             </w:r>
@@ -12924,7 +12876,7 @@
             </w:tcMar>
             <w:vAlign w:val="center"/>
           </w:tcPr>
-          <w:p>
+          <w:p ns2:paraId="760B1D3F">
             <w:pPr>
               <w:keepNext w:val="0"/>
               <w:keepLines w:val="0"/>
@@ -12935,11 +12887,11 @@
               <w:rPr>
                 <w:rFonts w:hint="eastAsia" w:ascii="宋体" w:hAnsi="宋体" w:eastAsia="宋体" w:cs="宋体"/>
                 <w:color w:val="000000" w:themeColor="text1"/>
-                <w14:textFill>
-                  <w14:solidFill>
-                    <w14:schemeClr w14:val="tx1"/>
-                  </w14:solidFill>
-                </w14:textFill>
+                <ns2:textFill>
+                  <ns2:solidFill>
+                    <ns2:schemeClr ns2:val="tx1"/>
+                  </ns2:solidFill>
+                </ns2:textFill>
               </w:rPr>
             </w:pPr>
             <w:r>
@@ -12948,18 +12900,18 @@
                 <w:b w:val="0"/>
                 <w:color w:val="000000" w:themeColor="text1"/>
                 <w:sz w:val="22"/>
-                <w14:textFill>
-                  <w14:solidFill>
-                    <w14:schemeClr w14:val="tx1"/>
-                  </w14:solidFill>
-                </w14:textFill>
+                <ns2:textFill>
+                  <ns2:solidFill>
+                    <ns2:schemeClr ns2:val="tx1"/>
+                  </ns2:solidFill>
+                </ns2:textFill>
               </w:rPr>
               <w:t>【填写日期】</w:t>
             </w:r>
           </w:p>
         </w:tc>
       </w:tr>
-      <w:tr>
+      <w:tr ns2:paraId="79B1DE8A">
         <w:trPr>
           <w:trHeight w:val="482" w:hRule="atLeast"/>
           <w:jc w:val="center"/>
@@ -12975,7 +12927,7 @@
             </w:tcMar>
             <w:vAlign w:val="center"/>
           </w:tcPr>
-          <w:p>
+          <w:p ns2:paraId="3E80F8C1">
             <w:pPr>
               <w:keepNext w:val="0"/>
               <w:keepLines w:val="0"/>
@@ -12989,11 +12941,11 @@
                 <w:sz w:val="24"/>
                 <w:szCs w:val="24"/>
                 <w:lang w:val="en-US" w:eastAsia="zh-CN"/>
-                <w14:textFill>
-                  <w14:solidFill>
-                    <w14:schemeClr w14:val="tx1"/>
-                  </w14:solidFill>
-                </w14:textFill>
+                <ns2:textFill>
+                  <ns2:solidFill>
+                    <ns2:schemeClr ns2:val="tx1"/>
+                  </ns2:solidFill>
+                </ns2:textFill>
               </w:rPr>
             </w:pPr>
             <w:r>
@@ -13003,11 +12955,11 @@
                 <w:sz w:val="24"/>
                 <w:szCs w:val="24"/>
                 <w:lang w:val="en-US" w:eastAsia="zh-CN"/>
-                <w14:textFill>
-                  <w14:solidFill>
-                    <w14:schemeClr w14:val="tx1"/>
-                  </w14:solidFill>
-                </w14:textFill>
+                <ns2:textFill>
+                  <ns2:solidFill>
+                    <ns2:schemeClr ns2:val="tx1"/>
+                  </ns2:solidFill>
+                </ns2:textFill>
               </w:rPr>
               <w:t>服务方</w:t>
             </w:r>
@@ -13024,7 +12976,7 @@
             </w:tcMar>
             <w:vAlign w:val="center"/>
           </w:tcPr>
-          <w:p>
+          <w:p ns2:paraId="663489BD">
             <w:pPr>
               <w:keepNext w:val="0"/>
               <w:keepLines w:val="0"/>
@@ -13035,11 +12987,11 @@
               <w:rPr>
                 <w:rFonts w:hint="eastAsia" w:ascii="宋体" w:hAnsi="宋体" w:eastAsia="宋体" w:cs="宋体"/>
                 <w:color w:val="000000" w:themeColor="text1"/>
-                <w14:textFill>
-                  <w14:solidFill>
-                    <w14:schemeClr w14:val="tx1"/>
-                  </w14:solidFill>
-                </w14:textFill>
+                <ns2:textFill>
+                  <ns2:solidFill>
+                    <ns2:schemeClr ns2:val="tx1"/>
+                  </ns2:solidFill>
+                </ns2:textFill>
               </w:rPr>
             </w:pPr>
             <w:r>
@@ -13048,11 +13000,11 @@
                 <w:b w:val="0"/>
                 <w:color w:val="000000" w:themeColor="text1"/>
                 <w:sz w:val="22"/>
-                <w14:textFill>
-                  <w14:solidFill>
-                    <w14:schemeClr w14:val="tx1"/>
-                  </w14:solidFill>
-                </w14:textFill>
+                <ns2:textFill>
+                  <ns2:solidFill>
+                    <ns2:schemeClr ns2:val="tx1"/>
+                  </ns2:solidFill>
+                </ns2:textFill>
               </w:rPr>
               <w:t>【填写</w:t>
             </w:r>
@@ -13063,11 +13015,11 @@
                 <w:color w:val="000000" w:themeColor="text1"/>
                 <w:sz w:val="22"/>
                 <w:lang w:val="en-US" w:eastAsia="zh-CN"/>
-                <w14:textFill>
-                  <w14:solidFill>
-                    <w14:schemeClr w14:val="tx1"/>
-                  </w14:solidFill>
-                </w14:textFill>
+                <ns2:textFill>
+                  <ns2:solidFill>
+                    <ns2:schemeClr ns2:val="tx1"/>
+                  </ns2:solidFill>
+                </ns2:textFill>
               </w:rPr>
               <w:t>乙方公司</w:t>
             </w:r>
@@ -13077,11 +13029,11 @@
                 <w:b w:val="0"/>
                 <w:color w:val="000000" w:themeColor="text1"/>
                 <w:sz w:val="22"/>
-                <w14:textFill>
-                  <w14:solidFill>
-                    <w14:schemeClr w14:val="tx1"/>
-                  </w14:solidFill>
-                </w14:textFill>
+                <ns2:textFill>
+                  <ns2:solidFill>
+                    <ns2:schemeClr ns2:val="tx1"/>
+                  </ns2:solidFill>
+                </ns2:textFill>
               </w:rPr>
               <w:t>】</w:t>
             </w:r>
@@ -13099,7 +13051,7 @@
             </w:tcMar>
             <w:vAlign w:val="center"/>
           </w:tcPr>
-          <w:p>
+          <w:p ns2:paraId="0B07CE2A">
             <w:pPr>
               <w:keepNext w:val="0"/>
               <w:keepLines w:val="0"/>
@@ -13110,11 +13062,11 @@
               <w:rPr>
                 <w:rFonts w:hint="eastAsia" w:ascii="宋体" w:hAnsi="宋体" w:eastAsia="宋体" w:cs="宋体"/>
                 <w:color w:val="000000" w:themeColor="text1"/>
-                <w14:textFill>
-                  <w14:solidFill>
-                    <w14:schemeClr w14:val="tx1"/>
-                  </w14:solidFill>
-                </w14:textFill>
+                <ns2:textFill>
+                  <ns2:solidFill>
+                    <ns2:schemeClr ns2:val="tx1"/>
+                  </ns2:solidFill>
+                </ns2:textFill>
               </w:rPr>
             </w:pPr>
             <w:r>
@@ -13124,11 +13076,11 @@
                 <w:color w:val="000000" w:themeColor="text1"/>
                 <w:sz w:val="22"/>
                 <w:lang w:val="en-US" w:eastAsia="zh-CN"/>
-                <w14:textFill>
-                  <w14:solidFill>
-                    <w14:schemeClr w14:val="tx1"/>
-                  </w14:solidFill>
-                </w14:textFill>
+                <ns2:textFill>
+                  <ns2:solidFill>
+                    <ns2:schemeClr ns2:val="tx1"/>
+                  </ns2:solidFill>
+                </ns2:textFill>
               </w:rPr>
               <w:t>服务</w:t>
             </w:r>
@@ -13138,11 +13090,11 @@
                 <w:b w:val="0"/>
                 <w:color w:val="000000" w:themeColor="text1"/>
                 <w:sz w:val="22"/>
-                <w14:textFill>
-                  <w14:solidFill>
-                    <w14:schemeClr w14:val="tx1"/>
-                  </w14:solidFill>
-                </w14:textFill>
+                <ns2:textFill>
+                  <ns2:solidFill>
+                    <ns2:schemeClr ns2:val="tx1"/>
+                  </ns2:solidFill>
+                </ns2:textFill>
               </w:rPr>
               <w:t>方联系人及联系方式</w:t>
             </w:r>
@@ -13160,7 +13112,7 @@
             </w:tcMar>
             <w:vAlign w:val="center"/>
           </w:tcPr>
-          <w:p>
+          <w:p ns2:paraId="750D9DA1">
             <w:pPr>
               <w:keepNext w:val="0"/>
               <w:keepLines w:val="0"/>
@@ -13171,11 +13123,11 @@
               <w:rPr>
                 <w:rFonts w:hint="eastAsia" w:ascii="宋体" w:hAnsi="宋体" w:eastAsia="宋体" w:cs="宋体"/>
                 <w:color w:val="000000" w:themeColor="text1"/>
-                <w14:textFill>
-                  <w14:solidFill>
-                    <w14:schemeClr w14:val="tx1"/>
-                  </w14:solidFill>
-                </w14:textFill>
+                <ns2:textFill>
+                  <ns2:solidFill>
+                    <ns2:schemeClr ns2:val="tx1"/>
+                  </ns2:solidFill>
+                </ns2:textFill>
               </w:rPr>
             </w:pPr>
             <w:r>
@@ -13184,18 +13136,18 @@
                 <w:b w:val="0"/>
                 <w:color w:val="000000" w:themeColor="text1"/>
                 <w:sz w:val="21"/>
-                <w14:textFill>
-                  <w14:solidFill>
-                    <w14:schemeClr w14:val="tx1"/>
-                  </w14:solidFill>
-                </w14:textFill>
+                <ns2:textFill>
+                  <ns2:solidFill>
+                    <ns2:schemeClr ns2:val="tx1"/>
+                  </ns2:solidFill>
+                </ns2:textFill>
               </w:rPr>
               <w:t>【填写联系人及联系方式】</w:t>
             </w:r>
           </w:p>
         </w:tc>
       </w:tr>
-      <w:tr>
+      <w:tr ns2:paraId="560914BD">
         <w:trPr>
           <w:trHeight w:val="482" w:hRule="atLeast"/>
           <w:jc w:val="center"/>
@@ -13211,7 +13163,7 @@
             </w:tcMar>
             <w:vAlign w:val="center"/>
           </w:tcPr>
-          <w:p>
+          <w:p ns2:paraId="5DBAD7C3">
             <w:pPr>
               <w:keepNext w:val="0"/>
               <w:keepLines w:val="0"/>
@@ -13222,11 +13174,11 @@
               <w:rPr>
                 <w:rFonts w:hint="eastAsia" w:ascii="宋体" w:hAnsi="宋体" w:eastAsia="宋体" w:cs="宋体"/>
                 <w:color w:val="000000" w:themeColor="text1"/>
-                <w14:textFill>
-                  <w14:solidFill>
-                    <w14:schemeClr w14:val="tx1"/>
-                  </w14:solidFill>
-                </w14:textFill>
+                <ns2:textFill>
+                  <ns2:solidFill>
+                    <ns2:schemeClr ns2:val="tx1"/>
+                  </ns2:solidFill>
+                </ns2:textFill>
               </w:rPr>
             </w:pPr>
             <w:r>
@@ -13235,11 +13187,11 @@
                 <w:b w:val="0"/>
                 <w:color w:val="000000" w:themeColor="text1"/>
                 <w:sz w:val="24"/>
-                <w14:textFill>
-                  <w14:solidFill>
-                    <w14:schemeClr w14:val="tx1"/>
-                  </w14:solidFill>
-                </w14:textFill>
+                <ns2:textFill>
+                  <ns2:solidFill>
+                    <ns2:schemeClr ns2:val="tx1"/>
+                  </ns2:solidFill>
+                </ns2:textFill>
               </w:rPr>
               <w:t>合同金额</w:t>
             </w:r>
@@ -13247,11 +13199,11 @@
               <w:rPr>
                 <w:rFonts w:hint="eastAsia" w:ascii="宋体" w:hAnsi="宋体" w:eastAsia="宋体" w:cs="宋体"/>
                 <w:color w:val="000000" w:themeColor="text1"/>
-                <w14:textFill>
-                  <w14:solidFill>
-                    <w14:schemeClr w14:val="tx1"/>
-                  </w14:solidFill>
-                </w14:textFill>
+                <ns2:textFill>
+                  <ns2:solidFill>
+                    <ns2:schemeClr ns2:val="tx1"/>
+                  </ns2:solidFill>
+                </ns2:textFill>
               </w:rPr>
               <w:br w:type="textWrapping"/>
             </w:r>
@@ -13261,11 +13213,11 @@
                 <w:b w:val="0"/>
                 <w:color w:val="000000" w:themeColor="text1"/>
                 <w:sz w:val="24"/>
-                <w14:textFill>
-                  <w14:solidFill>
-                    <w14:schemeClr w14:val="tx1"/>
-                  </w14:solidFill>
-                </w14:textFill>
+                <ns2:textFill>
+                  <ns2:solidFill>
+                    <ns2:schemeClr ns2:val="tx1"/>
+                  </ns2:solidFill>
+                </ns2:textFill>
               </w:rPr>
               <w:t>（元）</w:t>
             </w:r>
@@ -13282,7 +13234,7 @@
             </w:tcMar>
             <w:vAlign w:val="center"/>
           </w:tcPr>
-          <w:p>
+          <w:p ns2:paraId="1B4B4F93">
             <w:pPr>
               <w:keepNext w:val="0"/>
               <w:keepLines w:val="0"/>
@@ -13293,11 +13245,11 @@
               <w:rPr>
                 <w:rFonts w:hint="eastAsia" w:ascii="宋体" w:hAnsi="宋体" w:eastAsia="宋体" w:cs="宋体"/>
                 <w:color w:val="000000" w:themeColor="text1"/>
-                <w14:textFill>
-                  <w14:solidFill>
-                    <w14:schemeClr w14:val="tx1"/>
-                  </w14:solidFill>
-                </w14:textFill>
+                <ns2:textFill>
+                  <ns2:solidFill>
+                    <ns2:schemeClr ns2:val="tx1"/>
+                  </ns2:solidFill>
+                </ns2:textFill>
               </w:rPr>
             </w:pPr>
             <w:r>
@@ -13306,11 +13258,11 @@
                 <w:b w:val="0"/>
                 <w:color w:val="000000" w:themeColor="text1"/>
                 <w:sz w:val="22"/>
-                <w14:textFill>
-                  <w14:solidFill>
-                    <w14:schemeClr w14:val="tx1"/>
-                  </w14:solidFill>
-                </w14:textFill>
+                <ns2:textFill>
+                  <ns2:solidFill>
+                    <ns2:schemeClr ns2:val="tx1"/>
+                  </ns2:solidFill>
+                </ns2:textFill>
               </w:rPr>
               <w:t>【填写金额】</w:t>
             </w:r>
@@ -13328,7 +13280,7 @@
             </w:tcMar>
             <w:vAlign w:val="center"/>
           </w:tcPr>
-          <w:p>
+          <w:p ns2:paraId="31E75B25">
             <w:pPr>
               <w:keepNext w:val="0"/>
               <w:keepLines w:val="0"/>
@@ -13339,11 +13291,11 @@
               <w:rPr>
                 <w:rFonts w:hint="eastAsia" w:ascii="宋体" w:hAnsi="宋体" w:eastAsia="宋体" w:cs="宋体"/>
                 <w:color w:val="000000" w:themeColor="text1"/>
-                <w14:textFill>
-                  <w14:solidFill>
-                    <w14:schemeClr w14:val="tx1"/>
-                  </w14:solidFill>
-                </w14:textFill>
+                <ns2:textFill>
+                  <ns2:solidFill>
+                    <ns2:schemeClr ns2:val="tx1"/>
+                  </ns2:solidFill>
+                </ns2:textFill>
               </w:rPr>
             </w:pPr>
             <w:r>
@@ -13352,11 +13304,11 @@
                 <w:b w:val="0"/>
                 <w:color w:val="000000" w:themeColor="text1"/>
                 <w:sz w:val="24"/>
-                <w14:textFill>
-                  <w14:solidFill>
-                    <w14:schemeClr w14:val="tx1"/>
-                  </w14:solidFill>
-                </w14:textFill>
+                <ns2:textFill>
+                  <ns2:solidFill>
+                    <ns2:schemeClr ns2:val="tx1"/>
+                  </ns2:solidFill>
+                </ns2:textFill>
               </w:rPr>
               <w:t>部署地点</w:t>
             </w:r>
@@ -13374,7 +13326,7 @@
             </w:tcMar>
             <w:vAlign w:val="center"/>
           </w:tcPr>
-          <w:p>
+          <w:p ns2:paraId="4A31424C">
             <w:pPr>
               <w:keepNext w:val="0"/>
               <w:keepLines w:val="0"/>
@@ -13385,11 +13337,11 @@
               <w:rPr>
                 <w:rFonts w:hint="eastAsia" w:ascii="宋体" w:hAnsi="宋体" w:eastAsia="宋体" w:cs="宋体"/>
                 <w:color w:val="000000" w:themeColor="text1"/>
-                <w14:textFill>
-                  <w14:solidFill>
-                    <w14:schemeClr w14:val="tx1"/>
-                  </w14:solidFill>
-                </w14:textFill>
+                <ns2:textFill>
+                  <ns2:solidFill>
+                    <ns2:schemeClr ns2:val="tx1"/>
+                  </ns2:solidFill>
+                </ns2:textFill>
               </w:rPr>
             </w:pPr>
             <w:r>
@@ -13398,18 +13350,18 @@
                 <w:b w:val="0"/>
                 <w:color w:val="000000" w:themeColor="text1"/>
                 <w:sz w:val="22"/>
-                <w14:textFill>
-                  <w14:solidFill>
-                    <w14:schemeClr w14:val="tx1"/>
-                  </w14:solidFill>
-                </w14:textFill>
+                <ns2:textFill>
+                  <ns2:solidFill>
+                    <ns2:schemeClr ns2:val="tx1"/>
+                  </ns2:solidFill>
+                </ns2:textFill>
               </w:rPr>
               <w:t>【填写地点】</w:t>
             </w:r>
           </w:p>
         </w:tc>
       </w:tr>
-      <w:tr>
+      <w:tr ns2:paraId="7B470A85">
         <w:trPr>
           <w:trHeight w:val="369" w:hRule="atLeast"/>
           <w:jc w:val="center"/>
@@ -13426,7 +13378,7 @@
             </w:tcMar>
             <w:vAlign w:val="center"/>
           </w:tcPr>
-          <w:p>
+          <w:p ns2:paraId="6AD314DD">
             <w:pPr>
               <w:keepNext w:val="0"/>
               <w:keepLines w:val="0"/>
@@ -13458,7 +13410,7 @@
           </w:p>
         </w:tc>
       </w:tr>
-      <w:tr>
+      <w:tr ns2:paraId="466BDA6F">
         <w:trPr>
           <w:trHeight w:val="351" w:hRule="atLeast"/>
           <w:jc w:val="center"/>
@@ -13474,7 +13426,7 @@
             </w:tcMar>
             <w:vAlign w:val="center"/>
           </w:tcPr>
-          <w:p>
+          <w:p ns2:paraId="6BBAD2A4">
             <w:pPr>
               <w:keepNext w:val="0"/>
               <w:keepLines w:val="0"/>
@@ -13507,7 +13459,7 @@
             </w:tcMar>
             <w:vAlign w:val="center"/>
           </w:tcPr>
-          <w:p>
+          <w:p ns2:paraId="0915B84A">
             <w:pPr>
               <w:keepNext w:val="0"/>
               <w:keepLines w:val="0"/>
@@ -13551,7 +13503,7 @@
             </w:tcMar>
             <w:vAlign w:val="center"/>
           </w:tcPr>
-          <w:p>
+          <w:p ns2:paraId="3BEEFA77">
             <w:pPr>
               <w:keepNext w:val="0"/>
               <w:keepLines w:val="0"/>
@@ -13587,7 +13539,7 @@
             </w:tcMar>
             <w:vAlign w:val="center"/>
           </w:tcPr>
-          <w:p>
+          <w:p ns2:paraId="2155DD8D">
             <w:pPr>
               <w:keepNext w:val="0"/>
               <w:keepLines w:val="0"/>
@@ -13619,7 +13571,7 @@
             </w:tcMar>
             <w:vAlign w:val="center"/>
           </w:tcPr>
-          <w:p>
+          <w:p ns2:paraId="167076C2">
             <w:pPr>
               <w:keepNext w:val="0"/>
               <w:keepLines w:val="0"/>
@@ -13641,7 +13593,7 @@
           </w:p>
         </w:tc>
       </w:tr>
-      <w:tr>
+      <w:tr ns2:paraId="21F0A47E">
         <w:trPr>
           <w:trHeight w:val="737" w:hRule="atLeast"/>
           <w:jc w:val="center"/>
@@ -13657,7 +13609,7 @@
             </w:tcMar>
             <w:vAlign w:val="center"/>
           </w:tcPr>
-          <w:p>
+          <w:p ns2:paraId="57C90697">
             <w:pPr>
               <w:keepNext w:val="0"/>
               <w:keepLines w:val="0"/>
@@ -13690,7 +13642,7 @@
             </w:tcMar>
             <w:vAlign w:val="center"/>
           </w:tcPr>
-          <w:p>
+          <w:p ns2:paraId="68F94A26">
             <w:pPr>
               <w:keepNext w:val="0"/>
               <w:keepLines w:val="0"/>
@@ -13716,7 +13668,7 @@
             </w:tcMar>
             <w:vAlign w:val="center"/>
           </w:tcPr>
-          <w:p>
+          <w:p ns2:paraId="03DC280D">
             <w:pPr>
               <w:keepNext w:val="0"/>
               <w:keepLines w:val="0"/>
@@ -13741,7 +13693,7 @@
             </w:tcMar>
             <w:vAlign w:val="center"/>
           </w:tcPr>
-          <w:p>
+          <w:p ns2:paraId="4BF99422">
             <w:pPr>
               <w:keepNext w:val="0"/>
               <w:keepLines w:val="0"/>
@@ -13766,7 +13718,7 @@
             </w:tcMar>
             <w:vAlign w:val="center"/>
           </w:tcPr>
-          <w:p>
+          <w:p ns2:paraId="2CA50E20">
             <w:pPr>
               <w:keepNext w:val="0"/>
               <w:keepLines w:val="0"/>
@@ -13781,7 +13733,7 @@
           </w:p>
         </w:tc>
       </w:tr>
-      <w:tr>
+      <w:tr ns2:paraId="45FD62CA">
         <w:trPr>
           <w:trHeight w:val="737" w:hRule="atLeast"/>
           <w:jc w:val="center"/>
@@ -13797,7 +13749,7 @@
             </w:tcMar>
             <w:vAlign w:val="center"/>
           </w:tcPr>
-          <w:p>
+          <w:p ns2:paraId="3C0B431A">
             <w:pPr>
               <w:keepNext w:val="0"/>
               <w:keepLines w:val="0"/>
@@ -13830,7 +13782,7 @@
             </w:tcMar>
             <w:vAlign w:val="center"/>
           </w:tcPr>
-          <w:p>
+          <w:p ns2:paraId="1610F35A">
             <w:pPr>
               <w:keepNext w:val="0"/>
               <w:keepLines w:val="0"/>
@@ -13856,7 +13808,7 @@
             </w:tcMar>
             <w:vAlign w:val="center"/>
           </w:tcPr>
-          <w:p>
+          <w:p ns2:paraId="21941F2F">
             <w:pPr>
               <w:keepNext w:val="0"/>
               <w:keepLines w:val="0"/>
@@ -13881,7 +13833,7 @@
             </w:tcMar>
             <w:vAlign w:val="center"/>
           </w:tcPr>
-          <w:p>
+          <w:p ns2:paraId="0AE2124E">
             <w:pPr>
               <w:keepNext w:val="0"/>
               <w:keepLines w:val="0"/>
@@ -13906,7 +13858,7 @@
             </w:tcMar>
             <w:vAlign w:val="center"/>
           </w:tcPr>
-          <w:p>
+          <w:p ns2:paraId="1ECFDCC4">
             <w:pPr>
               <w:keepNext w:val="0"/>
               <w:keepLines w:val="0"/>
@@ -13921,7 +13873,7 @@
           </w:p>
         </w:tc>
       </w:tr>
-      <w:tr>
+      <w:tr ns2:paraId="1112DB20">
         <w:trPr>
           <w:trHeight w:val="737" w:hRule="atLeast"/>
           <w:jc w:val="center"/>
@@ -13937,7 +13889,7 @@
             </w:tcMar>
             <w:vAlign w:val="center"/>
           </w:tcPr>
-          <w:p>
+          <w:p ns2:paraId="5B4832E8">
             <w:pPr>
               <w:keepNext w:val="0"/>
               <w:keepLines w:val="0"/>
@@ -13970,7 +13922,7 @@
             </w:tcMar>
             <w:vAlign w:val="center"/>
           </w:tcPr>
-          <w:p>
+          <w:p ns2:paraId="376BFAC5">
             <w:pPr>
               <w:keepNext w:val="0"/>
               <w:keepLines w:val="0"/>
@@ -13996,7 +13948,7 @@
             </w:tcMar>
             <w:vAlign w:val="center"/>
           </w:tcPr>
-          <w:p>
+          <w:p ns2:paraId="1B586389">
             <w:pPr>
               <w:keepNext w:val="0"/>
               <w:keepLines w:val="0"/>
@@ -14021,7 +13973,7 @@
             </w:tcMar>
             <w:vAlign w:val="center"/>
           </w:tcPr>
-          <w:p>
+          <w:p ns2:paraId="29F91ABA">
             <w:pPr>
               <w:keepNext w:val="0"/>
               <w:keepLines w:val="0"/>
@@ -14046,7 +13998,7 @@
             </w:tcMar>
             <w:vAlign w:val="center"/>
           </w:tcPr>
-          <w:p>
+          <w:p ns2:paraId="5A6385A5">
             <w:pPr>
               <w:keepNext w:val="0"/>
               <w:keepLines w:val="0"/>
@@ -14061,7 +14013,7 @@
           </w:p>
         </w:tc>
       </w:tr>
-      <w:tr>
+      <w:tr ns2:paraId="264677AF">
         <w:trPr>
           <w:trHeight w:val="765" w:hRule="atLeast"/>
           <w:jc w:val="center"/>
@@ -14077,7 +14029,7 @@
             </w:tcMar>
             <w:vAlign w:val="center"/>
           </w:tcPr>
-          <w:p>
+          <w:p ns2:paraId="4F2EBAE9">
             <w:pPr>
               <w:keepNext w:val="0"/>
               <w:keepLines w:val="0"/>
@@ -14110,7 +14062,7 @@
             </w:tcMar>
             <w:vAlign w:val="center"/>
           </w:tcPr>
-          <w:p>
+          <w:p ns2:paraId="372C3676">
             <w:pPr>
               <w:keepNext w:val="0"/>
               <w:keepLines w:val="0"/>
@@ -14136,7 +14088,7 @@
             </w:tcMar>
             <w:vAlign w:val="center"/>
           </w:tcPr>
-          <w:p>
+          <w:p ns2:paraId="7C79368C">
             <w:pPr>
               <w:keepNext w:val="0"/>
               <w:keepLines w:val="0"/>
@@ -14161,7 +14113,7 @@
             </w:tcMar>
             <w:vAlign w:val="center"/>
           </w:tcPr>
-          <w:p>
+          <w:p ns2:paraId="773A1FF0">
             <w:pPr>
               <w:keepNext w:val="0"/>
               <w:keepLines w:val="0"/>
@@ -14186,7 +14138,7 @@
             </w:tcMar>
             <w:vAlign w:val="center"/>
           </w:tcPr>
-          <w:p>
+          <w:p ns2:paraId="6468BCBD">
             <w:pPr>
               <w:keepNext w:val="0"/>
               <w:keepLines w:val="0"/>
@@ -14201,7 +14153,7 @@
           </w:p>
         </w:tc>
       </w:tr>
-      <w:tr>
+      <w:tr ns2:paraId="246A003B">
         <w:trPr>
           <w:trHeight w:val="765" w:hRule="atLeast"/>
           <w:jc w:val="center"/>
@@ -14217,7 +14169,7 @@
             </w:tcMar>
             <w:vAlign w:val="center"/>
           </w:tcPr>
-          <w:p>
+          <w:p ns2:paraId="02F2FC99">
             <w:pPr>
               <w:keepNext w:val="0"/>
               <w:keepLines w:val="0"/>
@@ -14250,7 +14202,7 @@
             </w:tcMar>
             <w:vAlign w:val="center"/>
           </w:tcPr>
-          <w:p>
+          <w:p ns2:paraId="5353D3DF">
             <w:pPr>
               <w:keepNext w:val="0"/>
               <w:keepLines w:val="0"/>
@@ -14276,7 +14228,7 @@
             </w:tcMar>
             <w:vAlign w:val="center"/>
           </w:tcPr>
-          <w:p>
+          <w:p ns2:paraId="2898FBBE">
             <w:pPr>
               <w:keepNext w:val="0"/>
               <w:keepLines w:val="0"/>
@@ -14301,7 +14253,7 @@
             </w:tcMar>
             <w:vAlign w:val="center"/>
           </w:tcPr>
-          <w:p>
+          <w:p ns2:paraId="542A3518">
             <w:pPr>
               <w:keepNext w:val="0"/>
               <w:keepLines w:val="0"/>
@@ -14326,7 +14278,7 @@
             </w:tcMar>
             <w:vAlign w:val="center"/>
           </w:tcPr>
-          <w:p>
+          <w:p ns2:paraId="5CBA4E93">
             <w:pPr>
               <w:keepNext w:val="0"/>
               <w:keepLines w:val="0"/>
@@ -14341,7 +14293,7 @@
           </w:p>
         </w:tc>
       </w:tr>
-      <w:tr>
+      <w:tr ns2:paraId="37974D49">
         <w:trPr>
           <w:trHeight w:val="765" w:hRule="atLeast"/>
           <w:jc w:val="center"/>
@@ -14357,7 +14309,7 @@
             </w:tcMar>
             <w:vAlign w:val="center"/>
           </w:tcPr>
-          <w:p>
+          <w:p ns2:paraId="558E20E7">
             <w:pPr>
               <w:keepNext w:val="0"/>
               <w:keepLines w:val="0"/>
@@ -14390,7 +14342,7 @@
             </w:tcMar>
             <w:vAlign w:val="center"/>
           </w:tcPr>
-          <w:p>
+          <w:p ns2:paraId="26EC5153">
             <w:pPr>
               <w:keepNext w:val="0"/>
               <w:keepLines w:val="0"/>
@@ -14416,7 +14368,7 @@
             </w:tcMar>
             <w:vAlign w:val="center"/>
           </w:tcPr>
-          <w:p>
+          <w:p ns2:paraId="13D69F0D">
             <w:pPr>
               <w:keepNext w:val="0"/>
               <w:keepLines w:val="0"/>
@@ -14441,7 +14393,7 @@
             </w:tcMar>
             <w:vAlign w:val="center"/>
           </w:tcPr>
-          <w:p>
+          <w:p ns2:paraId="5A63E045">
             <w:pPr>
               <w:keepNext w:val="0"/>
               <w:keepLines w:val="0"/>
@@ -14466,7 +14418,7 @@
             </w:tcMar>
             <w:vAlign w:val="center"/>
           </w:tcPr>
-          <w:p>
+          <w:p ns2:paraId="0D7D30B8">
             <w:pPr>
               <w:keepNext w:val="0"/>
               <w:keepLines w:val="0"/>
@@ -14481,7 +14433,7 @@
           </w:p>
         </w:tc>
       </w:tr>
-      <w:tr>
+      <w:tr ns2:paraId="3A1C3DA8">
         <w:trPr>
           <w:trHeight w:val="765" w:hRule="atLeast"/>
           <w:jc w:val="center"/>
@@ -14497,7 +14449,7 @@
             </w:tcMar>
             <w:vAlign w:val="center"/>
           </w:tcPr>
-          <w:p>
+          <w:p ns2:paraId="63E943FD">
             <w:pPr>
               <w:keepNext w:val="0"/>
               <w:keepLines w:val="0"/>
@@ -14530,7 +14482,7 @@
             </w:tcMar>
             <w:vAlign w:val="center"/>
           </w:tcPr>
-          <w:p>
+          <w:p ns2:paraId="60BC46F4">
             <w:pPr>
               <w:keepNext w:val="0"/>
               <w:keepLines w:val="0"/>
@@ -14556,7 +14508,7 @@
             </w:tcMar>
             <w:vAlign w:val="center"/>
           </w:tcPr>
-          <w:p>
+          <w:p ns2:paraId="6DC71BAE">
             <w:pPr>
               <w:keepNext w:val="0"/>
               <w:keepLines w:val="0"/>
@@ -14581,7 +14533,7 @@
             </w:tcMar>
             <w:vAlign w:val="center"/>
           </w:tcPr>
-          <w:p>
+          <w:p ns2:paraId="34050284">
             <w:pPr>
               <w:keepNext w:val="0"/>
               <w:keepLines w:val="0"/>
@@ -14606,7 +14558,7 @@
             </w:tcMar>
             <w:vAlign w:val="center"/>
           </w:tcPr>
-          <w:p>
+          <w:p ns2:paraId="3574066C">
             <w:pPr>
               <w:keepNext w:val="0"/>
               <w:keepLines w:val="0"/>
@@ -14621,7 +14573,7 @@
           </w:p>
         </w:tc>
       </w:tr>
-      <w:tr>
+      <w:tr ns2:paraId="4C9C3028">
         <w:trPr>
           <w:trHeight w:val="1077" w:hRule="atLeast"/>
           <w:jc w:val="center"/>
@@ -14637,7 +14589,7 @@
             </w:tcMar>
             <w:vAlign w:val="center"/>
           </w:tcPr>
-          <w:p>
+          <w:p ns2:paraId="461382E2">
             <w:pPr>
               <w:keepNext w:val="0"/>
               <w:keepLines w:val="0"/>
@@ -14685,7 +14637,7 @@
             </w:tcMar>
             <w:vAlign w:val="center"/>
           </w:tcPr>
-          <w:p>
+          <w:p ns2:paraId="40514239">
             <w:pPr>
               <w:pStyle w:val="44"/>
               <w:keepNext w:val="0"/>
@@ -14729,7 +14681,7 @@
           </w:p>
         </w:tc>
       </w:tr>
-      <w:tr>
+      <w:tr ns2:paraId="646C307D">
         <w:trPr>
           <w:trHeight w:val="1077" w:hRule="atLeast"/>
           <w:jc w:val="center"/>
@@ -14746,7 +14698,7 @@
             </w:tcMar>
             <w:vAlign w:val="top"/>
           </w:tcPr>
-          <w:p>
+          <w:p ns2:paraId="65145D2B">
             <w:pPr>
               <w:pStyle w:val="44"/>
               <w:keepNext w:val="0"/>
@@ -14783,7 +14735,7 @@
               <w:t>（章）：</w:t>
             </w:r>
           </w:p>
-          <w:p>
+          <w:p ns2:paraId="2A8A1424">
             <w:pPr>
               <w:keepNext w:val="0"/>
               <w:keepLines w:val="0"/>
@@ -14809,7 +14761,7 @@
               <w:t>代表：</w:t>
             </w:r>
           </w:p>
-          <w:p>
+          <w:p ns2:paraId="24656640">
             <w:pPr>
               <w:keepNext w:val="0"/>
               <w:keepLines w:val="0"/>
@@ -14848,7 +14800,7 @@
             </w:tcMar>
             <w:vAlign w:val="top"/>
           </w:tcPr>
-          <w:p>
+          <w:p ns2:paraId="6931FC51">
             <w:pPr>
               <w:pStyle w:val="44"/>
               <w:keepNext w:val="0"/>
@@ -14885,7 +14837,7 @@
               <w:t>（章）：</w:t>
             </w:r>
           </w:p>
-          <w:p>
+          <w:p ns2:paraId="6E5F59C9">
             <w:pPr>
               <w:pStyle w:val="44"/>
               <w:keepNext w:val="0"/>
@@ -14912,7 +14864,7 @@
               <w:t>代表：</w:t>
             </w:r>
           </w:p>
-          <w:p>
+          <w:p ns2:paraId="59767ABE">
             <w:pPr>
               <w:pStyle w:val="44"/>
               <w:keepNext w:val="0"/>
@@ -14998,7 +14950,7 @@
         </w:tc>
       </w:tr>
     </w:tbl>
-    <w:p>
+    <w:p ns2:paraId="34BE7268">
       <w:pPr>
         <w:rPr>
           <w:rFonts w:hint="default"/>
@@ -15006,7 +14958,7 @@
         </w:rPr>
       </w:pPr>
     </w:p>
-    <w:p>
+    <w:p ns2:paraId="3C384081">
       <w:pPr>
         <w:spacing w:line="440" w:lineRule="exact"/>
         <w:ind w:left="0" w:leftChars="0" w:firstLine="0" w:firstLineChars="0"/>
@@ -15019,7 +14971,7 @@
       </w:pPr>
     </w:p>
     <w:sectPr>
-      <w:footerReference r:id="rId8" w:type="default"/>
+      <w:footerReference ns3:id="rId8" w:type="default"/>
       <w:pgSz w:w="11906" w:h="16838"/>
       <w:pgMar w:top="851" w:right="1247" w:bottom="851" w:left="1418" w:header="851" w:footer="992" w:gutter="0"/>
       <w:pgBorders>

</xml_diff>